<commit_message>
Fix image upload and AI reference handling
</commit_message>
<xml_diff>
--- a/PrintForge_Bitirme_Tezi.docx
+++ b/PrintForge_Bitirme_Tezi.docx
@@ -9501,7 +9501,7 @@
       <w:r>
         <w:drawing>
           <wp:inline xmlns:a="http://schemas.openxmlformats.org/drawingml/2006/main" xmlns:pic="http://schemas.openxmlformats.org/drawingml/2006/picture">
-            <wp:extent cx="5472000" cy="2594851"/>
+            <wp:extent cx="4608000" cy="2185138"/>
             <wp:docPr id="7" name="Picture 7" descr="Image: image7.png"/>
             <wp:cNvGraphicFramePr>
               <a:graphicFrameLocks noChangeAspect="1"/>
@@ -9522,7 +9522,7 @@
                   <pic:spPr>
                     <a:xfrm>
                       <a:off x="0" y="0"/>
-                      <a:ext cx="5472000" cy="2594851"/>
+                      <a:ext cx="4608000" cy="2185138"/>
                     </a:xfrm>
                     <a:prstGeom prst="rect"/>
                   </pic:spPr>
@@ -9557,8 +9557,14 @@
       </w:r>
     </w:p>
     <w:p>
-      <w:r>
-        <w:br w:type="page"/>
+      <w:pPr>
+        <w:pStyle w:val="TezBody"/>
+      </w:pPr>
+      <w:r>
+        <w:rPr>
+          <w:rFonts w:ascii="Times New Roman" w:hAnsi="Times New Roman" w:cs="Times New Roman"/>
+        </w:rPr>
+        <w:t>Bu ekran, çalışmanın problem tanımında belirtilen dağınık hizmet akışını tek giriş noktasında toplama hedefinin arayüz karşılığını göstermektedir. Kullanıcı katalog veya AI üretim yönlerinden birini seçerek aynı platform içinde ilerleyebilmektedir.</w:t>
       </w:r>
     </w:p>
     <w:p>
@@ -9580,7 +9586,7 @@
       <w:r>
         <w:drawing>
           <wp:inline xmlns:a="http://schemas.openxmlformats.org/drawingml/2006/main" xmlns:pic="http://schemas.openxmlformats.org/drawingml/2006/picture">
-            <wp:extent cx="5472000" cy="2603406"/>
+            <wp:extent cx="4608000" cy="2192342"/>
             <wp:docPr id="8" name="Picture 8" descr="Image: image8.png"/>
             <wp:cNvGraphicFramePr>
               <a:graphicFrameLocks noChangeAspect="1"/>
@@ -9601,7 +9607,7 @@
                   <pic:spPr>
                     <a:xfrm>
                       <a:off x="0" y="0"/>
-                      <a:ext cx="5472000" cy="2603406"/>
+                      <a:ext cx="4608000" cy="2192342"/>
                     </a:xfrm>
                     <a:prstGeom prst="rect"/>
                   </pic:spPr>
@@ -9636,8 +9642,14 @@
       </w:r>
     </w:p>
     <w:p>
-      <w:r>
-        <w:br w:type="page"/>
+      <w:pPr>
+        <w:pStyle w:val="TezBody"/>
+      </w:pPr>
+      <w:r>
+        <w:rPr>
+          <w:rFonts w:ascii="Times New Roman" w:hAnsi="Times New Roman" w:cs="Times New Roman"/>
+        </w:rPr>
+        <w:t>Katalog yapısı, ileride ürün sayısı arttığında kullanıcıya arama ve sınıflandırma desteği verecek şekilde tasarlanmıştır. Boş durum ekranının yönlendirici olması, kullanılabilirlik açısından önemli bir tasarım kararıdır.</w:t>
       </w:r>
     </w:p>
     <w:p>
@@ -9659,7 +9671,7 @@
       <w:r>
         <w:drawing>
           <wp:inline xmlns:a="http://schemas.openxmlformats.org/drawingml/2006/main" xmlns:pic="http://schemas.openxmlformats.org/drawingml/2006/picture">
-            <wp:extent cx="5472000" cy="2600554"/>
+            <wp:extent cx="4608000" cy="2189941"/>
             <wp:docPr id="9" name="Picture 9" descr="Image: image9.png"/>
             <wp:cNvGraphicFramePr>
               <a:graphicFrameLocks noChangeAspect="1"/>
@@ -9680,7 +9692,7 @@
                   <pic:spPr>
                     <a:xfrm>
                       <a:off x="0" y="0"/>
-                      <a:ext cx="5472000" cy="2600554"/>
+                      <a:ext cx="4608000" cy="2189941"/>
                     </a:xfrm>
                     <a:prstGeom prst="rect"/>
                   </pic:spPr>
@@ -9715,8 +9727,14 @@
       </w:r>
     </w:p>
     <w:p>
-      <w:r>
-        <w:br w:type="page"/>
+      <w:pPr>
+        <w:pStyle w:val="TezBody"/>
+      </w:pPr>
+      <w:r>
+        <w:rPr>
+          <w:rFonts w:ascii="Times New Roman" w:hAnsi="Times New Roman" w:cs="Times New Roman"/>
+        </w:rPr>
+        <w:t>Bu akış, modelleme bilgisi olmayan kullanıcı için fikir bulma eşiğini düşürmektedir. Kullanıcı boş bir metin alanıyla başlamak yerine görsel referans üzerinden üretim niyetini somutlaştırabilmektedir.</w:t>
       </w:r>
     </w:p>
     <w:p>
@@ -9738,7 +9756,7 @@
       <w:r>
         <w:drawing>
           <wp:inline xmlns:a="http://schemas.openxmlformats.org/drawingml/2006/main" xmlns:pic="http://schemas.openxmlformats.org/drawingml/2006/picture">
-            <wp:extent cx="5472000" cy="2589149"/>
+            <wp:extent cx="4608000" cy="2180336"/>
             <wp:docPr id="10" name="Picture 10" descr="Image: image10.png"/>
             <wp:cNvGraphicFramePr>
               <a:graphicFrameLocks noChangeAspect="1"/>
@@ -9759,7 +9777,7 @@
                   <pic:spPr>
                     <a:xfrm>
                       <a:off x="0" y="0"/>
-                      <a:ext cx="5472000" cy="2589149"/>
+                      <a:ext cx="4608000" cy="2180336"/>
                     </a:xfrm>
                     <a:prstGeom prst="rect"/>
                   </pic:spPr>
@@ -9794,8 +9812,14 @@
       </w:r>
     </w:p>
     <w:p>
-      <w:r>
-        <w:br w:type="page"/>
+      <w:pPr>
+        <w:pStyle w:val="TezBody"/>
+      </w:pPr>
+      <w:r>
+        <w:rPr>
+          <w:rFonts w:ascii="Times New Roman" w:hAnsi="Times New Roman" w:cs="Times New Roman"/>
+        </w:rPr>
+        <w:t>AI üretim ekranının ayrı bir çalışma alanı olarak tasarlanması, uzun sürebilen üretim görevlerinin katalog ve mesajlaşma ekranlarından bağımsız yönetilmesini sağlar. Böylece sistem yalnızca görsel arama yapan bir sayfa değil, üretim görevi başlatan bir modül haline gelir.</w:t>
       </w:r>
     </w:p>
     <w:p>
@@ -9817,7 +9841,7 @@
       <w:r>
         <w:drawing>
           <wp:inline xmlns:a="http://schemas.openxmlformats.org/drawingml/2006/main" xmlns:pic="http://schemas.openxmlformats.org/drawingml/2006/picture">
-            <wp:extent cx="5472000" cy="2592000"/>
+            <wp:extent cx="4608000" cy="2182737"/>
             <wp:docPr id="11" name="Picture 11" descr="Image: image11.png"/>
             <wp:cNvGraphicFramePr>
               <a:graphicFrameLocks noChangeAspect="1"/>
@@ -9838,7 +9862,7 @@
                   <pic:spPr>
                     <a:xfrm>
                       <a:off x="0" y="0"/>
-                      <a:ext cx="5472000" cy="2592000"/>
+                      <a:ext cx="4608000" cy="2182737"/>
                     </a:xfrm>
                     <a:prstGeom prst="rect"/>
                   </pic:spPr>
@@ -9873,8 +9897,14 @@
       </w:r>
     </w:p>
     <w:p>
-      <w:r>
-        <w:br w:type="page"/>
+      <w:pPr>
+        <w:pStyle w:val="TezBody"/>
+      </w:pPr>
+      <w:r>
+        <w:rPr>
+          <w:rFonts w:ascii="Times New Roman" w:hAnsi="Times New Roman" w:cs="Times New Roman"/>
+        </w:rPr>
+        <w:t>Kimlik doğrulama yapısının sade tutulması, kullanıcıyı temel iş akışından koparmadan hesap güvenliğini sağlamayı hedeflemektedir. Bu ekran aynı zamanda satıcı ve normal kullanıcı rollerinin ayrıştırılacağı oturum bilgisini üretir.</w:t>
       </w:r>
     </w:p>
     <w:p>
@@ -9896,7 +9926,7 @@
       <w:r>
         <w:drawing>
           <wp:inline xmlns:a="http://schemas.openxmlformats.org/drawingml/2006/main" xmlns:pic="http://schemas.openxmlformats.org/drawingml/2006/picture">
-            <wp:extent cx="5472000" cy="2596204"/>
+            <wp:extent cx="4608000" cy="2186277"/>
             <wp:docPr id="12" name="Picture 12" descr="Image: image12.png"/>
             <wp:cNvGraphicFramePr>
               <a:graphicFrameLocks noChangeAspect="1"/>
@@ -9917,7 +9947,7 @@
                   <pic:spPr>
                     <a:xfrm>
                       <a:off x="0" y="0"/>
-                      <a:ext cx="5472000" cy="2596204"/>
+                      <a:ext cx="4608000" cy="2186277"/>
                     </a:xfrm>
                     <a:prstGeom prst="rect"/>
                   </pic:spPr>
@@ -9952,8 +9982,14 @@
       </w:r>
     </w:p>
     <w:p>
-      <w:r>
-        <w:br w:type="page"/>
+      <w:pPr>
+        <w:pStyle w:val="TezBody"/>
+      </w:pPr>
+      <w:r>
+        <w:rPr>
+          <w:rFonts w:ascii="Times New Roman" w:hAnsi="Times New Roman" w:cs="Times New Roman"/>
+        </w:rPr>
+        <w:t>Satıcı panelinin bulunması, projenin pazaryeri boyutunu güçlendirmektedir. Ürün yönetimi alıcı arayüzünden ayrıldığı için satıcı, katalog içeriğini daha düzenli biçimde kontrol edebilmektedir.</w:t>
       </w:r>
     </w:p>
     <w:p>
@@ -9975,7 +10011,7 @@
       <w:r>
         <w:drawing>
           <wp:inline xmlns:a="http://schemas.openxmlformats.org/drawingml/2006/main" xmlns:pic="http://schemas.openxmlformats.org/drawingml/2006/picture">
-            <wp:extent cx="5472000" cy="2389183"/>
+            <wp:extent cx="4608000" cy="2011944"/>
             <wp:docPr id="13" name="Picture 13" descr="Image: image13.png"/>
             <wp:cNvGraphicFramePr>
               <a:graphicFrameLocks noChangeAspect="1"/>
@@ -9996,7 +10032,7 @@
                   <pic:spPr>
                     <a:xfrm>
                       <a:off x="0" y="0"/>
-                      <a:ext cx="5472000" cy="2389183"/>
+                      <a:ext cx="4608000" cy="2011944"/>
                     </a:xfrm>
                     <a:prstGeom prst="rect"/>
                   </pic:spPr>
@@ -10031,8 +10067,14 @@
       </w:r>
     </w:p>
     <w:p>
-      <w:r>
-        <w:br w:type="page"/>
+      <w:pPr>
+        <w:pStyle w:val="TezBody"/>
+      </w:pPr>
+      <w:r>
+        <w:rPr>
+          <w:rFonts w:ascii="Times New Roman" w:hAnsi="Times New Roman" w:cs="Times New Roman"/>
+        </w:rPr>
+        <w:t>Form yapısında fiyatın sabit değer olarak alınması, projenin pazarlık yerine net fiyat ve mesajlaşma akışını önceleyen yaklaşımıyla uyumludur. Görsel yükleme alanı ise ürünün katalogda güven verici biçimde sunulması için gereklidir.</w:t>
       </w:r>
     </w:p>
     <w:p>
@@ -10054,7 +10096,7 @@
       <w:r>
         <w:drawing>
           <wp:inline xmlns:a="http://schemas.openxmlformats.org/drawingml/2006/main" xmlns:pic="http://schemas.openxmlformats.org/drawingml/2006/picture">
-            <wp:extent cx="5472000" cy="2589149"/>
+            <wp:extent cx="4608000" cy="2180336"/>
             <wp:docPr id="14" name="Picture 14" descr="Image: image14.png"/>
             <wp:cNvGraphicFramePr>
               <a:graphicFrameLocks noChangeAspect="1"/>
@@ -10075,7 +10117,7 @@
                   <pic:spPr>
                     <a:xfrm>
                       <a:off x="0" y="0"/>
-                      <a:ext cx="5472000" cy="2589149"/>
+                      <a:ext cx="4608000" cy="2180336"/>
                     </a:xfrm>
                     <a:prstGeom prst="rect"/>
                   </pic:spPr>
@@ -10110,8 +10152,14 @@
       </w:r>
     </w:p>
     <w:p>
-      <w:r>
-        <w:br w:type="page"/>
+      <w:pPr>
+        <w:pStyle w:val="TezBody"/>
+      </w:pPr>
+      <w:r>
+        <w:rPr>
+          <w:rFonts w:ascii="Times New Roman" w:hAnsi="Times New Roman" w:cs="Times New Roman"/>
+        </w:rPr>
+        <w:t>Favoriler modülü, kullanıcı karar verme sürecini destekleyen yardımcı bir bileşendir. Özellikle çok sayıda katalog ürünü olduğunda kullanıcı, satın alma veya mesajlaşma kararını erteleyebilmekte ve ilgilendiği ürünleri kaybetmemektedir.</w:t>
       </w:r>
     </w:p>
     <w:p>
@@ -10133,7 +10181,7 @@
       <w:r>
         <w:drawing>
           <wp:inline xmlns:a="http://schemas.openxmlformats.org/drawingml/2006/main" xmlns:pic="http://schemas.openxmlformats.org/drawingml/2006/picture">
-            <wp:extent cx="5472000" cy="2591850"/>
+            <wp:extent cx="4608000" cy="2182610"/>
             <wp:docPr id="15" name="Picture 15" descr="Image: image15.png"/>
             <wp:cNvGraphicFramePr>
               <a:graphicFrameLocks noChangeAspect="1"/>
@@ -10154,7 +10202,7 @@
                   <pic:spPr>
                     <a:xfrm>
                       <a:off x="0" y="0"/>
-                      <a:ext cx="5472000" cy="2591850"/>
+                      <a:ext cx="4608000" cy="2182610"/>
                     </a:xfrm>
                     <a:prstGeom prst="rect"/>
                   </pic:spPr>
@@ -10189,8 +10237,14 @@
       </w:r>
     </w:p>
     <w:p>
-      <w:r>
-        <w:br w:type="page"/>
+      <w:pPr>
+        <w:pStyle w:val="TezBody"/>
+      </w:pPr>
+      <w:r>
+        <w:rPr>
+          <w:rFonts w:ascii="Times New Roman" w:hAnsi="Times New Roman" w:cs="Times New Roman"/>
+        </w:rPr>
+        <w:t>Mesajlaşma modülü, AI üretim veya katalog ürünü sonrasında satıcıyla temas kurulmasını sağlayan ana bağlantıdır. Siparişten ayrı tutulması, bilgi alma konuşmaları ile aktif üretim süreçlerinin karışmasını azaltmaktadır.</w:t>
       </w:r>
     </w:p>
     <w:p>
@@ -10212,7 +10266,7 @@
       <w:r>
         <w:drawing>
           <wp:inline xmlns:a="http://schemas.openxmlformats.org/drawingml/2006/main" xmlns:pic="http://schemas.openxmlformats.org/drawingml/2006/picture">
-            <wp:extent cx="5472000" cy="1853465"/>
+            <wp:extent cx="4608000" cy="1560813"/>
             <wp:docPr id="16" name="Picture 16" descr="Image: image16.png"/>
             <wp:cNvGraphicFramePr>
               <a:graphicFrameLocks noChangeAspect="1"/>
@@ -10233,7 +10287,7 @@
                   <pic:spPr>
                     <a:xfrm>
                       <a:off x="0" y="0"/>
-                      <a:ext cx="5472000" cy="1853465"/>
+                      <a:ext cx="4608000" cy="1560813"/>
                     </a:xfrm>
                     <a:prstGeom prst="rect"/>
                   </pic:spPr>
@@ -10265,6 +10319,17 @@
           <w:rFonts w:ascii="Times New Roman" w:hAnsi="Times New Roman" w:cs="Times New Roman"/>
         </w:rPr>
         <w:t>Kaynak: PrintForge uygulamasından alınan ekran görüntüsü, 06.06.2026.</w:t>
+      </w:r>
+    </w:p>
+    <w:p>
+      <w:pPr>
+        <w:pStyle w:val="TezBody"/>
+      </w:pPr>
+      <w:r>
+        <w:rPr>
+          <w:rFonts w:ascii="Times New Roman" w:hAnsi="Times New Roman" w:cs="Times New Roman"/>
+        </w:rPr>
+        <w:t>Sipariş ekranı, projenin yalnızca model fikri üretmekle kalmayıp hizmet sürecini takip edebilecek bir pazaryeri altyapısına yöneldiğini göstermektedir. İleride ödeme, kargo ve üretim aşaması bildirimleri bu ekran üzerinden genişletilebilir.</w:t>
       </w:r>
     </w:p>
     <w:p>

</xml_diff>

<commit_message>
Add secure uploads and hide seller emails
</commit_message>
<xml_diff>
--- a/PrintForge_Bitirme_Tezi.docx
+++ b/PrintForge_Bitirme_Tezi.docx
@@ -893,7 +893,7 @@
           <w:b/>
           <w:sz w:val="24"/>
         </w:rPr>
-        <w:t>Haziran 2026, 50 sayfa</w:t>
+        <w:t>Haziran 2026, 48 sayfa</w:t>
       </w:r>
     </w:p>
     <w:p>
@@ -1035,7 +1035,7 @@
           <w:b/>
           <w:sz w:val="24"/>
         </w:rPr>
-        <w:t>June 2026, 50 pages</w:t>
+        <w:t>June 2026, 48 pages</w:t>
       </w:r>
     </w:p>
     <w:p>
@@ -1686,7 +1686,7 @@
         </w:rPr>
         <w:t>3.3. Derleme ve Teknik Doğrulama Bulguları</w:t>
         <w:tab/>
-        <w:t>45</w:t>
+        <w:t>44</w:t>
       </w:r>
     </w:p>
     <w:p>
@@ -1705,7 +1705,7 @@
         </w:rPr>
         <w:t>3.4. Kullanıcı Akışlarına İlişkin Bulgular</w:t>
         <w:tab/>
-        <w:t>46</w:t>
+        <w:t>45</w:t>
       </w:r>
     </w:p>
     <w:p>
@@ -1724,7 +1724,7 @@
         </w:rPr>
         <w:t>3.5. Güvenlik, Sınırlılıklar ve Geliştirme Önerileri</w:t>
         <w:tab/>
-        <w:t>47</w:t>
+        <w:t>46</w:t>
       </w:r>
     </w:p>
     <w:p>
@@ -1743,7 +1743,7 @@
         </w:rPr>
         <w:t>3.6. Tartışma</w:t>
         <w:tab/>
-        <w:t>48</w:t>
+        <w:t>46</w:t>
       </w:r>
     </w:p>
     <w:p>
@@ -1762,7 +1762,7 @@
         </w:rPr>
         <w:t>SONUÇ VE ÖNERİLER</w:t>
         <w:tab/>
-        <w:t>49</w:t>
+        <w:t>47</w:t>
       </w:r>
     </w:p>
     <w:p>
@@ -1781,7 +1781,7 @@
         </w:rPr>
         <w:t>KAYNAKÇA</w:t>
         <w:tab/>
-        <w:t>50</w:t>
+        <w:t>48</w:t>
       </w:r>
     </w:p>
     <w:p>
@@ -1800,7 +1800,7 @@
         </w:rPr>
         <w:t>EKLER</w:t>
         <w:tab/>
-        <w:t>50</w:t>
+        <w:t>48</w:t>
       </w:r>
     </w:p>
     <w:p>
@@ -1819,7 +1819,7 @@
         </w:rPr>
         <w:t>ÖZGEÇMİŞ</w:t>
         <w:tab/>
-        <w:t>50</w:t>
+        <w:t>48</w:t>
       </w:r>
     </w:p>
     <w:p>
@@ -2284,7 +2284,7 @@
         </w:rPr>
         <w:t>Tablo 3.2. Gerçekleştirilen kullanıcı akışları</w:t>
         <w:tab/>
-        <w:t>46</w:t>
+        <w:t>45</w:t>
       </w:r>
     </w:p>
     <w:p>
@@ -2301,7 +2301,7 @@
         </w:rPr>
         <w:t>Tablo 3.3. Sınırlılıklar ve geliştirme önerileri</w:t>
         <w:tab/>
-        <w:t>47</w:t>
+        <w:t>46</w:t>
       </w:r>
     </w:p>
     <w:p>
@@ -2623,7 +2623,7 @@
         </w:rPr>
         <w:t>Şekil 3.12. Derleme ve doğrulama özeti</w:t>
         <w:tab/>
-        <w:t>45</w:t>
+        <w:t>44</w:t>
       </w:r>
     </w:p>
     <w:p>
@@ -2673,7 +2673,7 @@
         </w:rPr>
         <w:t>Ek A. Kurulum ve çalıştırma adımları</w:t>
         <w:tab/>
-        <w:t>50</w:t>
+        <w:t>48</w:t>
       </w:r>
     </w:p>
     <w:p>
@@ -2690,7 +2690,7 @@
         </w:rPr>
         <w:t>Ek B. Backend ortam değişkenleri</w:t>
         <w:tab/>
-        <w:t>50</w:t>
+        <w:t>48</w:t>
       </w:r>
     </w:p>
     <w:p>
@@ -2707,7 +2707,7 @@
         </w:rPr>
         <w:t>Ek C. API uç noktaları özeti</w:t>
         <w:tab/>
-        <w:t>50</w:t>
+        <w:t>48</w:t>
       </w:r>
     </w:p>
     <w:p>
@@ -2724,7 +2724,7 @@
         </w:rPr>
         <w:t>Ek D. Manuel test kontrol listesi</w:t>
         <w:tab/>
-        <w:t>50</w:t>
+        <w:t>48</w:t>
       </w:r>
     </w:p>
     <w:p>
@@ -7220,11 +7220,6 @@
       </w:r>
     </w:p>
     <w:p>
-      <w:r>
-        <w:br w:type="page"/>
-      </w:r>
-    </w:p>
-    <w:p>
       <w:pPr>
         <w:pStyle w:val="TezHeading"/>
       </w:pPr>
@@ -7245,12 +7240,18 @@
         <w:rPr>
           <w:rFonts w:ascii="Times New Roman" w:hAnsi="Times New Roman" w:cs="Times New Roman"/>
         </w:rPr>
-        <w:t>Bu alt bölüm, uygulamanın yalnızca hangi teknolojilerle geliştirildiğini değil, modüllerin hangi sorumluluklarla ayrıldığını ve bu ayrımın neden tercih edildiğini açıklamak amacıyla eklenmiştir. PrintForge'un hedefi, kullanıcının fikir bulma, AI üretim, katalog inceleme ve satıcıyla iletişim adımlarını aynı sistemde tamamlayabilmesidir. Bu nedenle her modül tek başına çalışan bir sayfa değil, bir sonraki iş adımına veri aktaran bir süreç parçası olarak tasarlanmıştır.</w:t>
-      </w:r>
-    </w:p>
-    <w:p>
-      <w:r>
-        <w:br w:type="page"/>
+        <w:t>Bu alt bölüm, PrintForge uygulamasının yalnızca hangi teknolojilerle geliştirildiğini değil, modüllerin hangi sorumluluklarla ayrıldığını ve bu ayrımın neden tercih edildiğini açıklamak amacıyla hazırlanmıştır. Projede her ekran bağımsız bir sayfa olarak değil, fikir seçimi, AI üretimi, katalog inceleme, satıcıyla iletişim ve sipariş takibi zincirinin bir parçası olarak ele alınmıştır. Bu nedenle modül tasarımında kullanıcı deneyimi, veri modeli, güvenlik ve sürdürülebilirlik kararları birlikte değerlendirilmiştir.</w:t>
+      </w:r>
+    </w:p>
+    <w:p>
+      <w:pPr>
+        <w:pStyle w:val="TezBody"/>
+      </w:pPr>
+      <w:r>
+        <w:rPr>
+          <w:rFonts w:ascii="Times New Roman" w:hAnsi="Times New Roman" w:cs="Times New Roman"/>
+        </w:rPr>
+        <w:t>Modül ayrımı yapılırken iki temel ölçüt kullanılmıştır. İlk ölçüt, kullanıcının ekranda tamamladığı görevin sınırıdır; örneğin örnek görsel arama, AI model üretme, katalog ürünü inceleme veya satıcıya mesaj gönderme ayrı kullanıcı niyetleridir. İkinci ölçüt ise backend tarafında yürütülen iş kuralıdır; kimlik doğrulama, görsel arama, model dosyası erişimi ve mesajlaşma gibi işlemler ayrı rota dosyaları ve doğrulama adımlarıyla yönetilmiştir. Bu yaklaşım kodun okunabilirliğini artırmış, hata ayıklama ve geliştirme sürecini daha kontrollü hale getirmiştir.</w:t>
       </w:r>
     </w:p>
     <w:p>
@@ -7290,22 +7291,6 @@
     </w:p>
     <w:p>
       <w:pPr>
-        <w:pStyle w:val="TezBody"/>
-      </w:pPr>
-      <w:r>
-        <w:rPr>
-          <w:rFonts w:ascii="Times New Roman" w:hAnsi="Times New Roman" w:cs="Times New Roman"/>
-        </w:rPr>
-        <w:t>Next.js sayfa yapısı sayesinde statik ve dinamik sayfalar ayrılabilmiştir. Pazaryeri ve sohbet gibi veriyle çalışan sayfalar gerektiğinde sunucu veya istemci tarafı veri çekme mekanizmalarını kullanırken, örnekler ve AI üretim sayfası kullanıcı etkileşimine göre durum yönetimi yapar. Böylece sistem hem hızlı açılış hem de etkileşimli kullanıcı deneyimi hedeflerini birlikte destekler.</w:t>
-      </w:r>
-    </w:p>
-    <w:p>
-      <w:r>
-        <w:br w:type="page"/>
-      </w:r>
-    </w:p>
-    <w:p>
-      <w:pPr>
         <w:pStyle w:val="TezHeading"/>
       </w:pPr>
       <w:r>
@@ -7336,23 +7321,7 @@
         <w:rPr>
           <w:rFonts w:ascii="Times New Roman" w:hAnsi="Times New Roman" w:cs="Times New Roman"/>
         </w:rPr>
-        <w:t>Kullanıcı bir görsel kartını seçtiğinde yalnızca görsel URL'si aktarılmaz; başlık, kaynak, arama kelimesi ve oluşturulan prompt da query parametreleriyle AI üretim sayfasına taşınır. Bu karar, kullanıcının boş bir prompt alanıyla karşılaşmasını önler. Prompt, referans görselin 3D baskıya uygun, temiz yüzeyli ve üretilebilir bir modele dönüştürülmesi yönünde başlangıç metni sağlar.</w:t>
-      </w:r>
-    </w:p>
-    <w:p>
-      <w:pPr>
-        <w:pStyle w:val="TezBody"/>
-      </w:pPr>
-      <w:r>
-        <w:rPr>
-          <w:rFonts w:ascii="Times New Roman" w:hAnsi="Times New Roman" w:cs="Times New Roman"/>
-        </w:rPr>
-        <w:t>AI üretim sayfası dış görseli doğrudan üretim servisine iletmek yerine backend proxy mekanizması ve tarayıcı tarafında dönüştürme adımıyla dosya haline getirir. Böylece kullanıcı, internetten seçtiği bir görseli ayrıca bilgisayarına indirmeden üretim akışına katabilir. Bu tasarım, fikirden üretim görevine geçiş süresini kısaltmaktadır.</w:t>
-      </w:r>
-    </w:p>
-    <w:p>
-      <w:r>
-        <w:br w:type="page"/>
+        <w:t>Kullanıcı bir görsel kartını seçtiğinde yalnızca görsel URL'si aktarılmaz; başlık, kaynak, arama kelimesi ve oluşturulan prompt da query parametreleriyle AI üretim sayfasına taşınır. Bu karar, kullanıcının boş bir prompt alanıyla karşılaşmasını önler ve referans görselin üretim bağlamını korur.</w:t>
       </w:r>
     </w:p>
     <w:p>
@@ -7387,23 +7356,7 @@
         <w:rPr>
           <w:rFonts w:ascii="Times New Roman" w:hAnsi="Times New Roman" w:cs="Times New Roman"/>
         </w:rPr>
-        <w:t>Frontend tarafındaki AiGenerationProvider, aktif üretim görevini localStorage içinde saklar. Bu sayede kullanıcı sayfadan ayrılsa veya katalogda gezinmeye devam etse bile üretim görevi tamamen unutulmaz. Sistem görev durumunu belirli aralıklarla sorgular ve tamamlandığında ilgili model kimliğini kullanıcı arayüzüne taşır.</w:t>
-      </w:r>
-    </w:p>
-    <w:p>
-      <w:pPr>
-        <w:pStyle w:val="TezBody"/>
-      </w:pPr>
-      <w:r>
-        <w:rPr>
-          <w:rFonts w:ascii="Times New Roman" w:hAnsi="Times New Roman" w:cs="Times New Roman"/>
-        </w:rPr>
-        <w:t>Bu yaklaşım kullanıcı deneyimi açısından önemlidir. 3D model üretimi servis yoğunluğuna göre uzun sürebilir; kullanıcıyı tek ekranda beklemeye zorlamak yerine arka plan izleme yapılması, platformun pazaryeri yönüyle birlikte çalışmasını sağlar. Kullanıcı model hazırlanırken katalog ürünlerini inceleyebilir veya daha önceki üretim geçmişine bakabilir.</w:t>
-      </w:r>
-    </w:p>
-    <w:p>
-      <w:r>
-        <w:br w:type="page"/>
+        <w:t>Frontend tarafındaki üretim durumu yönetimi, aktif üretim görevini kullanıcının oturum deneyimi içinde görünür tutar. Bu sayede kullanıcı sayfadan ayrılsa veya katalogda gezinmeye devam etse bile üretim görevi tamamen unutulmaz. Bu yaklaşım özellikle 3D model üretiminin saniyeler değil dakikalar sürebileceği durumlarda önemlidir.</w:t>
       </w:r>
     </w:p>
     <w:p>
@@ -7438,23 +7391,7 @@
         <w:rPr>
           <w:rFonts w:ascii="Times New Roman" w:hAnsi="Times New Roman" w:cs="Times New Roman"/>
         </w:rPr>
-        <w:t>Hata yönetiminde kullanıcıya teknik ayrıntı yerine anlaşılır mesaj döndürme yaklaşımı kullanılmıştır. Örneğin görsel arama kotası dolduğunda veya API anahtarı geçersiz olduğunda kullanıcıya durumun ne olduğu açıklanır. Geliştirici açısından ise backend logları daha ayrıntılı hata izleme olanağı sağlar.</w:t>
-      </w:r>
-    </w:p>
-    <w:p>
-      <w:pPr>
-        <w:pStyle w:val="TezBody"/>
-      </w:pPr>
-      <w:r>
-        <w:rPr>
-          <w:rFonts w:ascii="Times New Roman" w:hAnsi="Times New Roman" w:cs="Times New Roman"/>
-        </w:rPr>
-        <w:t>Üretim servisleri ve görsel arama sağlayıcıları dış sistemler olduğu için hata olasılığı yerel koddan bağımsız olarak ortaya çıkabilir. Bu nedenle timeout, kota, yetkisiz anahtar, geçersiz yanıt ve bağlantı problemi gibi durumlar ayrı ayrı değerlendirilmiştir. Bu tasarım, sistemin hata anında tamamen sessiz kalmasını veya kullanıcıyı belirsiz bir bekleme durumunda bırakmasını önler.</w:t>
-      </w:r>
-    </w:p>
-    <w:p>
-      <w:r>
-        <w:br w:type="page"/>
+        <w:t>Hata yönetiminde kullanıcıya teknik ayrıntı yerine anlaşılır mesaj döndürme yaklaşımı kullanılmıştır. Görsel arama kotası, geçersiz API anahtarı, üretim servisinin yanıt vermemesi veya dosya formatı uyuşmazlığı gibi durumlar ayrı ayrı ele alınmıştır. Bu tasarım sistemin hata anında sessiz kalmasını önler.</w:t>
       </w:r>
     </w:p>
     <w:p>
@@ -7489,23 +7426,7 @@
         <w:rPr>
           <w:rFonts w:ascii="Times New Roman" w:hAnsi="Times New Roman" w:cs="Times New Roman"/>
         </w:rPr>
-        <w:t>3D önizleme bileşeni Three.js ekosistemi üzerine kurulmuştur. ModelViewer bileşeni GLTF/GLB dosyasını yükler, modeli merkezler, kamera sınırlarını ayarlar ve kullanıcıya döndürme/inceleme olanağı verir. Böylece kullanıcı model dosyasını indirmeden önce biçimsel olarak ne üretildiğini görebilir.</w:t>
-      </w:r>
-    </w:p>
-    <w:p>
-      <w:pPr>
-        <w:pStyle w:val="TezBody"/>
-      </w:pPr>
-      <w:r>
-        <w:rPr>
-          <w:rFonts w:ascii="Times New Roman" w:hAnsi="Times New Roman" w:cs="Times New Roman"/>
-        </w:rPr>
-        <w:t>Model dosyalarına erişim güvenli uç nokta üzerinden yapılır. Kullanıcı yalnızca kendi modeline veya tarafı olduğu konuşmaya bağlı modele erişebilir. Dosya yolu çözülürken uploads dizini dışına çıkılmaması kontrol edildiği için yol manipülasyonu riski azaltılmıştır. Bu yaklaşım özellikle satıcı-kullanıcı arasında paylaşılan AI modelleri için önemlidir.</w:t>
-      </w:r>
-    </w:p>
-    <w:p>
-      <w:r>
-        <w:br w:type="page"/>
+        <w:t>3D önizleme bileşeni Three.js ekosistemi üzerine kurulmuştur. ModelViewer bileşeni modeli yükler, merkezler, kamera sınırlarını ayarlar ve kullanıcıya döndürme/inceleme olanağı verir. Model dosyalarına erişim ise güvenli uç nokta üzerinden yapılır; kullanıcı yalnızca kendi modeline veya tarafı olduğu konuşmaya bağlı modele erişebilir.</w:t>
       </w:r>
     </w:p>
     <w:p>
@@ -7529,7 +7450,7 @@
         <w:rPr>
           <w:rFonts w:ascii="Times New Roman" w:hAnsi="Times New Roman" w:cs="Times New Roman"/>
         </w:rPr>
-        <w:t>Pazaryeri modülü, AI üretimden bağımsız olarak çalışan hazır ürün katalogunu temsil eder. Satıcı, ürün adı, açıklama, kategori, fiyat ve görseller ile katalog ürünü oluşturur. Kullanıcılar bu ürünleri arayabilir, kategori ve maksimum fiyat filtreleriyle daraltabilir, ürün görsellerini inceleyebilir ve satıcıya mesaj gönderebilir.</w:t>
+        <w:t>Pazaryeri modülü, AI üretimden bağımsız olarak çalışan hazır ürün katalogunu temsil eder. Satıcı; ürün adı, açıklama, kategori, fiyat ve görseller ile katalog ürünü oluşturur. Kullanıcılar bu ürünleri arayabilir, kategori ve maksimum fiyat filtreleriyle daraltabilir, ürün görsellerini inceleyebilir ve satıcıya mesaj gönderebilir.</w:t>
       </w:r>
     </w:p>
     <w:p>
@@ -7540,23 +7461,7 @@
         <w:rPr>
           <w:rFonts w:ascii="Times New Roman" w:hAnsi="Times New Roman" w:cs="Times New Roman"/>
         </w:rPr>
-        <w:t>Ürün yönetiminde pasif hale getirme yaklaşımı tercih edilmiştir. Satıcı bir ürünü kaldırdığında kayıt tamamen yok edilmek yerine INACTIVE durumuna alınabilir. Bu yaklaşım, ileride sipariş geçmişi, konuşma kayıtları ve raporlama ihtiyaçları için veri bütünlüğünün korunmasına yardımcı olur.</w:t>
-      </w:r>
-    </w:p>
-    <w:p>
-      <w:pPr>
-        <w:pStyle w:val="TezBody"/>
-      </w:pPr>
-      <w:r>
-        <w:rPr>
-          <w:rFonts w:ascii="Times New Roman" w:hAnsi="Times New Roman" w:cs="Times New Roman"/>
-        </w:rPr>
-        <w:t>Ürün detayında yorum ve soru-cevap alanlarının bulunması, pazaryeri güvenini artıran sosyal kanıt mekanizmasıdır. Kullanıcı ürün hakkında soru sorabilir; yalnızca ürünün satıcısı bu soruya cevap verebilir. Böylece ürün bilgisinin tek taraflı katalog açıklamasından ibaret kalmaması sağlanmıştır.</w:t>
-      </w:r>
-    </w:p>
-    <w:p>
-      <w:r>
-        <w:br w:type="page"/>
+        <w:t>Ürün yönetiminde pasif hale getirme yaklaşımı tercih edilmiştir. Satıcı bir ürünü kaldırdığında kayıt tamamen yok edilmek yerine görünürlükten çıkarılabilir. Bu yaklaşım, ileride sipariş geçmişi, konuşma kayıtları ve raporlama ihtiyaçları için veri bütünlüğünün korunmasına yardımcı olur.</w:t>
       </w:r>
     </w:p>
     <w:p>
@@ -7591,23 +7496,7 @@
         <w:rPr>
           <w:rFonts w:ascii="Times New Roman" w:hAnsi="Times New Roman" w:cs="Times New Roman"/>
         </w:rPr>
-        <w:t>Konuşma kayıtlarında buyerId, sellerId, modelId, modelType ve status alanları bulunur. Status alanı yalnızca mesajlaşma durumunu değil, sipariş yaşam döngüsünü de temsil eder. ORDERED, PREPARING, SHIPPED, COMPLETED ve CANCELLED değerleri alıcı ve satıcı arasında sipariş takibinin metinsel mesajlardan ayrı, izlenebilir bir süreç olarak yürütülmesini sağlar.</w:t>
-      </w:r>
-    </w:p>
-    <w:p>
-      <w:pPr>
-        <w:pStyle w:val="TezBody"/>
-      </w:pPr>
-      <w:r>
-        <w:rPr>
-          <w:rFonts w:ascii="Times New Roman" w:hAnsi="Times New Roman" w:cs="Times New Roman"/>
-        </w:rPr>
-        <w:t>Okunmamış mesaj sayısı ve bildirim özeti, kullanıcının yeni etkileşimleri kaçırmaması için eklenmiştir. Mesajlar ekranı konuşmaları listelerken siparişler ekranı yalnızca aktif sipariş durumuna geçmiş konuşmaları gösterir. Bu ayrım, iletişim ve sipariş takibinin karışmasını önler.</w:t>
-      </w:r>
-    </w:p>
-    <w:p>
-      <w:r>
-        <w:br w:type="page"/>
+        <w:t>Konuşma kayıtlarında buyerId, sellerId, modelId, modelType ve status alanları bulunur. Status alanı yalnızca mesajlaşma durumunu değil, sipariş yaşam döngüsünü de temsil eder. ORDERED, PREPARING, SHIPPED, COMPLETED ve CANCELLED değerleri alıcı ve satıcı arasında sipariş takibinin izlenebilir bir süreç olarak yürütülmesini sağlar.</w:t>
       </w:r>
     </w:p>
     <w:p>
@@ -7642,18 +7531,7 @@
         <w:rPr>
           <w:rFonts w:ascii="Times New Roman" w:hAnsi="Times New Roman" w:cs="Times New Roman"/>
         </w:rPr>
-        <w:t>Backend tarafında DATABASE_URL, JWT_SECRET, FRONTEND_URLS, SERPAPI_API_KEY, TRIPO_API_KEY ve HITEM3D anahtarları gibi değerler ortam değişkenleriyle yönetilir. Böylece gizli bilgiler kaynak koduna yazılmaz. Frontend tarafında ise yalnızca NEXT_PUBLIC_BACKEND_URL gibi istemcinin bilmesi gereken adresler kullanılır.</w:t>
-      </w:r>
-    </w:p>
-    <w:p>
-      <w:pPr>
-        <w:pStyle w:val="TezBody"/>
-      </w:pPr>
-      <w:r>
-        <w:rPr>
-          <w:rFonts w:ascii="Times New Roman" w:hAnsi="Times New Roman" w:cs="Times New Roman"/>
-        </w:rPr>
-        <w:t>Sürdürme açısından modüler rota yapısı önemlidir. Auth, AI, models, chat, examples ve images rotalarının ayrı dosyalarda bulunması, hata ayıklamayı ve yeni özellik eklemeyi kolaylaştırır. Bu yapı ileride ödeme, maliyet tahmini veya model kalite puanı gibi yeni modüllerin sisteme eklenmesini daha düzenli hale getirir.</w:t>
+        <w:t>Backend tarafında DATABASE_URL, JWT_SECRET, FRONTEND_URLS, SERPAPI_API_KEY, TRIPO_API_KEY ve HITEM3D anahtarları gibi değerler ortam değişkenleriyle yönetilir. Böylece gizli bilgiler kaynak koduna yazılmaz. Modüler rota yapısı ise Auth, AI, models, chat, examples ve images alanlarının ayrı dosyalarda sürdürülebilmesini sağlar.</w:t>
       </w:r>
     </w:p>
     <w:p>
@@ -7859,7 +7737,7 @@
                 <w:b w:val="0"/>
                 <w:sz w:val="18"/>
               </w:rPr>
-              <w:t>Rol tabanlı görünürlük ve kullanıcıya anlaşılır durum mesajı</w:t>
+              <w:t>Rol tabanlı görünürlük ve anlaşılır durum mesajı</w:t>
             </w:r>
           </w:p>
         </w:tc>
@@ -8210,11 +8088,6 @@
       </w:r>
     </w:p>
     <w:p>
-      <w:r>
-        <w:br w:type="page"/>
-      </w:r>
-    </w:p>
-    <w:p>
       <w:pPr>
         <w:pStyle w:val="TezHeading"/>
       </w:pPr>
@@ -8235,7 +8108,18 @@
         <w:rPr>
           <w:rFonts w:ascii="Times New Roman" w:hAnsi="Times New Roman" w:cs="Times New Roman"/>
         </w:rPr>
-        <w:t>Bitirme projesi süreci, yalnızca kod yazımı olarak değil, ihtiyaç analizi, mimari kararlar, uygulama geliştirme, entegrasyon, test ve raporlama adımlarını kapsayan bir mühendislik süreci olarak planlanmıştır. Bu nedenle iş paketleri çıktıya göre ayrılmıştır. Her iş paketinin sonunda kontrol edilebilir bir çıktı üretilmesi hedeflenmiştir.</w:t>
+        <w:t>Bitirme projesi süreci, yalnızca kod yazımı olarak değil; ihtiyaç analizi, mimari kararlar, uygulama geliştirme, entegrasyon, test ve raporlama adımlarını kapsayan bir mühendislik süreci olarak planlanmıştır. Bu nedenle iş paketleri çıktıya göre ayrılmıştır. Her iş paketinin sonunda kontrol edilebilir bir çıktı üretilmesi hedeflenmiştir.</w:t>
+      </w:r>
+    </w:p>
+    <w:p>
+      <w:pPr>
+        <w:pStyle w:val="TezBody"/>
+      </w:pPr>
+      <w:r>
+        <w:rPr>
+          <w:rFonts w:ascii="Times New Roman" w:hAnsi="Times New Roman" w:cs="Times New Roman"/>
+        </w:rPr>
+        <w:t>İş paketlerinin sıralı tasarlanması, projenin son aşamada bütünleşik görünmesini sağlamıştır. Örneğin AI üretim sayfası katalog ve mesajlaşma modülleri olmadan yalnızca model oluşturan bir araç olarak kalacaktı. Mesajlaşma ve sipariş modüllerinin eklenmesiyle AI çıktısının gerçek üretim talebine dönüşmesi mümkün hale gelmiştir.</w:t>
       </w:r>
     </w:p>
     <w:p>
@@ -8861,17 +8745,6 @@
           <w:sz w:val="20"/>
         </w:rPr>
         <w:t>Kaynak: Proje geliştirme süreci esas alınarak hazırlanmıştır.</w:t>
-      </w:r>
-    </w:p>
-    <w:p>
-      <w:pPr>
-        <w:pStyle w:val="TezBody"/>
-      </w:pPr>
-      <w:r>
-        <w:rPr>
-          <w:rFonts w:ascii="Times New Roman" w:hAnsi="Times New Roman" w:cs="Times New Roman"/>
-        </w:rPr>
-        <w:t>İş paketlerinin sıralı tasarlanması, projenin son aşamada bütünleşik görünmesini sağlamıştır. Örneğin AI üretim sayfası katalog ve mesajlaşma modülleri olmadan yalnızca model oluşturan bir araç olarak kalacaktı. Mesajlaşma ve sipariş modüllerinin eklenmesiyle AI çıktısının gerçek üretim talebine dönüşmesi mümkün hale gelmiştir.</w:t>
       </w:r>
     </w:p>
     <w:p>

</xml_diff>

<commit_message>
Add admin seller filtering and 3D preview support
</commit_message>
<xml_diff>
--- a/PrintForge_Bitirme_Tezi.docx
+++ b/PrintForge_Bitirme_Tezi.docx
@@ -1620,14 +1620,14 @@
           <w:tab w:pos="8787" w:val="right" w:leader="dot"/>
         </w:tabs>
         <w:spacing w:after="20"/>
-        <w:ind w:left="0" w:firstLine="0"/>
+        <w:ind w:left="340" w:firstLine="0"/>
       </w:pPr>
       <w:r>
         <w:rPr>
           <w:rFonts w:ascii="Times New Roman" w:hAnsi="Times New Roman" w:cs="Times New Roman"/>
           <w:sz w:val="22"/>
         </w:rPr>
-        <w:t>ÜÇÜNCÜ BÖLÜM BULGULAR VE TARTIŞMA</w:t>
+        <w:t>2.9. Senaryo Tabanlı Sistem Tasarımı</w:t>
         <w:tab/>
         <w:t>34</w:t>
       </w:r>
@@ -1646,9 +1646,28 @@
           <w:rFonts w:ascii="Times New Roman" w:hAnsi="Times New Roman" w:cs="Times New Roman"/>
           <w:sz w:val="22"/>
         </w:rPr>
-        <w:t>3.1. Gerçekleştirilen Modüller</w:t>
+        <w:t>2.10. Kalite, Güvenlik ve Sürdürülebilirlik Değerlendirmesi</w:t>
         <w:tab/>
-        <w:t>34</w:t>
+        <w:t>39</w:t>
+      </w:r>
+    </w:p>
+    <w:p>
+      <w:pPr>
+        <w:pStyle w:val="TezNoIndent"/>
+        <w:tabs>
+          <w:tab w:pos="8787" w:val="right" w:leader="dot"/>
+        </w:tabs>
+        <w:spacing w:after="20"/>
+        <w:ind w:left="0" w:firstLine="0"/>
+      </w:pPr>
+      <w:r>
+        <w:rPr>
+          <w:rFonts w:ascii="Times New Roman" w:hAnsi="Times New Roman" w:cs="Times New Roman"/>
+          <w:sz w:val="22"/>
+        </w:rPr>
+        <w:t>ÜÇÜNCÜ BÖLÜM BULGULAR VE TARTIŞMA</w:t>
+        <w:tab/>
+        <w:t>36</w:t>
       </w:r>
     </w:p>
     <w:p>
@@ -1665,7 +1684,7 @@
           <w:rFonts w:ascii="Times New Roman" w:hAnsi="Times New Roman" w:cs="Times New Roman"/>
           <w:sz w:val="22"/>
         </w:rPr>
-        <w:t>3.2. Arayüz ve Kullanıcı Akışı Bulguları</w:t>
+        <w:t>3.1. Gerçekleştirilen Modüller</w:t>
         <w:tab/>
         <w:t>36</w:t>
       </w:r>
@@ -1684,9 +1703,9 @@
           <w:rFonts w:ascii="Times New Roman" w:hAnsi="Times New Roman" w:cs="Times New Roman"/>
           <w:sz w:val="22"/>
         </w:rPr>
-        <w:t>3.3. Derleme ve Teknik Doğrulama Bulguları</w:t>
+        <w:t>3.2. Arayüz ve Kullanıcı Akışı Bulguları</w:t>
         <w:tab/>
-        <w:t>44</w:t>
+        <w:t>38</w:t>
       </w:r>
     </w:p>
     <w:p>
@@ -1703,9 +1722,9 @@
           <w:rFonts w:ascii="Times New Roman" w:hAnsi="Times New Roman" w:cs="Times New Roman"/>
           <w:sz w:val="22"/>
         </w:rPr>
-        <w:t>3.4. Kullanıcı Akışlarına İlişkin Bulgular</w:t>
+        <w:t>3.3. Derleme ve Teknik Doğrulama Bulguları</w:t>
         <w:tab/>
-        <w:t>45</w:t>
+        <w:t>43</w:t>
       </w:r>
     </w:p>
     <w:p>
@@ -1722,9 +1741,9 @@
           <w:rFonts w:ascii="Times New Roman" w:hAnsi="Times New Roman" w:cs="Times New Roman"/>
           <w:sz w:val="22"/>
         </w:rPr>
-        <w:t>3.5. Güvenlik, Sınırlılıklar ve Geliştirme Önerileri</w:t>
+        <w:t>3.4. Kullanıcı Akışlarına İlişkin Bulgular</w:t>
         <w:tab/>
-        <w:t>46</w:t>
+        <w:t>44</w:t>
       </w:r>
     </w:p>
     <w:p>
@@ -1741,9 +1760,47 @@
           <w:rFonts w:ascii="Times New Roman" w:hAnsi="Times New Roman" w:cs="Times New Roman"/>
           <w:sz w:val="22"/>
         </w:rPr>
+        <w:t>3.5. Güvenlik, Sınırlılıklar ve Geliştirme Önerileri</w:t>
+        <w:tab/>
+        <w:t>45</w:t>
+      </w:r>
+    </w:p>
+    <w:p>
+      <w:pPr>
+        <w:pStyle w:val="TezNoIndent"/>
+        <w:tabs>
+          <w:tab w:pos="8787" w:val="right" w:leader="dot"/>
+        </w:tabs>
+        <w:spacing w:after="20"/>
+        <w:ind w:left="340" w:firstLine="0"/>
+      </w:pPr>
+      <w:r>
+        <w:rPr>
+          <w:rFonts w:ascii="Times New Roman" w:hAnsi="Times New Roman" w:cs="Times New Roman"/>
+          <w:sz w:val="22"/>
+        </w:rPr>
         <w:t>3.6. Tartışma</w:t>
         <w:tab/>
         <w:t>46</w:t>
+      </w:r>
+    </w:p>
+    <w:p>
+      <w:pPr>
+        <w:pStyle w:val="TezNoIndent"/>
+        <w:tabs>
+          <w:tab w:pos="8787" w:val="right" w:leader="dot"/>
+        </w:tabs>
+        <w:spacing w:after="20"/>
+        <w:ind w:left="340" w:firstLine="0"/>
+      </w:pPr>
+      <w:r>
+        <w:rPr>
+          <w:rFonts w:ascii="Times New Roman" w:hAnsi="Times New Roman" w:cs="Times New Roman"/>
+          <w:sz w:val="22"/>
+        </w:rPr>
+        <w:t>3.7. Demo ve Kabul Değerlendirmesi</w:t>
+        <w:tab/>
+        <w:t>47</w:t>
       </w:r>
     </w:p>
     <w:p>
@@ -1762,7 +1819,7 @@
         </w:rPr>
         <w:t>SONUÇ VE ÖNERİLER</w:t>
         <w:tab/>
-        <w:t>47</w:t>
+        <w:t>48</w:t>
       </w:r>
     </w:p>
     <w:p>
@@ -1781,7 +1838,7 @@
         </w:rPr>
         <w:t>KAYNAKÇA</w:t>
         <w:tab/>
-        <w:t>48</w:t>
+        <w:t>49</w:t>
       </w:r>
     </w:p>
     <w:p>
@@ -1800,7 +1857,7 @@
         </w:rPr>
         <w:t>EKLER</w:t>
         <w:tab/>
-        <w:t>48</w:t>
+        <w:t>50</w:t>
       </w:r>
     </w:p>
     <w:p>
@@ -1819,7 +1876,7 @@
         </w:rPr>
         <w:t>ÖZGEÇMİŞ</w:t>
         <w:tab/>
-        <w:t>48</w:t>
+        <w:t>50</w:t>
       </w:r>
     </w:p>
     <w:p>
@@ -2265,9 +2322,9 @@
           <w:rFonts w:ascii="Times New Roman" w:hAnsi="Times New Roman" w:cs="Times New Roman"/>
           <w:sz w:val="22"/>
         </w:rPr>
-        <w:t>Tablo 3.1. Derleme doğrulama sonuçları</w:t>
+        <w:t>Tablo 2.7. Senaryo bazlı kabul matrisi</w:t>
         <w:tab/>
-        <w:t>35</w:t>
+        <w:t>38</w:t>
       </w:r>
     </w:p>
     <w:p>
@@ -2282,9 +2339,9 @@
           <w:rFonts w:ascii="Times New Roman" w:hAnsi="Times New Roman" w:cs="Times New Roman"/>
           <w:sz w:val="22"/>
         </w:rPr>
-        <w:t>Tablo 3.2. Gerçekleştirilen kullanıcı akışları</w:t>
+        <w:t>Tablo 2.8. Teknik kalite ve risk kontrol matrisi</w:t>
         <w:tab/>
-        <w:t>45</w:t>
+        <w:t>42</w:t>
       </w:r>
     </w:p>
     <w:p>
@@ -2299,42 +2356,9 @@
           <w:rFonts w:ascii="Times New Roman" w:hAnsi="Times New Roman" w:cs="Times New Roman"/>
           <w:sz w:val="22"/>
         </w:rPr>
-        <w:t>Tablo 3.3. Sınırlılıklar ve geliştirme önerileri</w:t>
+        <w:t>Tablo 3.1. Derleme doğrulama sonuçları</w:t>
         <w:tab/>
-        <w:t>46</w:t>
-      </w:r>
-    </w:p>
-    <w:p>
-      <w:r>
-        <w:br w:type="page"/>
-      </w:r>
-    </w:p>
-    <w:p>
-      <w:pPr>
-        <w:pStyle w:val="TezTitle"/>
-        <w:spacing w:before="0" w:after="240"/>
-      </w:pPr>
-      <w:r>
-        <w:rPr>
-          <w:rFonts w:ascii="Times New Roman" w:hAnsi="Times New Roman" w:cs="Times New Roman"/>
-          <w:b/>
-          <w:sz w:val="24"/>
-        </w:rPr>
-        <w:t>ŞEKİLLER LİSTESİ</w:t>
-      </w:r>
-    </w:p>
-    <w:p>
-      <w:pPr>
-        <w:pStyle w:val="TezNoIndent"/>
-        <w:jc w:val="right"/>
-      </w:pPr>
-      <w:r>
-        <w:rPr>
-          <w:rFonts w:ascii="Times New Roman" w:hAnsi="Times New Roman" w:cs="Times New Roman"/>
-          <w:b/>
-          <w:sz w:val="22"/>
-        </w:rPr>
-        <w:t>Sayfa</w:t>
+        <w:t>37</w:t>
       </w:r>
     </w:p>
     <w:p>
@@ -2349,9 +2373,9 @@
           <w:rFonts w:ascii="Times New Roman" w:hAnsi="Times New Roman" w:cs="Times New Roman"/>
           <w:sz w:val="22"/>
         </w:rPr>
-        <w:t>Şekil 1.1. Literatürden projeye uzanan kavramsal konumlandırma</w:t>
+        <w:t>Tablo 3.2. Gerçekleştirilen kullanıcı akışları</w:t>
         <w:tab/>
-        <w:t>6</w:t>
+        <w:t>44</w:t>
       </w:r>
     </w:p>
     <w:p>
@@ -2366,9 +2390,9 @@
           <w:rFonts w:ascii="Times New Roman" w:hAnsi="Times New Roman" w:cs="Times New Roman"/>
           <w:sz w:val="22"/>
         </w:rPr>
-        <w:t>Şekil 2.1. PrintForge sistem mimarisi</w:t>
+        <w:t>Tablo 3.3. Sınırlılıklar ve geliştirme önerileri</w:t>
         <w:tab/>
-        <w:t>15</w:t>
+        <w:t>45</w:t>
       </w:r>
     </w:p>
     <w:p>
@@ -2383,9 +2407,42 @@
           <w:rFonts w:ascii="Times New Roman" w:hAnsi="Times New Roman" w:cs="Times New Roman"/>
           <w:sz w:val="22"/>
         </w:rPr>
-        <w:t>Şekil 2.2. Referans görselden AI üretime veri akışı</w:t>
+        <w:t>Tablo 3.4. Savunma demosu ve kanıt matrisi</w:t>
         <w:tab/>
-        <w:t>16</w:t>
+        <w:t>47</w:t>
+      </w:r>
+    </w:p>
+    <w:p>
+      <w:r>
+        <w:br w:type="page"/>
+      </w:r>
+    </w:p>
+    <w:p>
+      <w:pPr>
+        <w:pStyle w:val="TezTitle"/>
+        <w:spacing w:before="0" w:after="240"/>
+      </w:pPr>
+      <w:r>
+        <w:rPr>
+          <w:rFonts w:ascii="Times New Roman" w:hAnsi="Times New Roman" w:cs="Times New Roman"/>
+          <w:b/>
+          <w:sz w:val="24"/>
+        </w:rPr>
+        <w:t>ŞEKİLLER LİSTESİ</w:t>
+      </w:r>
+    </w:p>
+    <w:p>
+      <w:pPr>
+        <w:pStyle w:val="TezNoIndent"/>
+        <w:jc w:val="right"/>
+      </w:pPr>
+      <w:r>
+        <w:rPr>
+          <w:rFonts w:ascii="Times New Roman" w:hAnsi="Times New Roman" w:cs="Times New Roman"/>
+          <w:b/>
+          <w:sz w:val="22"/>
+        </w:rPr>
+        <w:t>Sayfa</w:t>
       </w:r>
     </w:p>
     <w:p>
@@ -2400,9 +2457,9 @@
           <w:rFonts w:ascii="Times New Roman" w:hAnsi="Times New Roman" w:cs="Times New Roman"/>
           <w:sz w:val="22"/>
         </w:rPr>
-        <w:t>Şekil 2.3. Veri modeli ilişkileri</w:t>
+        <w:t>Şekil 1.1. Literatürden projeye uzanan kavramsal konumlandırma</w:t>
         <w:tab/>
-        <w:t>18</w:t>
+        <w:t>6</w:t>
       </w:r>
     </w:p>
     <w:p>
@@ -2417,9 +2474,9 @@
           <w:rFonts w:ascii="Times New Roman" w:hAnsi="Times New Roman" w:cs="Times New Roman"/>
           <w:sz w:val="22"/>
         </w:rPr>
-        <w:t>Şekil 2.4. Kimlik doğrulama ve güvenli erişim akışı</w:t>
+        <w:t>Şekil 2.1. PrintForge sistem mimarisi</w:t>
         <w:tab/>
-        <w:t>23</w:t>
+        <w:t>15</w:t>
       </w:r>
     </w:p>
     <w:p>
@@ -2434,9 +2491,9 @@
           <w:rFonts w:ascii="Times New Roman" w:hAnsi="Times New Roman" w:cs="Times New Roman"/>
           <w:sz w:val="22"/>
         </w:rPr>
-        <w:t>Şekil 3.1. Modül tamamlama durumu</w:t>
+        <w:t>Şekil 2.2. Referans görselden AI üretime veri akışı</w:t>
         <w:tab/>
-        <w:t>35</w:t>
+        <w:t>16</w:t>
       </w:r>
     </w:p>
     <w:p>
@@ -2451,9 +2508,9 @@
           <w:rFonts w:ascii="Times New Roman" w:hAnsi="Times New Roman" w:cs="Times New Roman"/>
           <w:sz w:val="22"/>
         </w:rPr>
-        <w:t>Şekil 3.2. Ana sayfa ve değer önerisi ekranı</w:t>
+        <w:t>Şekil 2.3. Veri modeli ilişkileri</w:t>
         <w:tab/>
-        <w:t>36</w:t>
+        <w:t>18</w:t>
       </w:r>
     </w:p>
     <w:p>
@@ -2468,9 +2525,9 @@
           <w:rFonts w:ascii="Times New Roman" w:hAnsi="Times New Roman" w:cs="Times New Roman"/>
           <w:sz w:val="22"/>
         </w:rPr>
-        <w:t>Şekil 3.3. Katalog ve filtreleme ekranı</w:t>
+        <w:t>Şekil 2.4. Kimlik doğrulama ve güvenli erişim akışı</w:t>
         <w:tab/>
-        <w:t>37</w:t>
+        <w:t>23</w:t>
       </w:r>
     </w:p>
     <w:p>
@@ -2485,9 +2542,9 @@
           <w:rFonts w:ascii="Times New Roman" w:hAnsi="Times New Roman" w:cs="Times New Roman"/>
           <w:sz w:val="22"/>
         </w:rPr>
-        <w:t>Şekil 3.4. Örnek görsel arama ekranı</w:t>
+        <w:t>Şekil 3.1. Modül tamamlama durumu</w:t>
         <w:tab/>
-        <w:t>38</w:t>
+        <w:t>37</w:t>
       </w:r>
     </w:p>
     <w:p>
@@ -2502,9 +2559,9 @@
           <w:rFonts w:ascii="Times New Roman" w:hAnsi="Times New Roman" w:cs="Times New Roman"/>
           <w:sz w:val="22"/>
         </w:rPr>
-        <w:t>Şekil 3.5. AI model üretim ekranı</w:t>
+        <w:t>Şekil 3.2. Ana sayfa ve değer önerisi ekranı</w:t>
         <w:tab/>
-        <w:t>39</w:t>
+        <w:t>38</w:t>
       </w:r>
     </w:p>
     <w:p>
@@ -2519,9 +2576,9 @@
           <w:rFonts w:ascii="Times New Roman" w:hAnsi="Times New Roman" w:cs="Times New Roman"/>
           <w:sz w:val="22"/>
         </w:rPr>
-        <w:t>Şekil 3.6. Giriş ekranı</w:t>
+        <w:t>Şekil 3.3. Katalog ve filtreleme ekranı</w:t>
         <w:tab/>
-        <w:t>40</w:t>
+        <w:t>39</w:t>
       </w:r>
     </w:p>
     <w:p>
@@ -2536,9 +2593,9 @@
           <w:rFonts w:ascii="Times New Roman" w:hAnsi="Times New Roman" w:cs="Times New Roman"/>
           <w:sz w:val="22"/>
         </w:rPr>
-        <w:t>Şekil 3.7. Satıcı ürün yönetimi ekranı</w:t>
+        <w:t>Şekil 3.4. Örnek görsel arama ekranı</w:t>
         <w:tab/>
-        <w:t>41</w:t>
+        <w:t>40</w:t>
       </w:r>
     </w:p>
     <w:p>
@@ -2553,9 +2610,9 @@
           <w:rFonts w:ascii="Times New Roman" w:hAnsi="Times New Roman" w:cs="Times New Roman"/>
           <w:sz w:val="22"/>
         </w:rPr>
-        <w:t>Şekil 3.8. Satıcı ürün ekleme ekranı</w:t>
+        <w:t>Şekil 3.5. AI model üretim ekranı</w:t>
         <w:tab/>
-        <w:t>42</w:t>
+        <w:t>41</w:t>
       </w:r>
     </w:p>
     <w:p>
@@ -2570,9 +2627,9 @@
           <w:rFonts w:ascii="Times New Roman" w:hAnsi="Times New Roman" w:cs="Times New Roman"/>
           <w:sz w:val="22"/>
         </w:rPr>
-        <w:t>Şekil 3.9. Favoriler ekranı</w:t>
+        <w:t>Şekil 3.6. Giriş ekranı</w:t>
         <w:tab/>
-        <w:t>43</w:t>
+        <w:t>42</w:t>
       </w:r>
     </w:p>
     <w:p>
@@ -2587,9 +2644,9 @@
           <w:rFonts w:ascii="Times New Roman" w:hAnsi="Times New Roman" w:cs="Times New Roman"/>
           <w:sz w:val="22"/>
         </w:rPr>
-        <w:t>Şekil 3.10. Mesajlar ekranı</w:t>
+        <w:t>Şekil 3.7. Satıcı ürün yönetimi ekranı</w:t>
         <w:tab/>
-        <w:t>44</w:t>
+        <w:t>43</w:t>
       </w:r>
     </w:p>
     <w:p>
@@ -2604,9 +2661,9 @@
           <w:rFonts w:ascii="Times New Roman" w:hAnsi="Times New Roman" w:cs="Times New Roman"/>
           <w:sz w:val="22"/>
         </w:rPr>
-        <w:t>Şekil 3.11. Sipariş takip ekranı</w:t>
+        <w:t>Şekil 3.8. Satıcı ürün ekleme ekranı</w:t>
         <w:tab/>
-        <w:t>44</w:t>
+        <w:t>43</w:t>
       </w:r>
     </w:p>
     <w:p>
@@ -2621,42 +2678,9 @@
           <w:rFonts w:ascii="Times New Roman" w:hAnsi="Times New Roman" w:cs="Times New Roman"/>
           <w:sz w:val="22"/>
         </w:rPr>
-        <w:t>Şekil 3.12. Derleme ve doğrulama özeti</w:t>
+        <w:t>Şekil 3.9. Favoriler ekranı</w:t>
         <w:tab/>
         <w:t>44</w:t>
-      </w:r>
-    </w:p>
-    <w:p>
-      <w:r>
-        <w:br w:type="page"/>
-      </w:r>
-    </w:p>
-    <w:p>
-      <w:pPr>
-        <w:pStyle w:val="TezTitle"/>
-        <w:spacing w:before="0" w:after="240"/>
-      </w:pPr>
-      <w:r>
-        <w:rPr>
-          <w:rFonts w:ascii="Times New Roman" w:hAnsi="Times New Roman" w:cs="Times New Roman"/>
-          <w:b/>
-          <w:sz w:val="24"/>
-        </w:rPr>
-        <w:t>EKLER LİSTESİ</w:t>
-      </w:r>
-    </w:p>
-    <w:p>
-      <w:pPr>
-        <w:pStyle w:val="TezNoIndent"/>
-        <w:jc w:val="right"/>
-      </w:pPr>
-      <w:r>
-        <w:rPr>
-          <w:rFonts w:ascii="Times New Roman" w:hAnsi="Times New Roman" w:cs="Times New Roman"/>
-          <w:b/>
-          <w:sz w:val="22"/>
-        </w:rPr>
-        <w:t>Sayfa</w:t>
       </w:r>
     </w:p>
     <w:p>
@@ -2671,9 +2695,9 @@
           <w:rFonts w:ascii="Times New Roman" w:hAnsi="Times New Roman" w:cs="Times New Roman"/>
           <w:sz w:val="22"/>
         </w:rPr>
-        <w:t>Ek A. Kurulum ve çalıştırma adımları</w:t>
+        <w:t>Şekil 3.10. Mesajlar ekranı</w:t>
         <w:tab/>
-        <w:t>48</w:t>
+        <w:t>44</w:t>
       </w:r>
     </w:p>
     <w:p>
@@ -2688,9 +2712,9 @@
           <w:rFonts w:ascii="Times New Roman" w:hAnsi="Times New Roman" w:cs="Times New Roman"/>
           <w:sz w:val="22"/>
         </w:rPr>
-        <w:t>Ek B. Backend ortam değişkenleri</w:t>
+        <w:t>Şekil 3.11. Sipariş takip ekranı</w:t>
         <w:tab/>
-        <w:t>48</w:t>
+        <w:t>45</w:t>
       </w:r>
     </w:p>
     <w:p>
@@ -2705,9 +2729,42 @@
           <w:rFonts w:ascii="Times New Roman" w:hAnsi="Times New Roman" w:cs="Times New Roman"/>
           <w:sz w:val="22"/>
         </w:rPr>
-        <w:t>Ek C. API uç noktaları özeti</w:t>
+        <w:t>Şekil 3.12. Derleme ve doğrulama özeti</w:t>
         <w:tab/>
-        <w:t>48</w:t>
+        <w:t>46</w:t>
+      </w:r>
+    </w:p>
+    <w:p>
+      <w:r>
+        <w:br w:type="page"/>
+      </w:r>
+    </w:p>
+    <w:p>
+      <w:pPr>
+        <w:pStyle w:val="TezTitle"/>
+        <w:spacing w:before="0" w:after="240"/>
+      </w:pPr>
+      <w:r>
+        <w:rPr>
+          <w:rFonts w:ascii="Times New Roman" w:hAnsi="Times New Roman" w:cs="Times New Roman"/>
+          <w:b/>
+          <w:sz w:val="24"/>
+        </w:rPr>
+        <w:t>EKLER LİSTESİ</w:t>
+      </w:r>
+    </w:p>
+    <w:p>
+      <w:pPr>
+        <w:pStyle w:val="TezNoIndent"/>
+        <w:jc w:val="right"/>
+      </w:pPr>
+      <w:r>
+        <w:rPr>
+          <w:rFonts w:ascii="Times New Roman" w:hAnsi="Times New Roman" w:cs="Times New Roman"/>
+          <w:b/>
+          <w:sz w:val="22"/>
+        </w:rPr>
+        <w:t>Sayfa</w:t>
       </w:r>
     </w:p>
     <w:p>
@@ -2722,9 +2779,60 @@
           <w:rFonts w:ascii="Times New Roman" w:hAnsi="Times New Roman" w:cs="Times New Roman"/>
           <w:sz w:val="22"/>
         </w:rPr>
+        <w:t>Ek A. Kurulum ve çalıştırma adımları</w:t>
+        <w:tab/>
+        <w:t>50</w:t>
+      </w:r>
+    </w:p>
+    <w:p>
+      <w:pPr>
+        <w:pStyle w:val="TezNoIndent"/>
+        <w:tabs>
+          <w:tab w:pos="8787" w:val="right" w:leader="dot"/>
+        </w:tabs>
+      </w:pPr>
+      <w:r>
+        <w:rPr>
+          <w:rFonts w:ascii="Times New Roman" w:hAnsi="Times New Roman" w:cs="Times New Roman"/>
+          <w:sz w:val="22"/>
+        </w:rPr>
+        <w:t>Ek B. Backend ortam değişkenleri</w:t>
+        <w:tab/>
+        <w:t>50</w:t>
+      </w:r>
+    </w:p>
+    <w:p>
+      <w:pPr>
+        <w:pStyle w:val="TezNoIndent"/>
+        <w:tabs>
+          <w:tab w:pos="8787" w:val="right" w:leader="dot"/>
+        </w:tabs>
+      </w:pPr>
+      <w:r>
+        <w:rPr>
+          <w:rFonts w:ascii="Times New Roman" w:hAnsi="Times New Roman" w:cs="Times New Roman"/>
+          <w:sz w:val="22"/>
+        </w:rPr>
+        <w:t>Ek C. API uç noktaları özeti</w:t>
+        <w:tab/>
+        <w:t>50</w:t>
+      </w:r>
+    </w:p>
+    <w:p>
+      <w:pPr>
+        <w:pStyle w:val="TezNoIndent"/>
+        <w:tabs>
+          <w:tab w:pos="8787" w:val="right" w:leader="dot"/>
+        </w:tabs>
+      </w:pPr>
+      <w:r>
+        <w:rPr>
+          <w:rFonts w:ascii="Times New Roman" w:hAnsi="Times New Roman" w:cs="Times New Roman"/>
+          <w:sz w:val="22"/>
+        </w:rPr>
         <w:t>Ek D. Manuel test kontrol listesi</w:t>
         <w:tab/>
-        <w:t>48</w:t>
+        <w:t>50</w:t>
       </w:r>
     </w:p>
     <w:p>
@@ -8748,6 +8856,2626 @@
       </w:r>
     </w:p>
     <w:p>
+      <w:pPr>
+        <w:pStyle w:val="TezHeading"/>
+      </w:pPr>
+      <w:r>
+        <w:rPr>
+          <w:rFonts w:ascii="Times New Roman" w:hAnsi="Times New Roman" w:cs="Times New Roman"/>
+          <w:b/>
+          <w:sz w:val="24"/>
+        </w:rPr>
+        <w:t>2.9. Senaryo Tabanlı Sistem Tasarımı</w:t>
+      </w:r>
+    </w:p>
+    <w:p>
+      <w:pPr>
+        <w:pStyle w:val="TezBody"/>
+      </w:pPr>
+      <w:r>
+        <w:rPr>
+          <w:rFonts w:ascii="Times New Roman" w:hAnsi="Times New Roman" w:cs="Times New Roman"/>
+        </w:rPr>
+        <w:t>Senaryo tabanlı tasarım değerlendirmesi, geliştirilen web uygulamasının yalnızca teknik bileşenlerden oluşmadığını, gerçek kullanıcı görevlerini tamamlayacak biçimde kurgulandığını göstermek için yapılmıştır. Bu yaklaşımda her senaryo bir kullanıcının sistemde tamamlamak istediği iş adımına karşılık gelir. Böylece arayüz, backend rotaları, veritabanı kayıtları ve hata durumları aynı bütün içinde incelenebilir.</w:t>
+      </w:r>
+    </w:p>
+    <w:p>
+      <w:pPr>
+        <w:pStyle w:val="TezBody"/>
+      </w:pPr>
+      <w:r>
+        <w:rPr>
+          <w:rFonts w:ascii="Times New Roman" w:hAnsi="Times New Roman" w:cs="Times New Roman"/>
+        </w:rPr>
+        <w:t>PrintForge için belirlenen senaryolar üç kullanıcı rolüne göre gruplandırılmıştır: normal kullanıcı, satıcı ve admin. Normal kullanıcı; fikir bulma, AI model üretme, katalog inceleme, favori/sepet kullanma ve satıcıyla iletişime geçme görevlerini yürütür. Satıcı; ürün ekleme, ürünleri yönetme, mesajlara dönme ve sipariş durumunu takip etme görevlerini yürütür. Admin ise örnek içeriklerin sürdürülebilir biçimde yönetilmesini sağlar.</w:t>
+      </w:r>
+    </w:p>
+    <w:p>
+      <w:pPr>
+        <w:pStyle w:val="TezHeading"/>
+      </w:pPr>
+      <w:r>
+        <w:rPr>
+          <w:rFonts w:ascii="Times New Roman" w:hAnsi="Times New Roman" w:cs="Times New Roman"/>
+          <w:b/>
+          <w:sz w:val="24"/>
+        </w:rPr>
+        <w:t>2.9.1. Hesap Oluşturma ve Giriş Senaryosu</w:t>
+      </w:r>
+    </w:p>
+    <w:p>
+      <w:pPr>
+        <w:pStyle w:val="TezBody"/>
+      </w:pPr>
+      <w:r>
+        <w:rPr>
+          <w:rFonts w:ascii="Times New Roman" w:hAnsi="Times New Roman" w:cs="Times New Roman"/>
+        </w:rPr>
+        <w:t>Bu senaryo, kullanıcının sisteme güvenli biçimde dahil olması amacıyla değerlendirilmiştir. PrintForge'un hedef kitlesi teknik modelleme bilgisi sınırlı kullanıcılar ve ürün yayınlamak isteyen satıcılar olduğu için her akışın açık, izlenebilir ve hata durumunda anlaşılır olması gerekir. Senaryonun tasarım değeri, kullanıcının tek bir ekranda ne yapacağını anlaması ve işlemin sonucunu sistem içinde takip edebilmesidir.</w:t>
+      </w:r>
+    </w:p>
+    <w:p>
+      <w:pPr>
+        <w:pStyle w:val="TezBody"/>
+      </w:pPr>
+      <w:r>
+        <w:rPr>
+          <w:rFonts w:ascii="Times New Roman" w:hAnsi="Times New Roman" w:cs="Times New Roman"/>
+        </w:rPr>
+        <w:t>Uygulama tarafında bu akış registerSchema ve loginSchema ile e-posta, parola, ad, rol ve satıcı bilgileri doğrulanır; parola bcrypt ile özetlenir ve başarılı girişte JWT üretilir. Bu karar, frontend ekranı ile backend iş kuralı arasında doğrudan bağ kurar. Böylece arayüzde görülen eylem yalnızca görsel bir düğme olmaktan çıkar; veritabanı kaydı, doğrulama, yetki kontrolü ve kullanıcıya dönen sonuçla birlikte tamamlanan bir işlem haline gelir.</w:t>
+      </w:r>
+    </w:p>
+    <w:p>
+      <w:pPr>
+        <w:pStyle w:val="TezBody"/>
+      </w:pPr>
+      <w:r>
+        <w:rPr>
+          <w:rFonts w:ascii="Times New Roman" w:hAnsi="Times New Roman" w:cs="Times New Roman"/>
+        </w:rPr>
+        <w:t>Senaryonun kullanıcıya katkısı kullanıcının favori, sepet, mesaj, AI geçmişi ve sipariş gibi kişisel verilerinin tek hesaba bağlanabilmesi olarak özetlenebilir. Kabul ölçütü ise eksik e-posta, zayıf parola veya hatalı kullanıcı bilgisi veritabanına yazılmadan reddedilir. Bu ölçüt sağlanmadığında senaryo tamamlanmış kabul edilmez; çünkü bitirme projesinde yalnızca mutlu yolun çalışması değil, hatalı veya eksik girişlerin de kontrollü yönetilmesi beklenir.</w:t>
+      </w:r>
+    </w:p>
+    <w:p>
+      <w:pPr>
+        <w:pStyle w:val="TezBody"/>
+      </w:pPr>
+      <w:r>
+        <w:rPr>
+          <w:rFonts w:ascii="Times New Roman" w:hAnsi="Times New Roman" w:cs="Times New Roman"/>
+        </w:rPr>
+        <w:t>Bu değerlendirme, proje kapsamının yalnızca ekran tasarımından ibaret olmadığını göstermektedir. Her senaryo, kullanıcı arayüzü, API katmanı, veri modeli ve hata yönetimi arasında tutarlı bir ilişki kurulup kurulmadığını sınar. Bu nedenle senaryo tabanlı yaklaşım, hem geliştirme sürecinde kontrol listesi hem de tez kapsamında yöntemsel açıklama aracı olarak kullanılmıştır.</w:t>
+      </w:r>
+    </w:p>
+    <w:p>
+      <w:pPr>
+        <w:pStyle w:val="TezHeading"/>
+      </w:pPr>
+      <w:r>
+        <w:rPr>
+          <w:rFonts w:ascii="Times New Roman" w:hAnsi="Times New Roman" w:cs="Times New Roman"/>
+          <w:b/>
+          <w:sz w:val="24"/>
+        </w:rPr>
+        <w:t>2.9.2. Rol Tabanlı Menü ve Yetki Senaryosu</w:t>
+      </w:r>
+    </w:p>
+    <w:p>
+      <w:pPr>
+        <w:pStyle w:val="TezBody"/>
+      </w:pPr>
+      <w:r>
+        <w:rPr>
+          <w:rFonts w:ascii="Times New Roman" w:hAnsi="Times New Roman" w:cs="Times New Roman"/>
+        </w:rPr>
+        <w:t>Bu senaryo, kullanıcının kendi rolüne uygun işlemleri görmesi amacıyla değerlendirilmiştir. PrintForge'un hedef kitlesi teknik modelleme bilgisi sınırlı kullanıcılar ve ürün yayınlamak isteyen satıcılar olduğu için her akışın açık, izlenebilir ve hata durumunda anlaşılır olması gerekir. Senaryonun tasarım değeri, kullanıcının tek bir ekranda ne yapacağını anlaması ve işlemin sonucunu sistem içinde takip edebilmesidir.</w:t>
+      </w:r>
+    </w:p>
+    <w:p>
+      <w:pPr>
+        <w:pStyle w:val="TezBody"/>
+      </w:pPr>
+      <w:r>
+        <w:rPr>
+          <w:rFonts w:ascii="Times New Roman" w:hAnsi="Times New Roman" w:cs="Times New Roman"/>
+        </w:rPr>
+        <w:t>Uygulama tarafında bu akış Navbar ve korunan sayfalar USER, SELLER ve ADMIN rollerine göre farklı bağlantılar ve eylemler gösterir. Bu karar, frontend ekranı ile backend iş kuralı arasında doğrudan bağ kurar. Böylece arayüzde görülen eylem yalnızca görsel bir düğme olmaktan çıkar; veritabanı kaydı, doğrulama, yetki kontrolü ve kullanıcıya dönen sonuçla birlikte tamamlanan bir işlem haline gelir.</w:t>
+      </w:r>
+    </w:p>
+    <w:p>
+      <w:pPr>
+        <w:pStyle w:val="TezBody"/>
+      </w:pPr>
+      <w:r>
+        <w:rPr>
+          <w:rFonts w:ascii="Times New Roman" w:hAnsi="Times New Roman" w:cs="Times New Roman"/>
+        </w:rPr>
+        <w:t>Senaryonun kullanıcıya katkısı satıcı paneli, admin örnek yönetimi ve kullanıcı katalog akışlarının birbirine karışmaması olarak özetlenebilir. Kabul ölçütü ise yetkisiz kullanıcı ürün ekleme veya admin örneği düzenleme sayfalarına yönlendirildiğinde erişim sınırı uygulanır. Bu ölçüt sağlanmadığında senaryo tamamlanmış kabul edilmez; çünkü bitirme projesinde yalnızca mutlu yolun çalışması değil, hatalı veya eksik girişlerin de kontrollü yönetilmesi beklenir.</w:t>
+      </w:r>
+    </w:p>
+    <w:p>
+      <w:pPr>
+        <w:pStyle w:val="TezBody"/>
+      </w:pPr>
+      <w:r>
+        <w:rPr>
+          <w:rFonts w:ascii="Times New Roman" w:hAnsi="Times New Roman" w:cs="Times New Roman"/>
+        </w:rPr>
+        <w:t>Bu değerlendirme, proje kapsamının yalnızca ekran tasarımından ibaret olmadığını göstermektedir. Her senaryo, kullanıcı arayüzü, API katmanı, veri modeli ve hata yönetimi arasında tutarlı bir ilişki kurulup kurulmadığını sınar. Bu nedenle senaryo tabanlı yaklaşım, hem geliştirme sürecinde kontrol listesi hem de tez kapsamında yöntemsel açıklama aracı olarak kullanılmıştır.</w:t>
+      </w:r>
+    </w:p>
+    <w:p>
+      <w:pPr>
+        <w:pStyle w:val="TezHeading"/>
+      </w:pPr>
+      <w:r>
+        <w:rPr>
+          <w:rFonts w:ascii="Times New Roman" w:hAnsi="Times New Roman" w:cs="Times New Roman"/>
+          <w:b/>
+          <w:sz w:val="24"/>
+        </w:rPr>
+        <w:t>2.9.3. Ana Sayfadan Üretim veya Katalog Akışına Geçiş</w:t>
+      </w:r>
+    </w:p>
+    <w:p>
+      <w:pPr>
+        <w:pStyle w:val="TezBody"/>
+      </w:pPr>
+      <w:r>
+        <w:rPr>
+          <w:rFonts w:ascii="Times New Roman" w:hAnsi="Times New Roman" w:cs="Times New Roman"/>
+        </w:rPr>
+        <w:t>Bu senaryo, ziyaretçinin platformun temel değerini ilk ekranda anlaması amacıyla değerlendirilmiştir. PrintForge'un hedef kitlesi teknik modelleme bilgisi sınırlı kullanıcılar ve ürün yayınlamak isteyen satıcılar olduğu için her akışın açık, izlenebilir ve hata durumunda anlaşılır olması gerekir. Senaryonun tasarım değeri, kullanıcının tek bir ekranda ne yapacağını anlaması ve işlemin sonucunu sistem içinde takip edebilmesidir.</w:t>
+      </w:r>
+    </w:p>
+    <w:p>
+      <w:pPr>
+        <w:pStyle w:val="TezBody"/>
+      </w:pPr>
+      <w:r>
+        <w:rPr>
+          <w:rFonts w:ascii="Times New Roman" w:hAnsi="Times New Roman" w:cs="Times New Roman"/>
+        </w:rPr>
+        <w:t>Uygulama tarafında bu akış ana sayfada katalog inceleme ve AI ile model oluşturma çağrıları birlikte sunulur; ürün önizleme alanı katalog mantığını görsel olarak açıklar. Bu karar, frontend ekranı ile backend iş kuralı arasında doğrudan bağ kurar. Böylece arayüzde görülen eylem yalnızca görsel bir düğme olmaktan çıkar; veritabanı kaydı, doğrulama, yetki kontrolü ve kullanıcıya dönen sonuçla birlikte tamamlanan bir işlem haline gelir.</w:t>
+      </w:r>
+    </w:p>
+    <w:p>
+      <w:pPr>
+        <w:pStyle w:val="TezBody"/>
+      </w:pPr>
+      <w:r>
+        <w:rPr>
+          <w:rFonts w:ascii="Times New Roman" w:hAnsi="Times New Roman" w:cs="Times New Roman"/>
+        </w:rPr>
+        <w:t>Senaryonun kullanıcıya katkısı kullanıcının tek sistem içinde hem hazır ürün hem de özel üretim fikrine yönelebilmesi olarak özetlenebilir. Kabul ölçütü ise ana sayfa, sistemin yalnızca tanıtım sayfası değil, iş akışına başlangıç noktası olduğunu doğrular. Bu ölçüt sağlanmadığında senaryo tamamlanmış kabul edilmez; çünkü bitirme projesinde yalnızca mutlu yolun çalışması değil, hatalı veya eksik girişlerin de kontrollü yönetilmesi beklenir.</w:t>
+      </w:r>
+    </w:p>
+    <w:p>
+      <w:pPr>
+        <w:pStyle w:val="TezBody"/>
+      </w:pPr>
+      <w:r>
+        <w:rPr>
+          <w:rFonts w:ascii="Times New Roman" w:hAnsi="Times New Roman" w:cs="Times New Roman"/>
+        </w:rPr>
+        <w:t>Bu değerlendirme, proje kapsamının yalnızca ekran tasarımından ibaret olmadığını göstermektedir. Her senaryo, kullanıcı arayüzü, API katmanı, veri modeli ve hata yönetimi arasında tutarlı bir ilişki kurulup kurulmadığını sınar. Bu nedenle senaryo tabanlı yaklaşım, hem geliştirme sürecinde kontrol listesi hem de tez kapsamında yöntemsel açıklama aracı olarak kullanılmıştır.</w:t>
+      </w:r>
+    </w:p>
+    <w:p>
+      <w:pPr>
+        <w:pStyle w:val="TezHeading"/>
+      </w:pPr>
+      <w:r>
+        <w:rPr>
+          <w:rFonts w:ascii="Times New Roman" w:hAnsi="Times New Roman" w:cs="Times New Roman"/>
+          <w:b/>
+          <w:sz w:val="24"/>
+        </w:rPr>
+        <w:t>2.9.4. Katalog Filtreleme ve Boş Durum Senaryosu</w:t>
+      </w:r>
+    </w:p>
+    <w:p>
+      <w:pPr>
+        <w:pStyle w:val="TezBody"/>
+      </w:pPr>
+      <w:r>
+        <w:rPr>
+          <w:rFonts w:ascii="Times New Roman" w:hAnsi="Times New Roman" w:cs="Times New Roman"/>
+        </w:rPr>
+        <w:t>Bu senaryo, katalog ürünlerinin aranabilir ve anlaşılır biçimde sunulması amacıyla değerlendirilmiştir. PrintForge'un hedef kitlesi teknik modelleme bilgisi sınırlı kullanıcılar ve ürün yayınlamak isteyen satıcılar olduğu için her akışın açık, izlenebilir ve hata durumunda anlaşılır olması gerekir. Senaryonun tasarım değeri, kullanıcının tek bir ekranda ne yapacağını anlaması ve işlemin sonucunu sistem içinde takip edebilmesidir.</w:t>
+      </w:r>
+    </w:p>
+    <w:p>
+      <w:pPr>
+        <w:pStyle w:val="TezBody"/>
+      </w:pPr>
+      <w:r>
+        <w:rPr>
+          <w:rFonts w:ascii="Times New Roman" w:hAnsi="Times New Roman" w:cs="Times New Roman"/>
+        </w:rPr>
+        <w:t>Uygulama tarafında bu akış ürün adı, açıklama, satıcı adı, kategori ve maksimum fiyat filtresi aynı katalog ekranında işlenir. Bu karar, frontend ekranı ile backend iş kuralı arasında doğrudan bağ kurar. Böylece arayüzde görülen eylem yalnızca görsel bir düğme olmaktan çıkar; veritabanı kaydı, doğrulama, yetki kontrolü ve kullanıcıya dönen sonuçla birlikte tamamlanan bir işlem haline gelir.</w:t>
+      </w:r>
+    </w:p>
+    <w:p>
+      <w:pPr>
+        <w:pStyle w:val="TezBody"/>
+      </w:pPr>
+      <w:r>
+        <w:rPr>
+          <w:rFonts w:ascii="Times New Roman" w:hAnsi="Times New Roman" w:cs="Times New Roman"/>
+        </w:rPr>
+        <w:t>Senaryonun kullanıcıya katkısı çok sayıda ürün olduğunda kullanıcının fiyat ve kategoriye göre daha hızlı karar verebilmesi olarak özetlenebilir. Kabul ölçütü ise katalog boş olduğunda kullanıcı pasif bırakılmaz; satıcı katılımı veya AI üretim yönlendirmesi gösterilir. Bu ölçüt sağlanmadığında senaryo tamamlanmış kabul edilmez; çünkü bitirme projesinde yalnızca mutlu yolun çalışması değil, hatalı veya eksik girişlerin de kontrollü yönetilmesi beklenir.</w:t>
+      </w:r>
+    </w:p>
+    <w:p>
+      <w:pPr>
+        <w:pStyle w:val="TezBody"/>
+      </w:pPr>
+      <w:r>
+        <w:rPr>
+          <w:rFonts w:ascii="Times New Roman" w:hAnsi="Times New Roman" w:cs="Times New Roman"/>
+        </w:rPr>
+        <w:t>Bu değerlendirme, proje kapsamının yalnızca ekran tasarımından ibaret olmadığını göstermektedir. Her senaryo, kullanıcı arayüzü, API katmanı, veri modeli ve hata yönetimi arasında tutarlı bir ilişki kurulup kurulmadığını sınar. Bu nedenle senaryo tabanlı yaklaşım, hem geliştirme sürecinde kontrol listesi hem de tez kapsamında yöntemsel açıklama aracı olarak kullanılmıştır.</w:t>
+      </w:r>
+    </w:p>
+    <w:p>
+      <w:pPr>
+        <w:pStyle w:val="TezHeading"/>
+      </w:pPr>
+      <w:r>
+        <w:rPr>
+          <w:rFonts w:ascii="Times New Roman" w:hAnsi="Times New Roman" w:cs="Times New Roman"/>
+          <w:b/>
+          <w:sz w:val="24"/>
+        </w:rPr>
+        <w:t>2.9.5. Örnek Görsel Arama ve AI Sayfasına Aktarım</w:t>
+      </w:r>
+    </w:p>
+    <w:p>
+      <w:pPr>
+        <w:pStyle w:val="TezBody"/>
+      </w:pPr>
+      <w:r>
+        <w:rPr>
+          <w:rFonts w:ascii="Times New Roman" w:hAnsi="Times New Roman" w:cs="Times New Roman"/>
+        </w:rPr>
+        <w:t>Bu senaryo, modelleme bilgisi olmayan kullanıcının üretim fikri bulması amacıyla değerlendirilmiştir. PrintForge'un hedef kitlesi teknik modelleme bilgisi sınırlı kullanıcılar ve ürün yayınlamak isteyen satıcılar olduğu için her akışın açık, izlenebilir ve hata durumunda anlaşılır olması gerekir. Senaryonun tasarım değeri, kullanıcının tek bir ekranda ne yapacağını anlaması ve işlemin sonucunu sistem içinde takip edebilmesidir.</w:t>
+      </w:r>
+    </w:p>
+    <w:p>
+      <w:pPr>
+        <w:pStyle w:val="TezBody"/>
+      </w:pPr>
+      <w:r>
+        <w:rPr>
+          <w:rFonts w:ascii="Times New Roman" w:hAnsi="Times New Roman" w:cs="Times New Roman"/>
+        </w:rPr>
+        <w:t>Uygulama tarafında bu akış admin örnekleri ve internet görsel arama sonuçları aynı sayfada gösterilir; seçilen görselin başlığı, kaynağı ve prompt bağlamı AI üretim ekranına taşınır. Bu karar, frontend ekranı ile backend iş kuralı arasında doğrudan bağ kurar. Böylece arayüzde görülen eylem yalnızca görsel bir düğme olmaktan çıkar; veritabanı kaydı, doğrulama, yetki kontrolü ve kullanıcıya dönen sonuçla birlikte tamamlanan bir işlem haline gelir.</w:t>
+      </w:r>
+    </w:p>
+    <w:p>
+      <w:pPr>
+        <w:pStyle w:val="TezBody"/>
+      </w:pPr>
+      <w:r>
+        <w:rPr>
+          <w:rFonts w:ascii="Times New Roman" w:hAnsi="Times New Roman" w:cs="Times New Roman"/>
+        </w:rPr>
+        <w:t>Senaryonun kullanıcıya katkısı kullanıcının boş bir prompt alanıyla başlamaması ve referans görsel üzerinden üretim niyetini somutlaştırması olarak özetlenebilir. Kabul ölçütü ise görsel arama servisi çalışmasa bile admin örnekleriyle demo ve temel kullanım akışı sürdürülebilir. Bu ölçüt sağlanmadığında senaryo tamamlanmış kabul edilmez; çünkü bitirme projesinde yalnızca mutlu yolun çalışması değil, hatalı veya eksik girişlerin de kontrollü yönetilmesi beklenir.</w:t>
+      </w:r>
+    </w:p>
+    <w:p>
+      <w:pPr>
+        <w:pStyle w:val="TezBody"/>
+      </w:pPr>
+      <w:r>
+        <w:rPr>
+          <w:rFonts w:ascii="Times New Roman" w:hAnsi="Times New Roman" w:cs="Times New Roman"/>
+        </w:rPr>
+        <w:t>Bu değerlendirme, proje kapsamının yalnızca ekran tasarımından ibaret olmadığını göstermektedir. Her senaryo, kullanıcı arayüzü, API katmanı, veri modeli ve hata yönetimi arasında tutarlı bir ilişki kurulup kurulmadığını sınar. Bu nedenle senaryo tabanlı yaklaşım, hem geliştirme sürecinde kontrol listesi hem de tez kapsamında yöntemsel açıklama aracı olarak kullanılmıştır.</w:t>
+      </w:r>
+    </w:p>
+    <w:p>
+      <w:pPr>
+        <w:pStyle w:val="TezHeading"/>
+      </w:pPr>
+      <w:r>
+        <w:rPr>
+          <w:rFonts w:ascii="Times New Roman" w:hAnsi="Times New Roman" w:cs="Times New Roman"/>
+          <w:b/>
+          <w:sz w:val="24"/>
+        </w:rPr>
+        <w:t>2.9.6. AI Model Üretim Görevi Senaryosu</w:t>
+      </w:r>
+    </w:p>
+    <w:p>
+      <w:pPr>
+        <w:pStyle w:val="TezBody"/>
+      </w:pPr>
+      <w:r>
+        <w:rPr>
+          <w:rFonts w:ascii="Times New Roman" w:hAnsi="Times New Roman" w:cs="Times New Roman"/>
+        </w:rPr>
+        <w:t>Bu senaryo, referans görselden 3D model üretim sürecinin başlatılması amacıyla değerlendirilmiştir. PrintForge'un hedef kitlesi teknik modelleme bilgisi sınırlı kullanıcılar ve ürün yayınlamak isteyen satıcılar olduğu için her akışın açık, izlenebilir ve hata durumunda anlaşılır olması gerekir. Senaryonun tasarım değeri, kullanıcının tek bir ekranda ne yapacağını anlaması ve işlemin sonucunu sistem içinde takip edebilmesidir.</w:t>
+      </w:r>
+    </w:p>
+    <w:p>
+      <w:pPr>
+        <w:pStyle w:val="TezBody"/>
+      </w:pPr>
+      <w:r>
+        <w:rPr>
+          <w:rFonts w:ascii="Times New Roman" w:hAnsi="Times New Roman" w:cs="Times New Roman"/>
+        </w:rPr>
+        <w:t>Uygulama tarafında bu akış görsel dosyası, model açıklaması ve üretim türü backend tarafından doğrulanır; harici AI servisine görev tabanlı istek gönderilir. Bu karar, frontend ekranı ile backend iş kuralı arasında doğrudan bağ kurar. Böylece arayüzde görülen eylem yalnızca görsel bir düğme olmaktan çıkar; veritabanı kaydı, doğrulama, yetki kontrolü ve kullanıcıya dönen sonuçla birlikte tamamlanan bir işlem haline gelir.</w:t>
+      </w:r>
+    </w:p>
+    <w:p>
+      <w:pPr>
+        <w:pStyle w:val="TezBody"/>
+      </w:pPr>
+      <w:r>
+        <w:rPr>
+          <w:rFonts w:ascii="Times New Roman" w:hAnsi="Times New Roman" w:cs="Times New Roman"/>
+        </w:rPr>
+        <w:t>Senaryonun kullanıcıya katkısı uzun süren üretimlerin tek ekranda donmuş gibi görünmemesi ve görev durumunun izlenebilir olması olarak özetlenebilir. Kabul ölçütü ise dosya tipi, eksik prompt veya servis anahtarı hatası kullanıcıya anlaşılır biçimde bildirilir. Bu ölçüt sağlanmadığında senaryo tamamlanmış kabul edilmez; çünkü bitirme projesinde yalnızca mutlu yolun çalışması değil, hatalı veya eksik girişlerin de kontrollü yönetilmesi beklenir.</w:t>
+      </w:r>
+    </w:p>
+    <w:p>
+      <w:pPr>
+        <w:pStyle w:val="TezBody"/>
+      </w:pPr>
+      <w:r>
+        <w:rPr>
+          <w:rFonts w:ascii="Times New Roman" w:hAnsi="Times New Roman" w:cs="Times New Roman"/>
+        </w:rPr>
+        <w:t>Bu değerlendirme, proje kapsamının yalnızca ekran tasarımından ibaret olmadığını göstermektedir. Her senaryo, kullanıcı arayüzü, API katmanı, veri modeli ve hata yönetimi arasında tutarlı bir ilişki kurulup kurulmadığını sınar. Bu nedenle senaryo tabanlı yaklaşım, hem geliştirme sürecinde kontrol listesi hem de tez kapsamında yöntemsel açıklama aracı olarak kullanılmıştır.</w:t>
+      </w:r>
+    </w:p>
+    <w:p>
+      <w:pPr>
+        <w:pStyle w:val="TezHeading"/>
+      </w:pPr>
+      <w:r>
+        <w:rPr>
+          <w:rFonts w:ascii="Times New Roman" w:hAnsi="Times New Roman" w:cs="Times New Roman"/>
+          <w:b/>
+          <w:sz w:val="24"/>
+        </w:rPr>
+        <w:t>2.9.7. Model Geçmişi ve 3D Önizleme Senaryosu</w:t>
+      </w:r>
+    </w:p>
+    <w:p>
+      <w:pPr>
+        <w:pStyle w:val="TezBody"/>
+      </w:pPr>
+      <w:r>
+        <w:rPr>
+          <w:rFonts w:ascii="Times New Roman" w:hAnsi="Times New Roman" w:cs="Times New Roman"/>
+        </w:rPr>
+        <w:t>Bu senaryo, tamamlanan AI üretimlerinin tekrar incelenebilmesi amacıyla değerlendirilmiştir. PrintForge'un hedef kitlesi teknik modelleme bilgisi sınırlı kullanıcılar ve ürün yayınlamak isteyen satıcılar olduğu için her akışın açık, izlenebilir ve hata durumunda anlaşılır olması gerekir. Senaryonun tasarım değeri, kullanıcının tek bir ekranda ne yapacağını anlaması ve işlemin sonucunu sistem içinde takip edebilmesidir.</w:t>
+      </w:r>
+    </w:p>
+    <w:p>
+      <w:pPr>
+        <w:pStyle w:val="TezBody"/>
+      </w:pPr>
+      <w:r>
+        <w:rPr>
+          <w:rFonts w:ascii="Times New Roman" w:hAnsi="Times New Roman" w:cs="Times New Roman"/>
+        </w:rPr>
+        <w:t>Uygulama tarafında bu akış Model kayıtları kullanıcı kimliği ve model türüyle ilişkilendirilir; GLB çıktıları Three.js tabanlı önizleme bileşeniyle görüntülenir. Bu karar, frontend ekranı ile backend iş kuralı arasında doğrudan bağ kurar. Böylece arayüzde görülen eylem yalnızca görsel bir düğme olmaktan çıkar; veritabanı kaydı, doğrulama, yetki kontrolü ve kullanıcıya dönen sonuçla birlikte tamamlanan bir işlem haline gelir.</w:t>
+      </w:r>
+    </w:p>
+    <w:p>
+      <w:pPr>
+        <w:pStyle w:val="TezBody"/>
+      </w:pPr>
+      <w:r>
+        <w:rPr>
+          <w:rFonts w:ascii="Times New Roman" w:hAnsi="Times New Roman" w:cs="Times New Roman"/>
+        </w:rPr>
+        <w:t>Senaryonun kullanıcıya katkısı kullanıcının model dosyasını indirmeden önce görsel kontrol yapabilmesi olarak özetlenebilir. Kabul ölçütü ise yetkisiz dosya erişiminde model sahibinin veya ilgili konuşma tarafının doğrulanması gerekir. Bu ölçüt sağlanmadığında senaryo tamamlanmış kabul edilmez; çünkü bitirme projesinde yalnızca mutlu yolun çalışması değil, hatalı veya eksik girişlerin de kontrollü yönetilmesi beklenir.</w:t>
+      </w:r>
+    </w:p>
+    <w:p>
+      <w:pPr>
+        <w:pStyle w:val="TezBody"/>
+      </w:pPr>
+      <w:r>
+        <w:rPr>
+          <w:rFonts w:ascii="Times New Roman" w:hAnsi="Times New Roman" w:cs="Times New Roman"/>
+        </w:rPr>
+        <w:t>Bu değerlendirme, proje kapsamının yalnızca ekran tasarımından ibaret olmadığını göstermektedir. Her senaryo, kullanıcı arayüzü, API katmanı, veri modeli ve hata yönetimi arasında tutarlı bir ilişki kurulup kurulmadığını sınar. Bu nedenle senaryo tabanlı yaklaşım, hem geliştirme sürecinde kontrol listesi hem de tez kapsamında yöntemsel açıklama aracı olarak kullanılmıştır.</w:t>
+      </w:r>
+    </w:p>
+    <w:p>
+      <w:pPr>
+        <w:pStyle w:val="TezHeading"/>
+      </w:pPr>
+      <w:r>
+        <w:rPr>
+          <w:rFonts w:ascii="Times New Roman" w:hAnsi="Times New Roman" w:cs="Times New Roman"/>
+          <w:b/>
+          <w:sz w:val="24"/>
+        </w:rPr>
+        <w:t>2.9.8. Satıcı Ürün Ekleme Senaryosu</w:t>
+      </w:r>
+    </w:p>
+    <w:p>
+      <w:pPr>
+        <w:pStyle w:val="TezBody"/>
+      </w:pPr>
+      <w:r>
+        <w:rPr>
+          <w:rFonts w:ascii="Times New Roman" w:hAnsi="Times New Roman" w:cs="Times New Roman"/>
+        </w:rPr>
+        <w:t>Bu senaryo, satıcının ürününü teknik destek almadan katalogda yayınlaması amacıyla değerlendirilmiştir. PrintForge'un hedef kitlesi teknik modelleme bilgisi sınırlı kullanıcılar ve ürün yayınlamak isteyen satıcılar olduğu için her akışın açık, izlenebilir ve hata durumunda anlaşılır olması gerekir. Senaryonun tasarım değeri, kullanıcının tek bir ekranda ne yapacağını anlaması ve işlemin sonucunu sistem içinde takip edebilmesidir.</w:t>
+      </w:r>
+    </w:p>
+    <w:p>
+      <w:pPr>
+        <w:pStyle w:val="TezBody"/>
+      </w:pPr>
+      <w:r>
+        <w:rPr>
+          <w:rFonts w:ascii="Times New Roman" w:hAnsi="Times New Roman" w:cs="Times New Roman"/>
+        </w:rPr>
+        <w:t>Uygulama tarafında bu akış ürün adı, açıklama, kategori, fiyat ve en fazla beş görsel alanı doğrulanır; ürün CATALOG türünde Model kaydı olarak saklanır. Bu karar, frontend ekranı ile backend iş kuralı arasında doğrudan bağ kurar. Böylece arayüzde görülen eylem yalnızca görsel bir düğme olmaktan çıkar; veritabanı kaydı, doğrulama, yetki kontrolü ve kullanıcıya dönen sonuçla birlikte tamamlanan bir işlem haline gelir.</w:t>
+      </w:r>
+    </w:p>
+    <w:p>
+      <w:pPr>
+        <w:pStyle w:val="TezBody"/>
+      </w:pPr>
+      <w:r>
+        <w:rPr>
+          <w:rFonts w:ascii="Times New Roman" w:hAnsi="Times New Roman" w:cs="Times New Roman"/>
+        </w:rPr>
+        <w:t>Senaryonun kullanıcıya katkısı satıcının ürününü tek fiyat modeliyle yayınlayarak kullanıcıya net başlangıç bilgisi vermesi olarak özetlenebilir. Kabul ölçütü ise satıcı olmayan kullanıcıların ürün yayınlama akışına erişmesi engellenir. Bu ölçüt sağlanmadığında senaryo tamamlanmış kabul edilmez; çünkü bitirme projesinde yalnızca mutlu yolun çalışması değil, hatalı veya eksik girişlerin de kontrollü yönetilmesi beklenir.</w:t>
+      </w:r>
+    </w:p>
+    <w:p>
+      <w:pPr>
+        <w:pStyle w:val="TezBody"/>
+      </w:pPr>
+      <w:r>
+        <w:rPr>
+          <w:rFonts w:ascii="Times New Roman" w:hAnsi="Times New Roman" w:cs="Times New Roman"/>
+        </w:rPr>
+        <w:t>Bu değerlendirme, proje kapsamının yalnızca ekran tasarımından ibaret olmadığını göstermektedir. Her senaryo, kullanıcı arayüzü, API katmanı, veri modeli ve hata yönetimi arasında tutarlı bir ilişki kurulup kurulmadığını sınar. Bu nedenle senaryo tabanlı yaklaşım, hem geliştirme sürecinde kontrol listesi hem de tez kapsamında yöntemsel açıklama aracı olarak kullanılmıştır.</w:t>
+      </w:r>
+    </w:p>
+    <w:p>
+      <w:pPr>
+        <w:pStyle w:val="TezHeading"/>
+      </w:pPr>
+      <w:r>
+        <w:rPr>
+          <w:rFonts w:ascii="Times New Roman" w:hAnsi="Times New Roman" w:cs="Times New Roman"/>
+          <w:b/>
+          <w:sz w:val="24"/>
+        </w:rPr>
+        <w:t>2.9.9. Ürün Detayı, Yorum ve Soru-Cevap Senaryosu</w:t>
+      </w:r>
+    </w:p>
+    <w:p>
+      <w:pPr>
+        <w:pStyle w:val="TezBody"/>
+      </w:pPr>
+      <w:r>
+        <w:rPr>
+          <w:rFonts w:ascii="Times New Roman" w:hAnsi="Times New Roman" w:cs="Times New Roman"/>
+        </w:rPr>
+        <w:t>Bu senaryo, kullanıcının katalog ürününe ilişkin güven oluşturması amacıyla değerlendirilmiştir. PrintForge'un hedef kitlesi teknik modelleme bilgisi sınırlı kullanıcılar ve ürün yayınlamak isteyen satıcılar olduğu için her akışın açık, izlenebilir ve hata durumunda anlaşılır olması gerekir. Senaryonun tasarım değeri, kullanıcının tek bir ekranda ne yapacağını anlaması ve işlemin sonucunu sistem içinde takip edebilmesidir.</w:t>
+      </w:r>
+    </w:p>
+    <w:p>
+      <w:pPr>
+        <w:pStyle w:val="TezBody"/>
+      </w:pPr>
+      <w:r>
+        <w:rPr>
+          <w:rFonts w:ascii="Times New Roman" w:hAnsi="Times New Roman" w:cs="Times New Roman"/>
+        </w:rPr>
+        <w:t>Uygulama tarafında bu akış ProductReview ve ProductQuestion varlıkları ürünle ilişkilendirilir; cevap yazma yetkisi ürün satıcısıyla sınırlandırılır. Bu karar, frontend ekranı ile backend iş kuralı arasında doğrudan bağ kurar. Böylece arayüzde görülen eylem yalnızca görsel bir düğme olmaktan çıkar; veritabanı kaydı, doğrulama, yetki kontrolü ve kullanıcıya dönen sonuçla birlikte tamamlanan bir işlem haline gelir.</w:t>
+      </w:r>
+    </w:p>
+    <w:p>
+      <w:pPr>
+        <w:pStyle w:val="TezBody"/>
+      </w:pPr>
+      <w:r>
+        <w:rPr>
+          <w:rFonts w:ascii="Times New Roman" w:hAnsi="Times New Roman" w:cs="Times New Roman"/>
+        </w:rPr>
+        <w:t>Senaryonun kullanıcıya katkısı ürün bilgisinin yalnızca satıcının tek taraflı açıklamasından ibaret kalmaması olarak özetlenebilir. Kabul ölçütü ise aynı kullanıcının aynı ürüne tekrarlı bağımsız puan vermesi sınırlandırılarak yorum güvenilirliği artırılır. Bu ölçüt sağlanmadığında senaryo tamamlanmış kabul edilmez; çünkü bitirme projesinde yalnızca mutlu yolun çalışması değil, hatalı veya eksik girişlerin de kontrollü yönetilmesi beklenir.</w:t>
+      </w:r>
+    </w:p>
+    <w:p>
+      <w:pPr>
+        <w:pStyle w:val="TezBody"/>
+      </w:pPr>
+      <w:r>
+        <w:rPr>
+          <w:rFonts w:ascii="Times New Roman" w:hAnsi="Times New Roman" w:cs="Times New Roman"/>
+        </w:rPr>
+        <w:t>Bu değerlendirme, proje kapsamının yalnızca ekran tasarımından ibaret olmadığını göstermektedir. Her senaryo, kullanıcı arayüzü, API katmanı, veri modeli ve hata yönetimi arasında tutarlı bir ilişki kurulup kurulmadığını sınar. Bu nedenle senaryo tabanlı yaklaşım, hem geliştirme sürecinde kontrol listesi hem de tez kapsamında yöntemsel açıklama aracı olarak kullanılmıştır.</w:t>
+      </w:r>
+    </w:p>
+    <w:p>
+      <w:pPr>
+        <w:pStyle w:val="TezHeading"/>
+      </w:pPr>
+      <w:r>
+        <w:rPr>
+          <w:rFonts w:ascii="Times New Roman" w:hAnsi="Times New Roman" w:cs="Times New Roman"/>
+          <w:b/>
+          <w:sz w:val="24"/>
+        </w:rPr>
+        <w:t>2.9.10. Favori ve Sepet Senaryosu</w:t>
+      </w:r>
+    </w:p>
+    <w:p>
+      <w:pPr>
+        <w:pStyle w:val="TezBody"/>
+      </w:pPr>
+      <w:r>
+        <w:rPr>
+          <w:rFonts w:ascii="Times New Roman" w:hAnsi="Times New Roman" w:cs="Times New Roman"/>
+        </w:rPr>
+        <w:t>Bu senaryo, kullanıcının karar verme sürecini zamana yayabilmesi amacıyla değerlendirilmiştir. PrintForge'un hedef kitlesi teknik modelleme bilgisi sınırlı kullanıcılar ve ürün yayınlamak isteyen satıcılar olduğu için her akışın açık, izlenebilir ve hata durumunda anlaşılır olması gerekir. Senaryonun tasarım değeri, kullanıcının tek bir ekranda ne yapacağını anlaması ve işlemin sonucunu sistem içinde takip edebilmesidir.</w:t>
+      </w:r>
+    </w:p>
+    <w:p>
+      <w:pPr>
+        <w:pStyle w:val="TezBody"/>
+      </w:pPr>
+      <w:r>
+        <w:rPr>
+          <w:rFonts w:ascii="Times New Roman" w:hAnsi="Times New Roman" w:cs="Times New Roman"/>
+        </w:rPr>
+        <w:t>Uygulama tarafında bu akış favori ve sepet yardımcı fonksiyonları istemci tarafında kalıcı kullanıcı davranışı oluşturur; katalog kartları bu durumlara göre tepki verir. Bu karar, frontend ekranı ile backend iş kuralı arasında doğrudan bağ kurar. Böylece arayüzde görülen eylem yalnızca görsel bir düğme olmaktan çıkar; veritabanı kaydı, doğrulama, yetki kontrolü ve kullanıcıya dönen sonuçla birlikte tamamlanan bir işlem haline gelir.</w:t>
+      </w:r>
+    </w:p>
+    <w:p>
+      <w:pPr>
+        <w:pStyle w:val="TezBody"/>
+      </w:pPr>
+      <w:r>
+        <w:rPr>
+          <w:rFonts w:ascii="Times New Roman" w:hAnsi="Times New Roman" w:cs="Times New Roman"/>
+        </w:rPr>
+        <w:t>Senaryonun kullanıcıya katkısı kullanıcının ilgilendiği ürünleri kaybetmeden daha sonra tekrar inceleyebilmesi olarak özetlenebilir. Kabul ölçütü ise boş favori veya boş sepet ekranları kullanıcıyı katalog akışına geri yönlendirir. Bu ölçüt sağlanmadığında senaryo tamamlanmış kabul edilmez; çünkü bitirme projesinde yalnızca mutlu yolun çalışması değil, hatalı veya eksik girişlerin de kontrollü yönetilmesi beklenir.</w:t>
+      </w:r>
+    </w:p>
+    <w:p>
+      <w:pPr>
+        <w:pStyle w:val="TezBody"/>
+      </w:pPr>
+      <w:r>
+        <w:rPr>
+          <w:rFonts w:ascii="Times New Roman" w:hAnsi="Times New Roman" w:cs="Times New Roman"/>
+        </w:rPr>
+        <w:t>Bu değerlendirme, proje kapsamının yalnızca ekran tasarımından ibaret olmadığını göstermektedir. Her senaryo, kullanıcı arayüzü, API katmanı, veri modeli ve hata yönetimi arasında tutarlı bir ilişki kurulup kurulmadığını sınar. Bu nedenle senaryo tabanlı yaklaşım, hem geliştirme sürecinde kontrol listesi hem de tez kapsamında yöntemsel açıklama aracı olarak kullanılmıştır.</w:t>
+      </w:r>
+    </w:p>
+    <w:p>
+      <w:pPr>
+        <w:pStyle w:val="TezHeading"/>
+      </w:pPr>
+      <w:r>
+        <w:rPr>
+          <w:rFonts w:ascii="Times New Roman" w:hAnsi="Times New Roman" w:cs="Times New Roman"/>
+          <w:b/>
+          <w:sz w:val="24"/>
+        </w:rPr>
+        <w:t>2.9.11. Katalog Ürününden Mesaj Başlatma Senaryosu</w:t>
+      </w:r>
+    </w:p>
+    <w:p>
+      <w:pPr>
+        <w:pStyle w:val="TezBody"/>
+      </w:pPr>
+      <w:r>
+        <w:rPr>
+          <w:rFonts w:ascii="Times New Roman" w:hAnsi="Times New Roman" w:cs="Times New Roman"/>
+        </w:rPr>
+        <w:t>Bu senaryo, alıcı ile satıcının ürün bağlamında iletişime geçmesi amacıyla değerlendirilmiştir. PrintForge'un hedef kitlesi teknik modelleme bilgisi sınırlı kullanıcılar ve ürün yayınlamak isteyen satıcılar olduğu için her akışın açık, izlenebilir ve hata durumunda anlaşılır olması gerekir. Senaryonun tasarım değeri, kullanıcının tek bir ekranda ne yapacağını anlaması ve işlemin sonucunu sistem içinde takip edebilmesidir.</w:t>
+      </w:r>
+    </w:p>
+    <w:p>
+      <w:pPr>
+        <w:pStyle w:val="TezBody"/>
+      </w:pPr>
+      <w:r>
+        <w:rPr>
+          <w:rFonts w:ascii="Times New Roman" w:hAnsi="Times New Roman" w:cs="Times New Roman"/>
+        </w:rPr>
+        <w:t>Uygulama tarafında bu akış ürün kimliği üzerinden satıcı belirlenir ve Conversation kaydı buyerId, sellerId, modelId ve modelType alanlarıyla oluşturulur. Bu karar, frontend ekranı ile backend iş kuralı arasında doğrudan bağ kurar. Böylece arayüzde görülen eylem yalnızca görsel bir düğme olmaktan çıkar; veritabanı kaydı, doğrulama, yetki kontrolü ve kullanıcıya dönen sonuçla birlikte tamamlanan bir işlem haline gelir.</w:t>
+      </w:r>
+    </w:p>
+    <w:p>
+      <w:pPr>
+        <w:pStyle w:val="TezBody"/>
+      </w:pPr>
+      <w:r>
+        <w:rPr>
+          <w:rFonts w:ascii="Times New Roman" w:hAnsi="Times New Roman" w:cs="Times New Roman"/>
+        </w:rPr>
+        <w:t>Senaryonun kullanıcıya katkısı mesajların genel sohbetten farklı olarak belirli ürün veya model bağlamında izlenebilmesi olarak özetlenebilir. Kabul ölçütü ise kullanıcının satıcıya boş ve bağlamsız mesaj göndermesi yerine ürün üzerinden konuşma açması sağlanır. Bu ölçüt sağlanmadığında senaryo tamamlanmış kabul edilmez; çünkü bitirme projesinde yalnızca mutlu yolun çalışması değil, hatalı veya eksik girişlerin de kontrollü yönetilmesi beklenir.</w:t>
+      </w:r>
+    </w:p>
+    <w:p>
+      <w:pPr>
+        <w:pStyle w:val="TezBody"/>
+      </w:pPr>
+      <w:r>
+        <w:rPr>
+          <w:rFonts w:ascii="Times New Roman" w:hAnsi="Times New Roman" w:cs="Times New Roman"/>
+        </w:rPr>
+        <w:t>Bu değerlendirme, proje kapsamının yalnızca ekran tasarımından ibaret olmadığını göstermektedir. Her senaryo, kullanıcı arayüzü, API katmanı, veri modeli ve hata yönetimi arasında tutarlı bir ilişki kurulup kurulmadığını sınar. Bu nedenle senaryo tabanlı yaklaşım, hem geliştirme sürecinde kontrol listesi hem de tez kapsamında yöntemsel açıklama aracı olarak kullanılmıştır.</w:t>
+      </w:r>
+    </w:p>
+    <w:p>
+      <w:pPr>
+        <w:pStyle w:val="TezHeading"/>
+      </w:pPr>
+      <w:r>
+        <w:rPr>
+          <w:rFonts w:ascii="Times New Roman" w:hAnsi="Times New Roman" w:cs="Times New Roman"/>
+          <w:b/>
+          <w:sz w:val="24"/>
+        </w:rPr>
+        <w:t>2.9.12. AI Modeli İçin Satıcı Seçimi Senaryosu</w:t>
+      </w:r>
+    </w:p>
+    <w:p>
+      <w:pPr>
+        <w:pStyle w:val="TezBody"/>
+      </w:pPr>
+      <w:r>
+        <w:rPr>
+          <w:rFonts w:ascii="Times New Roman" w:hAnsi="Times New Roman" w:cs="Times New Roman"/>
+        </w:rPr>
+        <w:t>Bu senaryo, özel üretim modelinin pazaryeri sürecine bağlanması amacıyla değerlendirilmiştir. PrintForge'un hedef kitlesi teknik modelleme bilgisi sınırlı kullanıcılar ve ürün yayınlamak isteyen satıcılar olduğu için her akışın açık, izlenebilir ve hata durumunda anlaşılır olması gerekir. Senaryonun tasarım değeri, kullanıcının tek bir ekranda ne yapacağını anlaması ve işlemin sonucunu sistem içinde takip edebilmesidir.</w:t>
+      </w:r>
+    </w:p>
+    <w:p>
+      <w:pPr>
+        <w:pStyle w:val="TezBody"/>
+      </w:pPr>
+      <w:r>
+        <w:rPr>
+          <w:rFonts w:ascii="Times New Roman" w:hAnsi="Times New Roman" w:cs="Times New Roman"/>
+        </w:rPr>
+        <w:t>Uygulama tarafında bu akış AI modeli tamamlandığında kullanıcı uygun satıcıya mesaj gönderebilir; konuşma hazır katalog ürününden değil özel modelden başlatılır. Bu karar, frontend ekranı ile backend iş kuralı arasında doğrudan bağ kurar. Böylece arayüzde görülen eylem yalnızca görsel bir düğme olmaktan çıkar; veritabanı kaydı, doğrulama, yetki kontrolü ve kullanıcıya dönen sonuçla birlikte tamamlanan bir işlem haline gelir.</w:t>
+      </w:r>
+    </w:p>
+    <w:p>
+      <w:pPr>
+        <w:pStyle w:val="TezBody"/>
+      </w:pPr>
+      <w:r>
+        <w:rPr>
+          <w:rFonts w:ascii="Times New Roman" w:hAnsi="Times New Roman" w:cs="Times New Roman"/>
+        </w:rPr>
+        <w:t>Senaryonun kullanıcıya katkısı AI çıktısının sadece dosya olarak kalmaması, gerçek üretim talebine dönüşebilmesi olarak özetlenebilir. Kabul ölçütü ise model dosyasına erişim konuşmanın taraflarıyla sınırlandırılarak özel üretim çıktısının korunması sağlanır. Bu ölçüt sağlanmadığında senaryo tamamlanmış kabul edilmez; çünkü bitirme projesinde yalnızca mutlu yolun çalışması değil, hatalı veya eksik girişlerin de kontrollü yönetilmesi beklenir.</w:t>
+      </w:r>
+    </w:p>
+    <w:p>
+      <w:pPr>
+        <w:pStyle w:val="TezBody"/>
+      </w:pPr>
+      <w:r>
+        <w:rPr>
+          <w:rFonts w:ascii="Times New Roman" w:hAnsi="Times New Roman" w:cs="Times New Roman"/>
+        </w:rPr>
+        <w:t>Bu değerlendirme, proje kapsamının yalnızca ekran tasarımından ibaret olmadığını göstermektedir. Her senaryo, kullanıcı arayüzü, API katmanı, veri modeli ve hata yönetimi arasında tutarlı bir ilişki kurulup kurulmadığını sınar. Bu nedenle senaryo tabanlı yaklaşım, hem geliştirme sürecinde kontrol listesi hem de tez kapsamında yöntemsel açıklama aracı olarak kullanılmıştır.</w:t>
+      </w:r>
+    </w:p>
+    <w:p>
+      <w:pPr>
+        <w:pStyle w:val="TezHeading"/>
+      </w:pPr>
+      <w:r>
+        <w:rPr>
+          <w:rFonts w:ascii="Times New Roman" w:hAnsi="Times New Roman" w:cs="Times New Roman"/>
+          <w:b/>
+          <w:sz w:val="24"/>
+        </w:rPr>
+        <w:t>2.9.13. Sipariş Durumu Takip Senaryosu</w:t>
+      </w:r>
+    </w:p>
+    <w:p>
+      <w:pPr>
+        <w:pStyle w:val="TezBody"/>
+      </w:pPr>
+      <w:r>
+        <w:rPr>
+          <w:rFonts w:ascii="Times New Roman" w:hAnsi="Times New Roman" w:cs="Times New Roman"/>
+        </w:rPr>
+        <w:t>Bu senaryo, iletişimden üretim sürecine geçen işlerin izlenmesi amacıyla değerlendirilmiştir. PrintForge'un hedef kitlesi teknik modelleme bilgisi sınırlı kullanıcılar ve ürün yayınlamak isteyen satıcılar olduğu için her akışın açık, izlenebilir ve hata durumunda anlaşılır olması gerekir. Senaryonun tasarım değeri, kullanıcının tek bir ekranda ne yapacağını anlaması ve işlemin sonucunu sistem içinde takip edebilmesidir.</w:t>
+      </w:r>
+    </w:p>
+    <w:p>
+      <w:pPr>
+        <w:pStyle w:val="TezBody"/>
+      </w:pPr>
+      <w:r>
+        <w:rPr>
+          <w:rFonts w:ascii="Times New Roman" w:hAnsi="Times New Roman" w:cs="Times New Roman"/>
+        </w:rPr>
+        <w:t>Uygulama tarafında bu akış Conversation status alanı ORDERED, PREPARING, SHIPPED, COMPLETED ve CANCELLED değerleriyle sipariş yaşam döngüsünü temsil eder. Bu karar, frontend ekranı ile backend iş kuralı arasında doğrudan bağ kurar. Böylece arayüzde görülen eylem yalnızca görsel bir düğme olmaktan çıkar; veritabanı kaydı, doğrulama, yetki kontrolü ve kullanıcıya dönen sonuçla birlikte tamamlanan bir işlem haline gelir.</w:t>
+      </w:r>
+    </w:p>
+    <w:p>
+      <w:pPr>
+        <w:pStyle w:val="TezBody"/>
+      </w:pPr>
+      <w:r>
+        <w:rPr>
+          <w:rFonts w:ascii="Times New Roman" w:hAnsi="Times New Roman" w:cs="Times New Roman"/>
+        </w:rPr>
+        <w:t>Senaryonun kullanıcıya katkısı alıcı ve satıcının mesaj metinleri arasında kaybolmadan siparişin güncel aşamasını takip etmesi olarak özetlenebilir. Kabul ölçütü ise mesajlaşma ekranı ile sipariş ekranının ayrılması iletişim ve üretim takibinin karışmasını önler. Bu ölçüt sağlanmadığında senaryo tamamlanmış kabul edilmez; çünkü bitirme projesinde yalnızca mutlu yolun çalışması değil, hatalı veya eksik girişlerin de kontrollü yönetilmesi beklenir.</w:t>
+      </w:r>
+    </w:p>
+    <w:p>
+      <w:pPr>
+        <w:pStyle w:val="TezBody"/>
+      </w:pPr>
+      <w:r>
+        <w:rPr>
+          <w:rFonts w:ascii="Times New Roman" w:hAnsi="Times New Roman" w:cs="Times New Roman"/>
+        </w:rPr>
+        <w:t>Bu değerlendirme, proje kapsamının yalnızca ekran tasarımından ibaret olmadığını göstermektedir. Her senaryo, kullanıcı arayüzü, API katmanı, veri modeli ve hata yönetimi arasında tutarlı bir ilişki kurulup kurulmadığını sınar. Bu nedenle senaryo tabanlı yaklaşım, hem geliştirme sürecinde kontrol listesi hem de tez kapsamında yöntemsel açıklama aracı olarak kullanılmıştır.</w:t>
+      </w:r>
+    </w:p>
+    <w:p>
+      <w:pPr>
+        <w:pStyle w:val="TezHeading"/>
+      </w:pPr>
+      <w:r>
+        <w:rPr>
+          <w:rFonts w:ascii="Times New Roman" w:hAnsi="Times New Roman" w:cs="Times New Roman"/>
+          <w:b/>
+          <w:sz w:val="24"/>
+        </w:rPr>
+        <w:t>2.9.14. Admin Örnek İçerik Yönetimi Senaryosu</w:t>
+      </w:r>
+    </w:p>
+    <w:p>
+      <w:pPr>
+        <w:pStyle w:val="TezBody"/>
+      </w:pPr>
+      <w:r>
+        <w:rPr>
+          <w:rFonts w:ascii="Times New Roman" w:hAnsi="Times New Roman" w:cs="Times New Roman"/>
+        </w:rPr>
+        <w:t>Bu senaryo, platformun kontrollü başlangıç içerikleriyle sürdürülebilmesi amacıyla değerlendirilmiştir. PrintForge'un hedef kitlesi teknik modelleme bilgisi sınırlı kullanıcılar ve ürün yayınlamak isteyen satıcılar olduğu için her akışın açık, izlenebilir ve hata durumunda anlaşılır olması gerekir. Senaryonun tasarım değeri, kullanıcının tek bir ekranda ne yapacağını anlaması ve işlemin sonucunu sistem içinde takip edebilmesidir.</w:t>
+      </w:r>
+    </w:p>
+    <w:p>
+      <w:pPr>
+        <w:pStyle w:val="TezBody"/>
+      </w:pPr>
+      <w:r>
+        <w:rPr>
+          <w:rFonts w:ascii="Times New Roman" w:hAnsi="Times New Roman" w:cs="Times New Roman"/>
+        </w:rPr>
+        <w:t>Uygulama tarafında bu akış ExampleItem kayıtları title, category, imageUrl, prompt ve tags alanlarıyla doğrulanır; admin yetkisi olmayan kullanıcıların bu alanı düzenlemesi engellenir. Bu karar, frontend ekranı ile backend iş kuralı arasında doğrudan bağ kurar. Böylece arayüzde görülen eylem yalnızca görsel bir düğme olmaktan çıkar; veritabanı kaydı, doğrulama, yetki kontrolü ve kullanıcıya dönen sonuçla birlikte tamamlanan bir işlem haline gelir.</w:t>
+      </w:r>
+    </w:p>
+    <w:p>
+      <w:pPr>
+        <w:pStyle w:val="TezBody"/>
+      </w:pPr>
+      <w:r>
+        <w:rPr>
+          <w:rFonts w:ascii="Times New Roman" w:hAnsi="Times New Roman" w:cs="Times New Roman"/>
+        </w:rPr>
+        <w:t>Senaryonun kullanıcıya katkısı dış görsel arama servisi çalışmadığında bile kullanıcının AI üretime başlayabilmesi olarak özetlenebilir. Kabul ölçütü ise demo ve jüri sunumu sırasında dış servis kaynaklı risklerin azaltılması. Bu ölçüt sağlanmadığında senaryo tamamlanmış kabul edilmez; çünkü bitirme projesinde yalnızca mutlu yolun çalışması değil, hatalı veya eksik girişlerin de kontrollü yönetilmesi beklenir.</w:t>
+      </w:r>
+    </w:p>
+    <w:p>
+      <w:pPr>
+        <w:pStyle w:val="TezBody"/>
+      </w:pPr>
+      <w:r>
+        <w:rPr>
+          <w:rFonts w:ascii="Times New Roman" w:hAnsi="Times New Roman" w:cs="Times New Roman"/>
+        </w:rPr>
+        <w:t>Bu değerlendirme, proje kapsamının yalnızca ekran tasarımından ibaret olmadığını göstermektedir. Her senaryo, kullanıcı arayüzü, API katmanı, veri modeli ve hata yönetimi arasında tutarlı bir ilişki kurulup kurulmadığını sınar. Bu nedenle senaryo tabanlı yaklaşım, hem geliştirme sürecinde kontrol listesi hem de tez kapsamında yöntemsel açıklama aracı olarak kullanılmıştır.</w:t>
+      </w:r>
+    </w:p>
+    <w:p>
+      <w:pPr>
+        <w:pStyle w:val="TezHeading"/>
+      </w:pPr>
+      <w:r>
+        <w:rPr>
+          <w:rFonts w:ascii="Times New Roman" w:hAnsi="Times New Roman" w:cs="Times New Roman"/>
+          <w:b/>
+          <w:sz w:val="24"/>
+        </w:rPr>
+        <w:t>2.9.15. Görsel Arama, Önbellek ve Proxy Senaryosu</w:t>
+      </w:r>
+    </w:p>
+    <w:p>
+      <w:pPr>
+        <w:pStyle w:val="TezBody"/>
+      </w:pPr>
+      <w:r>
+        <w:rPr>
+          <w:rFonts w:ascii="Times New Roman" w:hAnsi="Times New Roman" w:cs="Times New Roman"/>
+        </w:rPr>
+        <w:t>Bu senaryo, harici görsellerin güvenli ve kontrollü biçimde kullanılabilmesi amacıyla değerlendirilmiştir. PrintForge'un hedef kitlesi teknik modelleme bilgisi sınırlı kullanıcılar ve ürün yayınlamak isteyen satıcılar olduğu için her akışın açık, izlenebilir ve hata durumunda anlaşılır olması gerekir. Senaryonun tasarım değeri, kullanıcının tek bir ekranda ne yapacağını anlaması ve işlemin sonucunu sistem içinde takip edebilmesidir.</w:t>
+      </w:r>
+    </w:p>
+    <w:p>
+      <w:pPr>
+        <w:pStyle w:val="TezBody"/>
+      </w:pPr>
+      <w:r>
+        <w:rPr>
+          <w:rFonts w:ascii="Times New Roman" w:hAnsi="Times New Roman" w:cs="Times New Roman"/>
+        </w:rPr>
+        <w:t>Uygulama tarafında bu akış arama sorgusu temizlenir, sağlayıcı seçimi ortam değişkenlerine göre yapılır, sonuçlar kısa süreli cache ile tutulur ve dış görseller proxy üzerinden alınır. Bu karar, frontend ekranı ile backend iş kuralı arasında doğrudan bağ kurar. Böylece arayüzde görülen eylem yalnızca görsel bir düğme olmaktan çıkar; veritabanı kaydı, doğrulama, yetki kontrolü ve kullanıcıya dönen sonuçla birlikte tamamlanan bir işlem haline gelir.</w:t>
+      </w:r>
+    </w:p>
+    <w:p>
+      <w:pPr>
+        <w:pStyle w:val="TezBody"/>
+      </w:pPr>
+      <w:r>
+        <w:rPr>
+          <w:rFonts w:ascii="Times New Roman" w:hAnsi="Times New Roman" w:cs="Times New Roman"/>
+        </w:rPr>
+        <w:t>Senaryonun kullanıcıya katkısı API anahtarlarının istemci tarafına taşınmaması ve kota kullanımının azaltılması olarak özetlenebilir. Kabul ölçütü ise image/* olmayan içerikler üretim akışına girmeden reddedilir. Bu ölçüt sağlanmadığında senaryo tamamlanmış kabul edilmez; çünkü bitirme projesinde yalnızca mutlu yolun çalışması değil, hatalı veya eksik girişlerin de kontrollü yönetilmesi beklenir.</w:t>
+      </w:r>
+    </w:p>
+    <w:p>
+      <w:pPr>
+        <w:pStyle w:val="TezBody"/>
+      </w:pPr>
+      <w:r>
+        <w:rPr>
+          <w:rFonts w:ascii="Times New Roman" w:hAnsi="Times New Roman" w:cs="Times New Roman"/>
+        </w:rPr>
+        <w:t>Bu değerlendirme, proje kapsamının yalnızca ekran tasarımından ibaret olmadığını göstermektedir. Her senaryo, kullanıcı arayüzü, API katmanı, veri modeli ve hata yönetimi arasında tutarlı bir ilişki kurulup kurulmadığını sınar. Bu nedenle senaryo tabanlı yaklaşım, hem geliştirme sürecinde kontrol listesi hem de tez kapsamında yöntemsel açıklama aracı olarak kullanılmıştır.</w:t>
+      </w:r>
+    </w:p>
+    <w:p>
+      <w:pPr>
+        <w:pStyle w:val="TezHeading"/>
+      </w:pPr>
+      <w:r>
+        <w:rPr>
+          <w:rFonts w:ascii="Times New Roman" w:hAnsi="Times New Roman" w:cs="Times New Roman"/>
+          <w:b/>
+          <w:sz w:val="24"/>
+        </w:rPr>
+        <w:t>2.9.16. Dağıtım ve Ortam Yapılandırma Senaryosu</w:t>
+      </w:r>
+    </w:p>
+    <w:p>
+      <w:pPr>
+        <w:pStyle w:val="TezBody"/>
+      </w:pPr>
+      <w:r>
+        <w:rPr>
+          <w:rFonts w:ascii="Times New Roman" w:hAnsi="Times New Roman" w:cs="Times New Roman"/>
+        </w:rPr>
+        <w:t>Bu senaryo, uygulamanın geliştirici bilgisayarı dışında da çalıştırılabilmesi amacıyla değerlendirilmiştir. PrintForge'un hedef kitlesi teknik modelleme bilgisi sınırlı kullanıcılar ve ürün yayınlamak isteyen satıcılar olduğu için her akışın açık, izlenebilir ve hata durumunda anlaşılır olması gerekir. Senaryonun tasarım değeri, kullanıcının tek bir ekranda ne yapacağını anlaması ve işlemin sonucunu sistem içinde takip edebilmesidir.</w:t>
+      </w:r>
+    </w:p>
+    <w:p>
+      <w:pPr>
+        <w:pStyle w:val="TezBody"/>
+      </w:pPr>
+      <w:r>
+        <w:rPr>
+          <w:rFonts w:ascii="Times New Roman" w:hAnsi="Times New Roman" w:cs="Times New Roman"/>
+        </w:rPr>
+        <w:t>Uygulama tarafında bu akış frontend Netlify yapılandırmasıyla hazırlanır; backend ayrı web servisi olarak çalışır ve FRONTEND_URLS, DATABASE_URL, JWT_SECRET gibi değişkenlerle yönetilir. Bu karar, frontend ekranı ile backend iş kuralı arasında doğrudan bağ kurar. Böylece arayüzde görülen eylem yalnızca görsel bir düğme olmaktan çıkar; veritabanı kaydı, doğrulama, yetki kontrolü ve kullanıcıya dönen sonuçla birlikte tamamlanan bir işlem haline gelir.</w:t>
+      </w:r>
+    </w:p>
+    <w:p>
+      <w:pPr>
+        <w:pStyle w:val="TezBody"/>
+      </w:pPr>
+      <w:r>
+        <w:rPr>
+          <w:rFonts w:ascii="Times New Roman" w:hAnsi="Times New Roman" w:cs="Times New Roman"/>
+        </w:rPr>
+        <w:t>Senaryonun kullanıcıya katkısı yerel geliştirme ile canlı ortam arasındaki adres, CORS ve servis anahtarı farklarının açıkça ayrılması olarak özetlenebilir. Kabul ölçütü ise localhost değerlerinin canlı ortamda unutulması durumunda bağlantı hatası oluşacağı için README ve ortam dosyaları kritik kabul edilir. Bu ölçüt sağlanmadığında senaryo tamamlanmış kabul edilmez; çünkü bitirme projesinde yalnızca mutlu yolun çalışması değil, hatalı veya eksik girişlerin de kontrollü yönetilmesi beklenir.</w:t>
+      </w:r>
+    </w:p>
+    <w:p>
+      <w:pPr>
+        <w:pStyle w:val="TezBody"/>
+      </w:pPr>
+      <w:r>
+        <w:rPr>
+          <w:rFonts w:ascii="Times New Roman" w:hAnsi="Times New Roman" w:cs="Times New Roman"/>
+        </w:rPr>
+        <w:t>Bu değerlendirme, proje kapsamının yalnızca ekran tasarımından ibaret olmadığını göstermektedir. Her senaryo, kullanıcı arayüzü, API katmanı, veri modeli ve hata yönetimi arasında tutarlı bir ilişki kurulup kurulmadığını sınar. Bu nedenle senaryo tabanlı yaklaşım, hem geliştirme sürecinde kontrol listesi hem de tez kapsamında yöntemsel açıklama aracı olarak kullanılmıştır.</w:t>
+      </w:r>
+    </w:p>
+    <w:p>
+      <w:pPr>
+        <w:pStyle w:val="TezHeading"/>
+      </w:pPr>
+      <w:r>
+        <w:rPr>
+          <w:rFonts w:ascii="Times New Roman" w:hAnsi="Times New Roman" w:cs="Times New Roman"/>
+          <w:b/>
+          <w:sz w:val="24"/>
+        </w:rPr>
+        <w:t>2.9.17. Hata Mesajı ve Kullanıcı Geri Bildirimi Senaryosu</w:t>
+      </w:r>
+    </w:p>
+    <w:p>
+      <w:pPr>
+        <w:pStyle w:val="TezBody"/>
+      </w:pPr>
+      <w:r>
+        <w:rPr>
+          <w:rFonts w:ascii="Times New Roman" w:hAnsi="Times New Roman" w:cs="Times New Roman"/>
+        </w:rPr>
+        <w:t>Bu senaryo, kullanıcının başarısız işlemde ne olduğunu anlayabilmesi amacıyla değerlendirilmiştir. PrintForge'un hedef kitlesi teknik modelleme bilgisi sınırlı kullanıcılar ve ürün yayınlamak isteyen satıcılar olduğu için her akışın açık, izlenebilir ve hata durumunda anlaşılır olması gerekir. Senaryonun tasarım değeri, kullanıcının tek bir ekranda ne yapacağını anlaması ve işlemin sonucunu sistem içinde takip edebilmesidir.</w:t>
+      </w:r>
+    </w:p>
+    <w:p>
+      <w:pPr>
+        <w:pStyle w:val="TezBody"/>
+      </w:pPr>
+      <w:r>
+        <w:rPr>
+          <w:rFonts w:ascii="Times New Roman" w:hAnsi="Times New Roman" w:cs="Times New Roman"/>
+        </w:rPr>
+        <w:t>Uygulama tarafında bu akış backend hata kodları ve frontend durum mesajları eksik alan, yetkisiz erişim, servis hatası ve dosya formatı sorunlarını ayrıştırır. Bu karar, frontend ekranı ile backend iş kuralı arasında doğrudan bağ kurar. Böylece arayüzde görülen eylem yalnızca görsel bir düğme olmaktan çıkar; veritabanı kaydı, doğrulama, yetki kontrolü ve kullanıcıya dönen sonuçla birlikte tamamlanan bir işlem haline gelir.</w:t>
+      </w:r>
+    </w:p>
+    <w:p>
+      <w:pPr>
+        <w:pStyle w:val="TezBody"/>
+      </w:pPr>
+      <w:r>
+        <w:rPr>
+          <w:rFonts w:ascii="Times New Roman" w:hAnsi="Times New Roman" w:cs="Times New Roman"/>
+        </w:rPr>
+        <w:t>Senaryonun kullanıcıya katkısı kullanıcının belirsiz bekleme ekranında kalmaması ve doğru bir sonraki adıma yönelmesi olarak özetlenebilir. Kabul ölçütü ise teknik log ayrıntıları kullanıcıya gösterilmez; kullanıcıya anlaşılır özet bilgi sunulur. Bu ölçüt sağlanmadığında senaryo tamamlanmış kabul edilmez; çünkü bitirme projesinde yalnızca mutlu yolun çalışması değil, hatalı veya eksik girişlerin de kontrollü yönetilmesi beklenir.</w:t>
+      </w:r>
+    </w:p>
+    <w:p>
+      <w:pPr>
+        <w:pStyle w:val="TezBody"/>
+      </w:pPr>
+      <w:r>
+        <w:rPr>
+          <w:rFonts w:ascii="Times New Roman" w:hAnsi="Times New Roman" w:cs="Times New Roman"/>
+        </w:rPr>
+        <w:t>Bu değerlendirme, proje kapsamının yalnızca ekran tasarımından ibaret olmadığını göstermektedir. Her senaryo, kullanıcı arayüzü, API katmanı, veri modeli ve hata yönetimi arasında tutarlı bir ilişki kurulup kurulmadığını sınar. Bu nedenle senaryo tabanlı yaklaşım, hem geliştirme sürecinde kontrol listesi hem de tez kapsamında yöntemsel açıklama aracı olarak kullanılmıştır.</w:t>
+      </w:r>
+    </w:p>
+    <w:p>
+      <w:pPr>
+        <w:pStyle w:val="TezHeading"/>
+      </w:pPr>
+      <w:r>
+        <w:rPr>
+          <w:rFonts w:ascii="Times New Roman" w:hAnsi="Times New Roman" w:cs="Times New Roman"/>
+          <w:b/>
+          <w:sz w:val="24"/>
+        </w:rPr>
+        <w:t>2.9.18. Demo Sürekliliği ve Yedek Akış Senaryosu</w:t>
+      </w:r>
+    </w:p>
+    <w:p>
+      <w:pPr>
+        <w:pStyle w:val="TezBody"/>
+      </w:pPr>
+      <w:r>
+        <w:rPr>
+          <w:rFonts w:ascii="Times New Roman" w:hAnsi="Times New Roman" w:cs="Times New Roman"/>
+        </w:rPr>
+        <w:t>Bu senaryo, savunma ve canlı gösterim sırasında uygulamanın temel akışının korunması amacıyla değerlendirilmiştir. PrintForge'un hedef kitlesi teknik modelleme bilgisi sınırlı kullanıcılar ve ürün yayınlamak isteyen satıcılar olduğu için her akışın açık, izlenebilir ve hata durumunda anlaşılır olması gerekir. Senaryonun tasarım değeri, kullanıcının tek bir ekranda ne yapacağını anlaması ve işlemin sonucunu sistem içinde takip edebilmesidir.</w:t>
+      </w:r>
+    </w:p>
+    <w:p>
+      <w:pPr>
+        <w:pStyle w:val="TezBody"/>
+      </w:pPr>
+      <w:r>
+        <w:rPr>
+          <w:rFonts w:ascii="Times New Roman" w:hAnsi="Times New Roman" w:cs="Times New Roman"/>
+        </w:rPr>
+        <w:t>Uygulama tarafında bu akış admin örnekleri, boş durum ekranları, manuel katalog ürünü ekleme ve ekran görüntüsüyle desteklenen bulgular birlikte kullanılır. Bu karar, frontend ekranı ile backend iş kuralı arasında doğrudan bağ kurar. Böylece arayüzde görülen eylem yalnızca görsel bir düğme olmaktan çıkar; veritabanı kaydı, doğrulama, yetki kontrolü ve kullanıcıya dönen sonuçla birlikte tamamlanan bir işlem haline gelir.</w:t>
+      </w:r>
+    </w:p>
+    <w:p>
+      <w:pPr>
+        <w:pStyle w:val="TezBody"/>
+      </w:pPr>
+      <w:r>
+        <w:rPr>
+          <w:rFonts w:ascii="Times New Roman" w:hAnsi="Times New Roman" w:cs="Times New Roman"/>
+        </w:rPr>
+        <w:t>Senaryonun kullanıcıya katkısı harici servis gecikmesi yaşansa bile proje mimarisi ve kullanıcı akışlarının jüriye gösterilebilmesi olarak özetlenebilir. Kabul ölçütü ise dış servis bağımlılığının bitirme projesinin tamamını başarısız göstermemesi için yedek içerik akışı önemlidir. Bu ölçüt sağlanmadığında senaryo tamamlanmış kabul edilmez; çünkü bitirme projesinde yalnızca mutlu yolun çalışması değil, hatalı veya eksik girişlerin de kontrollü yönetilmesi beklenir.</w:t>
+      </w:r>
+    </w:p>
+    <w:p>
+      <w:pPr>
+        <w:pStyle w:val="TezBody"/>
+      </w:pPr>
+      <w:r>
+        <w:rPr>
+          <w:rFonts w:ascii="Times New Roman" w:hAnsi="Times New Roman" w:cs="Times New Roman"/>
+        </w:rPr>
+        <w:t>Bu değerlendirme, proje kapsamının yalnızca ekran tasarımından ibaret olmadığını göstermektedir. Her senaryo, kullanıcı arayüzü, API katmanı, veri modeli ve hata yönetimi arasında tutarlı bir ilişki kurulup kurulmadığını sınar. Bu nedenle senaryo tabanlı yaklaşım, hem geliştirme sürecinde kontrol listesi hem de tez kapsamında yöntemsel açıklama aracı olarak kullanılmıştır.</w:t>
+      </w:r>
+    </w:p>
+    <w:p>
+      <w:pPr>
+        <w:pStyle w:val="TezTableCaption"/>
+      </w:pPr>
+      <w:r>
+        <w:rPr>
+          <w:rFonts w:ascii="Times New Roman" w:hAnsi="Times New Roman" w:cs="Times New Roman"/>
+          <w:sz w:val="24"/>
+        </w:rPr>
+        <w:t>Tablo 2.7. Senaryo bazlı kabul matrisi</w:t>
+      </w:r>
+    </w:p>
+    <w:tbl>
+      <w:tblPr>
+        <w:tblStyle w:val="TableGrid"/>
+        <w:tblW w:type="dxa" w:w="9354"/>
+        <w:jc w:val="center"/>
+        <w:tblLayout w:type="fixed"/>
+        <w:tblLook w:firstColumn="1" w:firstRow="1" w:lastColumn="0" w:lastRow="0" w:noHBand="0" w:noVBand="1" w:val="04A0"/>
+      </w:tblPr>
+      <w:tblGrid>
+        <w:gridCol w:w="2268"/>
+        <w:gridCol w:w="3288"/>
+        <w:gridCol w:w="3798"/>
+      </w:tblGrid>
+      <w:tr>
+        <w:trPr>
+          <w:tblHeader w:val="true"/>
+        </w:trPr>
+        <w:tc>
+          <w:tcPr>
+            <w:tcW w:type="dxa" w:w="2268"/>
+            <w:vAlign w:val="center"/>
+            <w:tcMar>
+              <w:top w:w="80" w:type="dxa"/>
+              <w:start w:w="120" w:type="dxa"/>
+              <w:bottom w:w="80" w:type="dxa"/>
+              <w:end w:w="120" w:type="dxa"/>
+            </w:tcMar>
+            <w:shd w:fill="EDEDED"/>
+          </w:tcPr>
+          <w:p>
+            <w:pPr>
+              <w:spacing w:after="0" w:line="240" w:lineRule="auto"/>
+              <w:ind w:firstLine="0"/>
+              <w:jc w:val="center"/>
+            </w:pPr>
+            <w:r>
+              <w:rPr>
+                <w:rFonts w:ascii="Times New Roman" w:hAnsi="Times New Roman" w:cs="Times New Roman"/>
+                <w:b/>
+                <w:sz w:val="18"/>
+              </w:rPr>
+              <w:t>Senaryo grubu</w:t>
+            </w:r>
+          </w:p>
+        </w:tc>
+        <w:tc>
+          <w:tcPr>
+            <w:tcW w:type="dxa" w:w="3288"/>
+            <w:vAlign w:val="center"/>
+            <w:tcMar>
+              <w:top w:w="80" w:type="dxa"/>
+              <w:start w:w="120" w:type="dxa"/>
+              <w:bottom w:w="80" w:type="dxa"/>
+              <w:end w:w="120" w:type="dxa"/>
+            </w:tcMar>
+            <w:shd w:fill="EDEDED"/>
+          </w:tcPr>
+          <w:p>
+            <w:pPr>
+              <w:spacing w:after="0" w:line="240" w:lineRule="auto"/>
+              <w:ind w:firstLine="0"/>
+              <w:jc w:val="center"/>
+            </w:pPr>
+            <w:r>
+              <w:rPr>
+                <w:rFonts w:ascii="Times New Roman" w:hAnsi="Times New Roman" w:cs="Times New Roman"/>
+                <w:b/>
+                <w:sz w:val="18"/>
+              </w:rPr>
+              <w:t>Ana modül</w:t>
+            </w:r>
+          </w:p>
+        </w:tc>
+        <w:tc>
+          <w:tcPr>
+            <w:tcW w:type="dxa" w:w="3798"/>
+            <w:vAlign w:val="center"/>
+            <w:tcMar>
+              <w:top w:w="80" w:type="dxa"/>
+              <w:start w:w="120" w:type="dxa"/>
+              <w:bottom w:w="80" w:type="dxa"/>
+              <w:end w:w="120" w:type="dxa"/>
+            </w:tcMar>
+            <w:shd w:fill="EDEDED"/>
+          </w:tcPr>
+          <w:p>
+            <w:pPr>
+              <w:spacing w:after="0" w:line="240" w:lineRule="auto"/>
+              <w:ind w:firstLine="0"/>
+              <w:jc w:val="center"/>
+            </w:pPr>
+            <w:r>
+              <w:rPr>
+                <w:rFonts w:ascii="Times New Roman" w:hAnsi="Times New Roman" w:cs="Times New Roman"/>
+                <w:b/>
+                <w:sz w:val="18"/>
+              </w:rPr>
+              <w:t>Kabul göstergesi</w:t>
+            </w:r>
+          </w:p>
+        </w:tc>
+      </w:tr>
+      <w:tr>
+        <w:tc>
+          <w:tcPr>
+            <w:tcW w:type="dxa" w:w="2268"/>
+            <w:vAlign w:val="center"/>
+            <w:tcMar>
+              <w:top w:w="80" w:type="dxa"/>
+              <w:start w:w="120" w:type="dxa"/>
+              <w:bottom w:w="80" w:type="dxa"/>
+              <w:end w:w="120" w:type="dxa"/>
+            </w:tcMar>
+          </w:tcPr>
+          <w:p>
+            <w:pPr>
+              <w:spacing w:after="0" w:line="240" w:lineRule="auto"/>
+              <w:ind w:firstLine="0"/>
+              <w:jc w:val="center"/>
+            </w:pPr>
+            <w:r>
+              <w:rPr>
+                <w:rFonts w:ascii="Times New Roman" w:hAnsi="Times New Roman" w:cs="Times New Roman"/>
+                <w:b w:val="0"/>
+                <w:sz w:val="18"/>
+              </w:rPr>
+              <w:t>Hesap ve rol</w:t>
+            </w:r>
+          </w:p>
+        </w:tc>
+        <w:tc>
+          <w:tcPr>
+            <w:tcW w:type="dxa" w:w="3288"/>
+            <w:vAlign w:val="center"/>
+            <w:tcMar>
+              <w:top w:w="80" w:type="dxa"/>
+              <w:start w:w="120" w:type="dxa"/>
+              <w:bottom w:w="80" w:type="dxa"/>
+              <w:end w:w="120" w:type="dxa"/>
+            </w:tcMar>
+          </w:tcPr>
+          <w:p>
+            <w:pPr>
+              <w:spacing w:after="0" w:line="240" w:lineRule="auto"/>
+              <w:ind w:firstLine="0"/>
+              <w:jc w:val="left"/>
+            </w:pPr>
+            <w:r>
+              <w:rPr>
+                <w:rFonts w:ascii="Times New Roman" w:hAnsi="Times New Roman" w:cs="Times New Roman"/>
+                <w:b w:val="0"/>
+                <w:sz w:val="18"/>
+              </w:rPr>
+              <w:t>Auth, Navbar, protected routes</w:t>
+            </w:r>
+          </w:p>
+        </w:tc>
+        <w:tc>
+          <w:tcPr>
+            <w:tcW w:type="dxa" w:w="3798"/>
+            <w:vAlign w:val="center"/>
+            <w:tcMar>
+              <w:top w:w="80" w:type="dxa"/>
+              <w:start w:w="120" w:type="dxa"/>
+              <w:bottom w:w="80" w:type="dxa"/>
+              <w:end w:w="120" w:type="dxa"/>
+            </w:tcMar>
+          </w:tcPr>
+          <w:p>
+            <w:pPr>
+              <w:spacing w:after="0" w:line="240" w:lineRule="auto"/>
+              <w:ind w:firstLine="0"/>
+              <w:jc w:val="left"/>
+            </w:pPr>
+            <w:r>
+              <w:rPr>
+                <w:rFonts w:ascii="Times New Roman" w:hAnsi="Times New Roman" w:cs="Times New Roman"/>
+                <w:b w:val="0"/>
+                <w:sz w:val="18"/>
+              </w:rPr>
+              <w:t>Kullanıcı yalnızca yetkili olduğu ekrana erişir.</w:t>
+            </w:r>
+          </w:p>
+        </w:tc>
+      </w:tr>
+      <w:tr>
+        <w:tc>
+          <w:tcPr>
+            <w:tcW w:type="dxa" w:w="2268"/>
+            <w:vAlign w:val="center"/>
+            <w:tcMar>
+              <w:top w:w="80" w:type="dxa"/>
+              <w:start w:w="120" w:type="dxa"/>
+              <w:bottom w:w="80" w:type="dxa"/>
+              <w:end w:w="120" w:type="dxa"/>
+            </w:tcMar>
+          </w:tcPr>
+          <w:p>
+            <w:pPr>
+              <w:spacing w:after="0" w:line="240" w:lineRule="auto"/>
+              <w:ind w:firstLine="0"/>
+              <w:jc w:val="center"/>
+            </w:pPr>
+            <w:r>
+              <w:rPr>
+                <w:rFonts w:ascii="Times New Roman" w:hAnsi="Times New Roman" w:cs="Times New Roman"/>
+                <w:b w:val="0"/>
+                <w:sz w:val="18"/>
+              </w:rPr>
+              <w:t>Fikirden AI üretime</w:t>
+            </w:r>
+          </w:p>
+        </w:tc>
+        <w:tc>
+          <w:tcPr>
+            <w:tcW w:type="dxa" w:w="3288"/>
+            <w:vAlign w:val="center"/>
+            <w:tcMar>
+              <w:top w:w="80" w:type="dxa"/>
+              <w:start w:w="120" w:type="dxa"/>
+              <w:bottom w:w="80" w:type="dxa"/>
+              <w:end w:w="120" w:type="dxa"/>
+            </w:tcMar>
+          </w:tcPr>
+          <w:p>
+            <w:pPr>
+              <w:spacing w:after="0" w:line="240" w:lineRule="auto"/>
+              <w:ind w:firstLine="0"/>
+              <w:jc w:val="left"/>
+            </w:pPr>
+            <w:r>
+              <w:rPr>
+                <w:rFonts w:ascii="Times New Roman" w:hAnsi="Times New Roman" w:cs="Times New Roman"/>
+                <w:b w:val="0"/>
+                <w:sz w:val="18"/>
+              </w:rPr>
+              <w:t>Examples, image search, AI generation</w:t>
+            </w:r>
+          </w:p>
+        </w:tc>
+        <w:tc>
+          <w:tcPr>
+            <w:tcW w:type="dxa" w:w="3798"/>
+            <w:vAlign w:val="center"/>
+            <w:tcMar>
+              <w:top w:w="80" w:type="dxa"/>
+              <w:start w:w="120" w:type="dxa"/>
+              <w:bottom w:w="80" w:type="dxa"/>
+              <w:end w:w="120" w:type="dxa"/>
+            </w:tcMar>
+          </w:tcPr>
+          <w:p>
+            <w:pPr>
+              <w:spacing w:after="0" w:line="240" w:lineRule="auto"/>
+              <w:ind w:firstLine="0"/>
+              <w:jc w:val="left"/>
+            </w:pPr>
+            <w:r>
+              <w:rPr>
+                <w:rFonts w:ascii="Times New Roman" w:hAnsi="Times New Roman" w:cs="Times New Roman"/>
+                <w:b w:val="0"/>
+                <w:sz w:val="18"/>
+              </w:rPr>
+              <w:t>Referans görsel ve prompt üretim ekranına taşınır.</w:t>
+            </w:r>
+          </w:p>
+        </w:tc>
+      </w:tr>
+      <w:tr>
+        <w:tc>
+          <w:tcPr>
+            <w:tcW w:type="dxa" w:w="2268"/>
+            <w:vAlign w:val="center"/>
+            <w:tcMar>
+              <w:top w:w="80" w:type="dxa"/>
+              <w:start w:w="120" w:type="dxa"/>
+              <w:bottom w:w="80" w:type="dxa"/>
+              <w:end w:w="120" w:type="dxa"/>
+            </w:tcMar>
+          </w:tcPr>
+          <w:p>
+            <w:pPr>
+              <w:spacing w:after="0" w:line="240" w:lineRule="auto"/>
+              <w:ind w:firstLine="0"/>
+              <w:jc w:val="center"/>
+            </w:pPr>
+            <w:r>
+              <w:rPr>
+                <w:rFonts w:ascii="Times New Roman" w:hAnsi="Times New Roman" w:cs="Times New Roman"/>
+                <w:b w:val="0"/>
+                <w:sz w:val="18"/>
+              </w:rPr>
+              <w:t>Pazaryeri</w:t>
+            </w:r>
+          </w:p>
+        </w:tc>
+        <w:tc>
+          <w:tcPr>
+            <w:tcW w:type="dxa" w:w="3288"/>
+            <w:vAlign w:val="center"/>
+            <w:tcMar>
+              <w:top w:w="80" w:type="dxa"/>
+              <w:start w:w="120" w:type="dxa"/>
+              <w:bottom w:w="80" w:type="dxa"/>
+              <w:end w:w="120" w:type="dxa"/>
+            </w:tcMar>
+          </w:tcPr>
+          <w:p>
+            <w:pPr>
+              <w:spacing w:after="0" w:line="240" w:lineRule="auto"/>
+              <w:ind w:firstLine="0"/>
+              <w:jc w:val="left"/>
+            </w:pPr>
+            <w:r>
+              <w:rPr>
+                <w:rFonts w:ascii="Times New Roman" w:hAnsi="Times New Roman" w:cs="Times New Roman"/>
+                <w:b w:val="0"/>
+                <w:sz w:val="18"/>
+              </w:rPr>
+              <w:t>Marketplace, product detail, favorites, cart</w:t>
+            </w:r>
+          </w:p>
+        </w:tc>
+        <w:tc>
+          <w:tcPr>
+            <w:tcW w:type="dxa" w:w="3798"/>
+            <w:vAlign w:val="center"/>
+            <w:tcMar>
+              <w:top w:w="80" w:type="dxa"/>
+              <w:start w:w="120" w:type="dxa"/>
+              <w:bottom w:w="80" w:type="dxa"/>
+              <w:end w:w="120" w:type="dxa"/>
+            </w:tcMar>
+          </w:tcPr>
+          <w:p>
+            <w:pPr>
+              <w:spacing w:after="0" w:line="240" w:lineRule="auto"/>
+              <w:ind w:firstLine="0"/>
+              <w:jc w:val="left"/>
+            </w:pPr>
+            <w:r>
+              <w:rPr>
+                <w:rFonts w:ascii="Times New Roman" w:hAnsi="Times New Roman" w:cs="Times New Roman"/>
+                <w:b w:val="0"/>
+                <w:sz w:val="18"/>
+              </w:rPr>
+              <w:t>Ürünler aranır, incelenir ve kullanıcı listelerine eklenir.</w:t>
+            </w:r>
+          </w:p>
+        </w:tc>
+      </w:tr>
+      <w:tr>
+        <w:tc>
+          <w:tcPr>
+            <w:tcW w:type="dxa" w:w="2268"/>
+            <w:vAlign w:val="center"/>
+            <w:tcMar>
+              <w:top w:w="80" w:type="dxa"/>
+              <w:start w:w="120" w:type="dxa"/>
+              <w:bottom w:w="80" w:type="dxa"/>
+              <w:end w:w="120" w:type="dxa"/>
+            </w:tcMar>
+          </w:tcPr>
+          <w:p>
+            <w:pPr>
+              <w:spacing w:after="0" w:line="240" w:lineRule="auto"/>
+              <w:ind w:firstLine="0"/>
+              <w:jc w:val="center"/>
+            </w:pPr>
+            <w:r>
+              <w:rPr>
+                <w:rFonts w:ascii="Times New Roman" w:hAnsi="Times New Roman" w:cs="Times New Roman"/>
+                <w:b w:val="0"/>
+                <w:sz w:val="18"/>
+              </w:rPr>
+              <w:t>Satıcı operasyonu</w:t>
+            </w:r>
+          </w:p>
+        </w:tc>
+        <w:tc>
+          <w:tcPr>
+            <w:tcW w:type="dxa" w:w="3288"/>
+            <w:vAlign w:val="center"/>
+            <w:tcMar>
+              <w:top w:w="80" w:type="dxa"/>
+              <w:start w:w="120" w:type="dxa"/>
+              <w:bottom w:w="80" w:type="dxa"/>
+              <w:end w:w="120" w:type="dxa"/>
+            </w:tcMar>
+          </w:tcPr>
+          <w:p>
+            <w:pPr>
+              <w:spacing w:after="0" w:line="240" w:lineRule="auto"/>
+              <w:ind w:firstLine="0"/>
+              <w:jc w:val="left"/>
+            </w:pPr>
+            <w:r>
+              <w:rPr>
+                <w:rFonts w:ascii="Times New Roman" w:hAnsi="Times New Roman" w:cs="Times New Roman"/>
+                <w:b w:val="0"/>
+                <w:sz w:val="18"/>
+              </w:rPr>
+              <w:t>Seller products, add product, uploads</w:t>
+            </w:r>
+          </w:p>
+        </w:tc>
+        <w:tc>
+          <w:tcPr>
+            <w:tcW w:type="dxa" w:w="3798"/>
+            <w:vAlign w:val="center"/>
+            <w:tcMar>
+              <w:top w:w="80" w:type="dxa"/>
+              <w:start w:w="120" w:type="dxa"/>
+              <w:bottom w:w="80" w:type="dxa"/>
+              <w:end w:w="120" w:type="dxa"/>
+            </w:tcMar>
+          </w:tcPr>
+          <w:p>
+            <w:pPr>
+              <w:spacing w:after="0" w:line="240" w:lineRule="auto"/>
+              <w:ind w:firstLine="0"/>
+              <w:jc w:val="left"/>
+            </w:pPr>
+            <w:r>
+              <w:rPr>
+                <w:rFonts w:ascii="Times New Roman" w:hAnsi="Times New Roman" w:cs="Times New Roman"/>
+                <w:b w:val="0"/>
+                <w:sz w:val="18"/>
+              </w:rPr>
+              <w:t>Satıcı ürününü görsellerle katalogda yayınlayabilir.</w:t>
+            </w:r>
+          </w:p>
+        </w:tc>
+      </w:tr>
+      <w:tr>
+        <w:tc>
+          <w:tcPr>
+            <w:tcW w:type="dxa" w:w="2268"/>
+            <w:vAlign w:val="center"/>
+            <w:tcMar>
+              <w:top w:w="80" w:type="dxa"/>
+              <w:start w:w="120" w:type="dxa"/>
+              <w:bottom w:w="80" w:type="dxa"/>
+              <w:end w:w="120" w:type="dxa"/>
+            </w:tcMar>
+          </w:tcPr>
+          <w:p>
+            <w:pPr>
+              <w:spacing w:after="0" w:line="240" w:lineRule="auto"/>
+              <w:ind w:firstLine="0"/>
+              <w:jc w:val="center"/>
+            </w:pPr>
+            <w:r>
+              <w:rPr>
+                <w:rFonts w:ascii="Times New Roman" w:hAnsi="Times New Roman" w:cs="Times New Roman"/>
+                <w:b w:val="0"/>
+                <w:sz w:val="18"/>
+              </w:rPr>
+              <w:t>İletişim ve sipariş</w:t>
+            </w:r>
+          </w:p>
+        </w:tc>
+        <w:tc>
+          <w:tcPr>
+            <w:tcW w:type="dxa" w:w="3288"/>
+            <w:vAlign w:val="center"/>
+            <w:tcMar>
+              <w:top w:w="80" w:type="dxa"/>
+              <w:start w:w="120" w:type="dxa"/>
+              <w:bottom w:w="80" w:type="dxa"/>
+              <w:end w:w="120" w:type="dxa"/>
+            </w:tcMar>
+          </w:tcPr>
+          <w:p>
+            <w:pPr>
+              <w:spacing w:after="0" w:line="240" w:lineRule="auto"/>
+              <w:ind w:firstLine="0"/>
+              <w:jc w:val="left"/>
+            </w:pPr>
+            <w:r>
+              <w:rPr>
+                <w:rFonts w:ascii="Times New Roman" w:hAnsi="Times New Roman" w:cs="Times New Roman"/>
+                <w:b w:val="0"/>
+                <w:sz w:val="18"/>
+              </w:rPr>
+              <w:t>Chat, orders, conversation status</w:t>
+            </w:r>
+          </w:p>
+        </w:tc>
+        <w:tc>
+          <w:tcPr>
+            <w:tcW w:type="dxa" w:w="3798"/>
+            <w:vAlign w:val="center"/>
+            <w:tcMar>
+              <w:top w:w="80" w:type="dxa"/>
+              <w:start w:w="120" w:type="dxa"/>
+              <w:bottom w:w="80" w:type="dxa"/>
+              <w:end w:w="120" w:type="dxa"/>
+            </w:tcMar>
+          </w:tcPr>
+          <w:p>
+            <w:pPr>
+              <w:spacing w:after="0" w:line="240" w:lineRule="auto"/>
+              <w:ind w:firstLine="0"/>
+              <w:jc w:val="left"/>
+            </w:pPr>
+            <w:r>
+              <w:rPr>
+                <w:rFonts w:ascii="Times New Roman" w:hAnsi="Times New Roman" w:cs="Times New Roman"/>
+                <w:b w:val="0"/>
+                <w:sz w:val="18"/>
+              </w:rPr>
+              <w:t>Ürün veya AI modeli bağlamında takip edilebilir konuşma oluşur.</w:t>
+            </w:r>
+          </w:p>
+        </w:tc>
+      </w:tr>
+      <w:tr>
+        <w:tc>
+          <w:tcPr>
+            <w:tcW w:type="dxa" w:w="2268"/>
+            <w:vAlign w:val="center"/>
+            <w:tcMar>
+              <w:top w:w="80" w:type="dxa"/>
+              <w:start w:w="120" w:type="dxa"/>
+              <w:bottom w:w="80" w:type="dxa"/>
+              <w:end w:w="120" w:type="dxa"/>
+            </w:tcMar>
+          </w:tcPr>
+          <w:p>
+            <w:pPr>
+              <w:spacing w:after="0" w:line="240" w:lineRule="auto"/>
+              <w:ind w:firstLine="0"/>
+              <w:jc w:val="center"/>
+            </w:pPr>
+            <w:r>
+              <w:rPr>
+                <w:rFonts w:ascii="Times New Roman" w:hAnsi="Times New Roman" w:cs="Times New Roman"/>
+                <w:b w:val="0"/>
+                <w:sz w:val="18"/>
+              </w:rPr>
+              <w:t>Dayanıklılık</w:t>
+            </w:r>
+          </w:p>
+        </w:tc>
+        <w:tc>
+          <w:tcPr>
+            <w:tcW w:type="dxa" w:w="3288"/>
+            <w:vAlign w:val="center"/>
+            <w:tcMar>
+              <w:top w:w="80" w:type="dxa"/>
+              <w:start w:w="120" w:type="dxa"/>
+              <w:bottom w:w="80" w:type="dxa"/>
+              <w:end w:w="120" w:type="dxa"/>
+            </w:tcMar>
+          </w:tcPr>
+          <w:p>
+            <w:pPr>
+              <w:spacing w:after="0" w:line="240" w:lineRule="auto"/>
+              <w:ind w:firstLine="0"/>
+              <w:jc w:val="left"/>
+            </w:pPr>
+            <w:r>
+              <w:rPr>
+                <w:rFonts w:ascii="Times New Roman" w:hAnsi="Times New Roman" w:cs="Times New Roman"/>
+                <w:b w:val="0"/>
+                <w:sz w:val="18"/>
+              </w:rPr>
+              <w:t>Admin examples, cache, proxy, error handling</w:t>
+            </w:r>
+          </w:p>
+        </w:tc>
+        <w:tc>
+          <w:tcPr>
+            <w:tcW w:type="dxa" w:w="3798"/>
+            <w:vAlign w:val="center"/>
+            <w:tcMar>
+              <w:top w:w="80" w:type="dxa"/>
+              <w:start w:w="120" w:type="dxa"/>
+              <w:bottom w:w="80" w:type="dxa"/>
+              <w:end w:w="120" w:type="dxa"/>
+            </w:tcMar>
+          </w:tcPr>
+          <w:p>
+            <w:pPr>
+              <w:spacing w:after="0" w:line="240" w:lineRule="auto"/>
+              <w:ind w:firstLine="0"/>
+              <w:jc w:val="left"/>
+            </w:pPr>
+            <w:r>
+              <w:rPr>
+                <w:rFonts w:ascii="Times New Roman" w:hAnsi="Times New Roman" w:cs="Times New Roman"/>
+                <w:b w:val="0"/>
+                <w:sz w:val="18"/>
+              </w:rPr>
+              <w:t>Dış servis sorunu temel demo akışını tamamen kesmez.</w:t>
+            </w:r>
+          </w:p>
+        </w:tc>
+      </w:tr>
+    </w:tbl>
+    <w:p>
+      <w:pPr>
+        <w:pStyle w:val="TezSource"/>
+      </w:pPr>
+      <w:r>
+        <w:rPr>
+          <w:rFonts w:ascii="Times New Roman" w:hAnsi="Times New Roman" w:cs="Times New Roman"/>
+          <w:sz w:val="20"/>
+        </w:rPr>
+        <w:t>Kaynak: Senaryo tabanlı tasarım değerlendirmesi esas alınarak hazırlanmıştır.</w:t>
+      </w:r>
+    </w:p>
+    <w:p>
+      <w:pPr>
+        <w:pStyle w:val="TezHeading"/>
+      </w:pPr>
+      <w:r>
+        <w:rPr>
+          <w:rFonts w:ascii="Times New Roman" w:hAnsi="Times New Roman" w:cs="Times New Roman"/>
+          <w:b/>
+          <w:sz w:val="24"/>
+        </w:rPr>
+        <w:t>2.10. Kalite, Güvenlik ve Sürdürülebilirlik Değerlendirmesi</w:t>
+      </w:r>
+    </w:p>
+    <w:p>
+      <w:pPr>
+        <w:pStyle w:val="TezBody"/>
+      </w:pPr>
+      <w:r>
+        <w:rPr>
+          <w:rFonts w:ascii="Times New Roman" w:hAnsi="Times New Roman" w:cs="Times New Roman"/>
+        </w:rPr>
+        <w:t>Kalite değerlendirmesi, sistemin yalnızca çalışıp çalışmadığını değil, sürdürülebilir biçimde geliştirilebilir olup olmadığını da ele alır. PrintForge'da kalite; kodun modülerliği, veri modelinin genişletilebilirliği, güvenlik kontrollerinin açık olması, kullanıcı akışlarının anlaşılır kalması ve dış servis bağımlılıklarının yönetilebilir olması üzerinden incelenmiştir.</w:t>
+      </w:r>
+    </w:p>
+    <w:p>
+      <w:pPr>
+        <w:pStyle w:val="TezHeading"/>
+      </w:pPr>
+      <w:r>
+        <w:rPr>
+          <w:rFonts w:ascii="Times New Roman" w:hAnsi="Times New Roman" w:cs="Times New Roman"/>
+          <w:b/>
+          <w:sz w:val="24"/>
+        </w:rPr>
+        <w:t>2.10.1. Veri Güvenliği ve Kişisel Veri Yönetimi</w:t>
+      </w:r>
+    </w:p>
+    <w:p>
+      <w:pPr>
+        <w:pStyle w:val="TezBody"/>
+      </w:pPr>
+      <w:r>
+        <w:rPr>
+          <w:rFonts w:ascii="Times New Roman" w:hAnsi="Times New Roman" w:cs="Times New Roman"/>
+        </w:rPr>
+        <w:t>Kullanıcı hesapları, mesajlar, favoriler ve sipariş durumları kişisel veri niteliği taşıyan kayıtlar oluşturur. Bu nedenle uygulamada parolalar düz metin olarak saklanmaz; bcrypt ile özetlenir. Oturum doğrulaması JWT üzerinden yürütülür ve korunan rotalarda kullanıcının kimliği doğrulanmadan işlem yapılmaz.</w:t>
+      </w:r>
+    </w:p>
+    <w:p>
+      <w:pPr>
+        <w:pStyle w:val="TezBody"/>
+      </w:pPr>
+      <w:r>
+        <w:rPr>
+          <w:rFonts w:ascii="Times New Roman" w:hAnsi="Times New Roman" w:cs="Times New Roman"/>
+        </w:rPr>
+        <w:t>Mesajlaşma ve model dosyası erişiminde de yetki kontrolü önemlidir. Kullanıcı yalnızca kendi oluşturduğu modele veya tarafı olduğu konuşmaya bağlı modele erişebilmelidir. Bu kontrol yapılmadığında özel üretim çıktılarının başka kullanıcılar tarafından görüntülenmesi riski doğar.</w:t>
+      </w:r>
+    </w:p>
+    <w:p>
+      <w:pPr>
+        <w:pStyle w:val="TezBody"/>
+      </w:pPr>
+      <w:r>
+        <w:rPr>
+          <w:rFonts w:ascii="Times New Roman" w:hAnsi="Times New Roman" w:cs="Times New Roman"/>
+        </w:rPr>
+        <w:t>Bu güvenlik yaklaşımı, bitirme projesi ölçeği için temel ama kritik bir gerekliliktir. Proje gerçek ödeme veya hassas üretim sırrı entegrasyonu içermese de kullanıcı hesabı ve model dosyası gizliliğini korumak akademik değerlendirme açısından önemlidir.</w:t>
+      </w:r>
+    </w:p>
+    <w:p>
+      <w:pPr>
+        <w:pStyle w:val="TezHeading"/>
+      </w:pPr>
+      <w:r>
+        <w:rPr>
+          <w:rFonts w:ascii="Times New Roman" w:hAnsi="Times New Roman" w:cs="Times New Roman"/>
+          <w:b/>
+          <w:sz w:val="24"/>
+        </w:rPr>
+        <w:t>2.10.2. Telif, Etik ve Harici Görsel Kullanımı</w:t>
+      </w:r>
+    </w:p>
+    <w:p>
+      <w:pPr>
+        <w:pStyle w:val="TezBody"/>
+      </w:pPr>
+      <w:r>
+        <w:rPr>
+          <w:rFonts w:ascii="Times New Roman" w:hAnsi="Times New Roman" w:cs="Times New Roman"/>
+        </w:rPr>
+        <w:t>Görsel arama sonuçları kullanıcıya üretim fikri vermek için kullanılır; ancak internette bulunan her görselin üretim veya ticari kullanım hakkı bulunmayabilir. Bu nedenle tez kapsamında harici görsellerin kullanımında lisans ve telif sorumluluğunun dikkate alınması gerektiği açıkça belirtilmiştir.</w:t>
+      </w:r>
+    </w:p>
+    <w:p>
+      <w:pPr>
+        <w:pStyle w:val="TezBody"/>
+      </w:pPr>
+      <w:r>
+        <w:rPr>
+          <w:rFonts w:ascii="Times New Roman" w:hAnsi="Times New Roman" w:cs="Times New Roman"/>
+        </w:rPr>
+        <w:t>Admin tarafından yönetilen örnek içeriklerin bulunması bu riski azaltan bir yaklaşımdır. Kontrollü örnekler, hem demo sürecinde hem de kullanıcıya güvenli başlangıç içeriği sunmada yararlıdır. Bu yapı ileride lisans bilgisi, kaynak etiketi ve kullanım izni gibi alanlarla genişletilebilir.</w:t>
+      </w:r>
+    </w:p>
+    <w:p>
+      <w:pPr>
+        <w:pStyle w:val="TezBody"/>
+      </w:pPr>
+      <w:r>
+        <w:rPr>
+          <w:rFonts w:ascii="Times New Roman" w:hAnsi="Times New Roman" w:cs="Times New Roman"/>
+        </w:rPr>
+        <w:t>Etik değerlendirme yalnızca görsel telifiyle sınırlı değildir. AI üretim servisleriyle çalışırken kullanıcının yüklediği görselin hangi amaçla kullanılacağı, üretim sonucunun baskıya uygun olup olmadığı ve çıktı kalitesinin garanti edilmediği de kullanıcıya açık biçimde anlatılmalıdır.</w:t>
+      </w:r>
+    </w:p>
+    <w:p>
+      <w:pPr>
+        <w:pStyle w:val="TezHeading"/>
+      </w:pPr>
+      <w:r>
+        <w:rPr>
+          <w:rFonts w:ascii="Times New Roman" w:hAnsi="Times New Roman" w:cs="Times New Roman"/>
+          <w:b/>
+          <w:sz w:val="24"/>
+        </w:rPr>
+        <w:t>2.10.3. Performans ve Kullanıcı Bekleme Süresi</w:t>
+      </w:r>
+    </w:p>
+    <w:p>
+      <w:pPr>
+        <w:pStyle w:val="TezBody"/>
+      </w:pPr>
+      <w:r>
+        <w:rPr>
+          <w:rFonts w:ascii="Times New Roman" w:hAnsi="Times New Roman" w:cs="Times New Roman"/>
+        </w:rPr>
+        <w:t>AI destekli 3D model üretimi çoğu zaman anlık sonuç üretmeyen, servis yoğunluğuna ve model karmaşıklığına bağlı olarak uzayabilen bir süreçtir. Bu nedenle PrintForge'da üretim akışının görev tabanlı izlenmesi tercih edilmiştir. Kullanıcıya görevin başlatıldığı, sürdüğü veya tamamlandığı bilgisinin verilmesi bekleme deneyimini daha anlaşılır hale getirir.</w:t>
+      </w:r>
+    </w:p>
+    <w:p>
+      <w:pPr>
+        <w:pStyle w:val="TezBody"/>
+      </w:pPr>
+      <w:r>
+        <w:rPr>
+          <w:rFonts w:ascii="Times New Roman" w:hAnsi="Times New Roman" w:cs="Times New Roman"/>
+        </w:rPr>
+        <w:t>Görsel arama tarafında cache kullanılması performans açısından önemli bir karardır. Aynı sorgunun kısa sürede tekrar tekrar dış servise gönderilmesi hem gecikmeye hem de kota tüketimine neden olabilir. Sorguya ve sağlayıcıya göre oluşturulan önbellek anahtarı, kullanıcıya daha hızlı cevap verilmesini sağlar.</w:t>
+      </w:r>
+    </w:p>
+    <w:p>
+      <w:pPr>
+        <w:pStyle w:val="TezBody"/>
+      </w:pPr>
+      <w:r>
+        <w:rPr>
+          <w:rFonts w:ascii="Times New Roman" w:hAnsi="Times New Roman" w:cs="Times New Roman"/>
+        </w:rPr>
+        <w:t>Performans değerlendirmesi yalnızca hızla sınırlı değildir. Uygulamanın boş durum ekranları, hata mesajları ve görev durumu bildirimleri de algılanan performansı etkiler. Kullanıcı sistemin ne yaptığını gördüğünde işlem süresi uzasa bile deneyim daha güvenilir görünür.</w:t>
+      </w:r>
+    </w:p>
+    <w:p>
+      <w:pPr>
+        <w:pStyle w:val="TezHeading"/>
+      </w:pPr>
+      <w:r>
+        <w:rPr>
+          <w:rFonts w:ascii="Times New Roman" w:hAnsi="Times New Roman" w:cs="Times New Roman"/>
+          <w:b/>
+          <w:sz w:val="24"/>
+        </w:rPr>
+        <w:t>2.10.4. Kodun Sürdürülebilirliği</w:t>
+      </w:r>
+    </w:p>
+    <w:p>
+      <w:pPr>
+        <w:pStyle w:val="TezBody"/>
+      </w:pPr>
+      <w:r>
+        <w:rPr>
+          <w:rFonts w:ascii="Times New Roman" w:hAnsi="Times New Roman" w:cs="Times New Roman"/>
+        </w:rPr>
+        <w:t>Kod tabanının frontend ve backend olarak ayrılması, değişikliklerin etkisini sınırlandırmaktadır. Frontend tarafında sayfalar ve bileşenler kullanıcı akışlarına göre düzenlenirken, backend tarafında auth, ai, models, chat, examples ve images gibi rota dosyaları iş alanlarına göre ayrılmıştır.</w:t>
+      </w:r>
+    </w:p>
+    <w:p>
+      <w:pPr>
+        <w:pStyle w:val="TezBody"/>
+      </w:pPr>
+      <w:r>
+        <w:rPr>
+          <w:rFonts w:ascii="Times New Roman" w:hAnsi="Times New Roman" w:cs="Times New Roman"/>
+        </w:rPr>
+        <w:t>Bu modüler yapı yeni özellik eklemeyi kolaylaştırır. Örneğin ödeme entegrasyonu eklenecekse chat veya AI üretim rotalarının tamamını değiştirmek gerekmez; sipariş ve ödeme alanında yeni bir servis katmanı oluşturulabilir. Benzer şekilde maliyet tahmini modülü, model dosyası işleme tarafına eklenebilir.</w:t>
+      </w:r>
+    </w:p>
+    <w:p>
+      <w:pPr>
+        <w:pStyle w:val="TezBody"/>
+      </w:pPr>
+      <w:r>
+        <w:rPr>
+          <w:rFonts w:ascii="Times New Roman" w:hAnsi="Times New Roman" w:cs="Times New Roman"/>
+        </w:rPr>
+        <w:t>Sürdürülebilirlik açısından ortam değişkenlerinin belgelenmesi de önemlidir. DATABASE_URL, JWT_SECRET, FRONTEND_URLS ve harici servis anahtarları kaynak koddan ayrıldığı için proje farklı geliştirme ve canlı ortamlarında daha güvenli biçimde çalıştırılabilir.</w:t>
+      </w:r>
+    </w:p>
+    <w:p>
+      <w:pPr>
+        <w:pStyle w:val="TezHeading"/>
+      </w:pPr>
+      <w:r>
+        <w:rPr>
+          <w:rFonts w:ascii="Times New Roman" w:hAnsi="Times New Roman" w:cs="Times New Roman"/>
+          <w:b/>
+          <w:sz w:val="24"/>
+        </w:rPr>
+        <w:t>2.10.5. Kullanılabilirlik ve Arayüz Tutarlılığı</w:t>
+      </w:r>
+    </w:p>
+    <w:p>
+      <w:pPr>
+        <w:pStyle w:val="TezBody"/>
+      </w:pPr>
+      <w:r>
+        <w:rPr>
+          <w:rFonts w:ascii="Times New Roman" w:hAnsi="Times New Roman" w:cs="Times New Roman"/>
+        </w:rPr>
+        <w:t>Arayüzde kullanılan menü yapısı, butonlar, boş durum ekranları ve yönlendirmeler kullanıcıya aynı görsel dil içinde sunulmaktadır. Katalog, örnekler ve AI üretim sayfası aynı üst gezinme yapısını paylaşır; bu da kullanıcının nerede olduğunu anlamasını kolaylaştırır.</w:t>
+      </w:r>
+    </w:p>
+    <w:p>
+      <w:pPr>
+        <w:pStyle w:val="TezBody"/>
+      </w:pPr>
+      <w:r>
+        <w:rPr>
+          <w:rFonts w:ascii="Times New Roman" w:hAnsi="Times New Roman" w:cs="Times New Roman"/>
+        </w:rPr>
+        <w:t>Boş durum ekranlarının tasarımı özellikle önemlidir. Katalog, favoriler, sepet, mesajlar ve siparişler ekranlarında veri yokken yalnızca boş beyaz alan bırakılmamış; kullanıcıyı ilgili bir sonraki adıma yönlendiren açıklama ve butonlar eklenmiştir. Bu yaklaşım, uygulamanın ilk kullanımda da anlamlı görünmesini sağlar.</w:t>
+      </w:r>
+    </w:p>
+    <w:p>
+      <w:pPr>
+        <w:pStyle w:val="TezBody"/>
+      </w:pPr>
+      <w:r>
+        <w:rPr>
+          <w:rFonts w:ascii="Times New Roman" w:hAnsi="Times New Roman" w:cs="Times New Roman"/>
+        </w:rPr>
+        <w:t>Kullanılabilirlik açısından sade form alanları tercih edilmiştir. Satıcı ürün ekleme ekranında ürün adı, açıklama, kategori, fiyat ve görsel yükleme alanları aynı akışta sunulur. Bu yapı, satıcının karmaşık stok yönetimiyle uğraşmadan ürün yayınlamasını sağlar.</w:t>
+      </w:r>
+    </w:p>
+    <w:p>
+      <w:pPr>
+        <w:pStyle w:val="TezHeading"/>
+      </w:pPr>
+      <w:r>
+        <w:rPr>
+          <w:rFonts w:ascii="Times New Roman" w:hAnsi="Times New Roman" w:cs="Times New Roman"/>
+          <w:b/>
+          <w:sz w:val="24"/>
+        </w:rPr>
+        <w:t>2.10.6. Test Edilebilirlik</w:t>
+      </w:r>
+    </w:p>
+    <w:p>
+      <w:pPr>
+        <w:pStyle w:val="TezBody"/>
+      </w:pPr>
+      <w:r>
+        <w:rPr>
+          <w:rFonts w:ascii="Times New Roman" w:hAnsi="Times New Roman" w:cs="Times New Roman"/>
+        </w:rPr>
+        <w:t>Proje test yaklaşımı derleme doğrulaması, manuel senaryo kontrolü ve hata durumlarının gözlenmesi şeklinde ele alınmıştır. Backend TypeScript derlemesinin başarılı olması API katmanındaki tip hatalarının azaltıldığını; frontend üretim derlemesinin başarılı olması ise sayfa yapısının üretim modunda oluşturulabildiğini gösterir.</w:t>
+      </w:r>
+    </w:p>
+    <w:p>
+      <w:pPr>
+        <w:pStyle w:val="TezBody"/>
+      </w:pPr>
+      <w:r>
+        <w:rPr>
+          <w:rFonts w:ascii="Times New Roman" w:hAnsi="Times New Roman" w:cs="Times New Roman"/>
+        </w:rPr>
+        <w:t>Manuel senaryo testleri, bitirme projesi ölçeğinde önemlidir çünkü sistem çok sayıda kullanıcı akışını içerir. Kayıt, giriş, ürün ekleme, görsel arama, AI üretim sayfasına geçiş, mesajlaşma ve sipariş takibi tek tek kontrol edilmelidir. Bu testler, yalnızca kodun derlenmesini değil, kullanıcı iş akışının tamamlanmasını doğrular.</w:t>
+      </w:r>
+    </w:p>
+    <w:p>
+      <w:pPr>
+        <w:pStyle w:val="TezBody"/>
+      </w:pPr>
+      <w:r>
+        <w:rPr>
+          <w:rFonts w:ascii="Times New Roman" w:hAnsi="Times New Roman" w:cs="Times New Roman"/>
+        </w:rPr>
+        <w:t>İleride otomatik test kapsamı genişletilebilir. Backend için rota testleri, frontend için bileşen ve kullanıcı akışı testleri, model dosyası işleme için örnek dosya tabanlı testler eklenebilir. Bu geliştirmeler projenin akademik prototipten daha olgun bir yazılım ürününe dönüşmesini sağlar.</w:t>
+      </w:r>
+    </w:p>
+    <w:p>
+      <w:pPr>
+        <w:pStyle w:val="TezHeading"/>
+      </w:pPr>
+      <w:r>
+        <w:rPr>
+          <w:rFonts w:ascii="Times New Roman" w:hAnsi="Times New Roman" w:cs="Times New Roman"/>
+          <w:b/>
+          <w:sz w:val="24"/>
+        </w:rPr>
+        <w:t>2.10.7. Genişletilebilirlik ve Gelecek Çalışmalar</w:t>
+      </w:r>
+    </w:p>
+    <w:p>
+      <w:pPr>
+        <w:pStyle w:val="TezBody"/>
+      </w:pPr>
+      <w:r>
+        <w:rPr>
+          <w:rFonts w:ascii="Times New Roman" w:hAnsi="Times New Roman" w:cs="Times New Roman"/>
+        </w:rPr>
+        <w:t>PrintForge'un veri modeli ve modüler mimarisi yeni özelliklerin eklenebilmesine uygundur. Mevcut sistemde Model varlığı hem AI üretimi hem de katalog ürünü için kullanılmaktadır. Bu karar ortak yorum, soru, mesaj ve sipariş ilişkilerinin tek kavram üzerinden yönetilmesini sağlar.</w:t>
+      </w:r>
+    </w:p>
+    <w:p>
+      <w:pPr>
+        <w:pStyle w:val="TezBody"/>
+      </w:pPr>
+      <w:r>
+        <w:rPr>
+          <w:rFonts w:ascii="Times New Roman" w:hAnsi="Times New Roman" w:cs="Times New Roman"/>
+        </w:rPr>
+        <w:t>Gelecekte baskıya uygunluk analizi eklenirse model dosyasından hacim, yüzey alanı, sınır kutusu ve tahmini malzeme kullanımı hesaplanabilir. Bu bilgiler satıcı teklif sürecini destekler ve kullanıcıya üretim öncesi daha gerçekçi fiyat beklentisi verir.</w:t>
+      </w:r>
+    </w:p>
+    <w:p>
+      <w:pPr>
+        <w:pStyle w:val="TezBody"/>
+      </w:pPr>
+      <w:r>
+        <w:rPr>
+          <w:rFonts w:ascii="Times New Roman" w:hAnsi="Times New Roman" w:cs="Times New Roman"/>
+        </w:rPr>
+        <w:t>Ödeme, kargo, satıcı puanı, lisans filtresi, teklif karşılaştırma ve çoklu AI sağlayıcı desteği de sistemin doğal genişleme alanlarıdır. Bu özellikler eklendiğinde PrintForge yalnızca model üretim ve katalog uygulaması olmaktan çıkarak daha kapsamlı bir 3D baskı hizmet platformuna dönüşebilir.</w:t>
+      </w:r>
+    </w:p>
+    <w:p>
+      <w:pPr>
+        <w:pStyle w:val="TezHeading"/>
+      </w:pPr>
+      <w:r>
+        <w:rPr>
+          <w:rFonts w:ascii="Times New Roman" w:hAnsi="Times New Roman" w:cs="Times New Roman"/>
+          <w:b/>
+          <w:sz w:val="24"/>
+        </w:rPr>
+        <w:t>2.10.8. Kabul Değerlendirmesine Uygunluk</w:t>
+      </w:r>
+    </w:p>
+    <w:p>
+      <w:pPr>
+        <w:pStyle w:val="TezBody"/>
+      </w:pPr>
+      <w:r>
+        <w:rPr>
+          <w:rFonts w:ascii="Times New Roman" w:hAnsi="Times New Roman" w:cs="Times New Roman"/>
+        </w:rPr>
+        <w:t>Bir bitirme tezinde kabul edilebilirlik yalnızca sayfa sayısına bağlı değildir. Projenin çalışır olması, tez metninin projeyle tutarlı olması, yöntem ve bulguların açık yazılması, kaynakçanın akademik düzende verilmesi ve jüriye gösterilebilir ekranların bulunması önemlidir.</w:t>
+      </w:r>
+    </w:p>
+    <w:p>
+      <w:pPr>
+        <w:pStyle w:val="TezBody"/>
+      </w:pPr>
+      <w:r>
+        <w:rPr>
+          <w:rFonts w:ascii="Times New Roman" w:hAnsi="Times New Roman" w:cs="Times New Roman"/>
+        </w:rPr>
+        <w:t>PrintForge tezi bu ölçütler açısından değerlendirildiğinde, çalışan site ekran görüntüleri, sistem mimarisi, veri modeli, modül açıklamaları, test senaryoları ve kaynakça ile desteklenen bütünlüklü bir yapı sunmaktadır. Tezin güçlü tarafı, AI üretim fikrini tek başına bırakmayıp pazaryeri, mesajlaşma ve satıcı yönetimiyle tamamlamasıdır.</w:t>
+      </w:r>
+    </w:p>
+    <w:p>
+      <w:pPr>
+        <w:pStyle w:val="TezBody"/>
+      </w:pPr>
+      <w:r>
+        <w:rPr>
+          <w:rFonts w:ascii="Times New Roman" w:hAnsi="Times New Roman" w:cs="Times New Roman"/>
+        </w:rPr>
+        <w:t>Kabul riskini azaltmak için savunmada özellikle ana sayfa, örnek görsel arama, AI üretim ekranı, satıcı ürün ekleme, katalog ve mesaj/sipariş akışları sırayla gösterilmelidir. Böyle bir demo akışı, tezde anlatılan mimarinin gerçek uygulama üzerinde karşılığı olduğunu açık biçimde kanıtlar.</w:t>
+      </w:r>
+    </w:p>
+    <w:p>
+      <w:pPr>
+        <w:pStyle w:val="TezTableCaption"/>
+      </w:pPr>
+      <w:r>
+        <w:rPr>
+          <w:rFonts w:ascii="Times New Roman" w:hAnsi="Times New Roman" w:cs="Times New Roman"/>
+          <w:sz w:val="24"/>
+        </w:rPr>
+        <w:t>Tablo 2.8. Teknik kalite ve risk kontrol matrisi</w:t>
+      </w:r>
+    </w:p>
+    <w:tbl>
+      <w:tblPr>
+        <w:tblStyle w:val="TableGrid"/>
+        <w:tblW w:type="dxa" w:w="8901"/>
+        <w:jc w:val="center"/>
+        <w:tblLayout w:type="fixed"/>
+        <w:tblLook w:firstColumn="1" w:firstRow="1" w:lastColumn="0" w:lastRow="0" w:noHBand="0" w:noVBand="1" w:val="04A0"/>
+      </w:tblPr>
+      <w:tblGrid>
+        <w:gridCol w:w="1984"/>
+        <w:gridCol w:w="3402"/>
+        <w:gridCol w:w="3515"/>
+      </w:tblGrid>
+      <w:tr>
+        <w:trPr>
+          <w:tblHeader w:val="true"/>
+        </w:trPr>
+        <w:tc>
+          <w:tcPr>
+            <w:tcW w:type="dxa" w:w="1984"/>
+            <w:vAlign w:val="center"/>
+            <w:tcMar>
+              <w:top w:w="80" w:type="dxa"/>
+              <w:start w:w="120" w:type="dxa"/>
+              <w:bottom w:w="80" w:type="dxa"/>
+              <w:end w:w="120" w:type="dxa"/>
+            </w:tcMar>
+            <w:shd w:fill="EDEDED"/>
+          </w:tcPr>
+          <w:p>
+            <w:pPr>
+              <w:spacing w:after="0" w:line="240" w:lineRule="auto"/>
+              <w:ind w:firstLine="0"/>
+              <w:jc w:val="center"/>
+            </w:pPr>
+            <w:r>
+              <w:rPr>
+                <w:rFonts w:ascii="Times New Roman" w:hAnsi="Times New Roman" w:cs="Times New Roman"/>
+                <w:b/>
+                <w:sz w:val="18"/>
+              </w:rPr>
+              <w:t>Kalite alanı</w:t>
+            </w:r>
+          </w:p>
+        </w:tc>
+        <w:tc>
+          <w:tcPr>
+            <w:tcW w:type="dxa" w:w="3402"/>
+            <w:vAlign w:val="center"/>
+            <w:tcMar>
+              <w:top w:w="80" w:type="dxa"/>
+              <w:start w:w="120" w:type="dxa"/>
+              <w:bottom w:w="80" w:type="dxa"/>
+              <w:end w:w="120" w:type="dxa"/>
+            </w:tcMar>
+            <w:shd w:fill="EDEDED"/>
+          </w:tcPr>
+          <w:p>
+            <w:pPr>
+              <w:spacing w:after="0" w:line="240" w:lineRule="auto"/>
+              <w:ind w:firstLine="0"/>
+              <w:jc w:val="left"/>
+            </w:pPr>
+            <w:r>
+              <w:rPr>
+                <w:rFonts w:ascii="Times New Roman" w:hAnsi="Times New Roman" w:cs="Times New Roman"/>
+                <w:b/>
+                <w:sz w:val="18"/>
+              </w:rPr>
+              <w:t>Projede uygulanan yaklaşım</w:t>
+            </w:r>
+          </w:p>
+        </w:tc>
+        <w:tc>
+          <w:tcPr>
+            <w:tcW w:type="dxa" w:w="3515"/>
+            <w:vAlign w:val="center"/>
+            <w:tcMar>
+              <w:top w:w="80" w:type="dxa"/>
+              <w:start w:w="120" w:type="dxa"/>
+              <w:bottom w:w="80" w:type="dxa"/>
+              <w:end w:w="120" w:type="dxa"/>
+            </w:tcMar>
+            <w:shd w:fill="EDEDED"/>
+          </w:tcPr>
+          <w:p>
+            <w:pPr>
+              <w:spacing w:after="0" w:line="240" w:lineRule="auto"/>
+              <w:ind w:firstLine="0"/>
+              <w:jc w:val="left"/>
+            </w:pPr>
+            <w:r>
+              <w:rPr>
+                <w:rFonts w:ascii="Times New Roman" w:hAnsi="Times New Roman" w:cs="Times New Roman"/>
+                <w:b/>
+                <w:sz w:val="18"/>
+              </w:rPr>
+              <w:t>Geliştirme fırsatı</w:t>
+            </w:r>
+          </w:p>
+        </w:tc>
+      </w:tr>
+      <w:tr>
+        <w:tc>
+          <w:tcPr>
+            <w:tcW w:type="dxa" w:w="1984"/>
+            <w:vAlign w:val="center"/>
+            <w:tcMar>
+              <w:top w:w="80" w:type="dxa"/>
+              <w:start w:w="120" w:type="dxa"/>
+              <w:bottom w:w="80" w:type="dxa"/>
+              <w:end w:w="120" w:type="dxa"/>
+            </w:tcMar>
+          </w:tcPr>
+          <w:p>
+            <w:pPr>
+              <w:spacing w:after="0" w:line="240" w:lineRule="auto"/>
+              <w:ind w:firstLine="0"/>
+              <w:jc w:val="center"/>
+            </w:pPr>
+            <w:r>
+              <w:rPr>
+                <w:rFonts w:ascii="Times New Roman" w:hAnsi="Times New Roman" w:cs="Times New Roman"/>
+                <w:b w:val="0"/>
+                <w:sz w:val="18"/>
+              </w:rPr>
+              <w:t>Güvenlik</w:t>
+            </w:r>
+          </w:p>
+        </w:tc>
+        <w:tc>
+          <w:tcPr>
+            <w:tcW w:type="dxa" w:w="3402"/>
+            <w:vAlign w:val="center"/>
+            <w:tcMar>
+              <w:top w:w="80" w:type="dxa"/>
+              <w:start w:w="120" w:type="dxa"/>
+              <w:bottom w:w="80" w:type="dxa"/>
+              <w:end w:w="120" w:type="dxa"/>
+            </w:tcMar>
+          </w:tcPr>
+          <w:p>
+            <w:pPr>
+              <w:spacing w:after="0" w:line="240" w:lineRule="auto"/>
+              <w:ind w:firstLine="0"/>
+              <w:jc w:val="left"/>
+            </w:pPr>
+            <w:r>
+              <w:rPr>
+                <w:rFonts w:ascii="Times New Roman" w:hAnsi="Times New Roman" w:cs="Times New Roman"/>
+                <w:b w:val="0"/>
+                <w:sz w:val="18"/>
+              </w:rPr>
+              <w:t>JWT, bcrypt, Zod doğrulama ve dosya erişim kontrolü</w:t>
+            </w:r>
+          </w:p>
+        </w:tc>
+        <w:tc>
+          <w:tcPr>
+            <w:tcW w:type="dxa" w:w="3515"/>
+            <w:vAlign w:val="center"/>
+            <w:tcMar>
+              <w:top w:w="80" w:type="dxa"/>
+              <w:start w:w="120" w:type="dxa"/>
+              <w:bottom w:w="80" w:type="dxa"/>
+              <w:end w:w="120" w:type="dxa"/>
+            </w:tcMar>
+          </w:tcPr>
+          <w:p>
+            <w:pPr>
+              <w:spacing w:after="0" w:line="240" w:lineRule="auto"/>
+              <w:ind w:firstLine="0"/>
+              <w:jc w:val="left"/>
+            </w:pPr>
+            <w:r>
+              <w:rPr>
+                <w:rFonts w:ascii="Times New Roman" w:hAnsi="Times New Roman" w:cs="Times New Roman"/>
+                <w:b w:val="0"/>
+                <w:sz w:val="18"/>
+              </w:rPr>
+              <w:t>Rol bazlı daha ayrıntılı yetki politikaları</w:t>
+            </w:r>
+          </w:p>
+        </w:tc>
+      </w:tr>
+      <w:tr>
+        <w:tc>
+          <w:tcPr>
+            <w:tcW w:type="dxa" w:w="1984"/>
+            <w:vAlign w:val="center"/>
+            <w:tcMar>
+              <w:top w:w="80" w:type="dxa"/>
+              <w:start w:w="120" w:type="dxa"/>
+              <w:bottom w:w="80" w:type="dxa"/>
+              <w:end w:w="120" w:type="dxa"/>
+            </w:tcMar>
+          </w:tcPr>
+          <w:p>
+            <w:pPr>
+              <w:spacing w:after="0" w:line="240" w:lineRule="auto"/>
+              <w:ind w:firstLine="0"/>
+              <w:jc w:val="center"/>
+            </w:pPr>
+            <w:r>
+              <w:rPr>
+                <w:rFonts w:ascii="Times New Roman" w:hAnsi="Times New Roman" w:cs="Times New Roman"/>
+                <w:b w:val="0"/>
+                <w:sz w:val="18"/>
+              </w:rPr>
+              <w:t>Performans</w:t>
+            </w:r>
+          </w:p>
+        </w:tc>
+        <w:tc>
+          <w:tcPr>
+            <w:tcW w:type="dxa" w:w="3402"/>
+            <w:vAlign w:val="center"/>
+            <w:tcMar>
+              <w:top w:w="80" w:type="dxa"/>
+              <w:start w:w="120" w:type="dxa"/>
+              <w:bottom w:w="80" w:type="dxa"/>
+              <w:end w:w="120" w:type="dxa"/>
+            </w:tcMar>
+          </w:tcPr>
+          <w:p>
+            <w:pPr>
+              <w:spacing w:after="0" w:line="240" w:lineRule="auto"/>
+              <w:ind w:firstLine="0"/>
+              <w:jc w:val="left"/>
+            </w:pPr>
+            <w:r>
+              <w:rPr>
+                <w:rFonts w:ascii="Times New Roman" w:hAnsi="Times New Roman" w:cs="Times New Roman"/>
+                <w:b w:val="0"/>
+                <w:sz w:val="18"/>
+              </w:rPr>
+              <w:t>Görsel arama önbelleği ve görev tabanlı AI izleme</w:t>
+            </w:r>
+          </w:p>
+        </w:tc>
+        <w:tc>
+          <w:tcPr>
+            <w:tcW w:type="dxa" w:w="3515"/>
+            <w:vAlign w:val="center"/>
+            <w:tcMar>
+              <w:top w:w="80" w:type="dxa"/>
+              <w:start w:w="120" w:type="dxa"/>
+              <w:bottom w:w="80" w:type="dxa"/>
+              <w:end w:w="120" w:type="dxa"/>
+            </w:tcMar>
+          </w:tcPr>
+          <w:p>
+            <w:pPr>
+              <w:spacing w:after="0" w:line="240" w:lineRule="auto"/>
+              <w:ind w:firstLine="0"/>
+              <w:jc w:val="left"/>
+            </w:pPr>
+            <w:r>
+              <w:rPr>
+                <w:rFonts w:ascii="Times New Roman" w:hAnsi="Times New Roman" w:cs="Times New Roman"/>
+                <w:b w:val="0"/>
+                <w:sz w:val="18"/>
+              </w:rPr>
+              <w:t>Kuyruk sistemi ve arka plan işleyici</w:t>
+            </w:r>
+          </w:p>
+        </w:tc>
+      </w:tr>
+      <w:tr>
+        <w:tc>
+          <w:tcPr>
+            <w:tcW w:type="dxa" w:w="1984"/>
+            <w:vAlign w:val="center"/>
+            <w:tcMar>
+              <w:top w:w="80" w:type="dxa"/>
+              <w:start w:w="120" w:type="dxa"/>
+              <w:bottom w:w="80" w:type="dxa"/>
+              <w:end w:w="120" w:type="dxa"/>
+            </w:tcMar>
+          </w:tcPr>
+          <w:p>
+            <w:pPr>
+              <w:spacing w:after="0" w:line="240" w:lineRule="auto"/>
+              <w:ind w:firstLine="0"/>
+              <w:jc w:val="center"/>
+            </w:pPr>
+            <w:r>
+              <w:rPr>
+                <w:rFonts w:ascii="Times New Roman" w:hAnsi="Times New Roman" w:cs="Times New Roman"/>
+                <w:b w:val="0"/>
+                <w:sz w:val="18"/>
+              </w:rPr>
+              <w:t>Kullanılabilirlik</w:t>
+            </w:r>
+          </w:p>
+        </w:tc>
+        <w:tc>
+          <w:tcPr>
+            <w:tcW w:type="dxa" w:w="3402"/>
+            <w:vAlign w:val="center"/>
+            <w:tcMar>
+              <w:top w:w="80" w:type="dxa"/>
+              <w:start w:w="120" w:type="dxa"/>
+              <w:bottom w:w="80" w:type="dxa"/>
+              <w:end w:w="120" w:type="dxa"/>
+            </w:tcMar>
+          </w:tcPr>
+          <w:p>
+            <w:pPr>
+              <w:spacing w:after="0" w:line="240" w:lineRule="auto"/>
+              <w:ind w:firstLine="0"/>
+              <w:jc w:val="left"/>
+            </w:pPr>
+            <w:r>
+              <w:rPr>
+                <w:rFonts w:ascii="Times New Roman" w:hAnsi="Times New Roman" w:cs="Times New Roman"/>
+                <w:b w:val="0"/>
+                <w:sz w:val="18"/>
+              </w:rPr>
+              <w:t>Boş durum ekranları, net menü yapısı ve yönlendirici butonlar</w:t>
+            </w:r>
+          </w:p>
+        </w:tc>
+        <w:tc>
+          <w:tcPr>
+            <w:tcW w:type="dxa" w:w="3515"/>
+            <w:vAlign w:val="center"/>
+            <w:tcMar>
+              <w:top w:w="80" w:type="dxa"/>
+              <w:start w:w="120" w:type="dxa"/>
+              <w:bottom w:w="80" w:type="dxa"/>
+              <w:end w:w="120" w:type="dxa"/>
+            </w:tcMar>
+          </w:tcPr>
+          <w:p>
+            <w:pPr>
+              <w:spacing w:after="0" w:line="240" w:lineRule="auto"/>
+              <w:ind w:firstLine="0"/>
+              <w:jc w:val="left"/>
+            </w:pPr>
+            <w:r>
+              <w:rPr>
+                <w:rFonts w:ascii="Times New Roman" w:hAnsi="Times New Roman" w:cs="Times New Roman"/>
+                <w:b w:val="0"/>
+                <w:sz w:val="18"/>
+              </w:rPr>
+              <w:t>Kullanıcı testi ve erişilebilirlik iyileştirmeleri</w:t>
+            </w:r>
+          </w:p>
+        </w:tc>
+      </w:tr>
+      <w:tr>
+        <w:tc>
+          <w:tcPr>
+            <w:tcW w:type="dxa" w:w="1984"/>
+            <w:vAlign w:val="center"/>
+            <w:tcMar>
+              <w:top w:w="80" w:type="dxa"/>
+              <w:start w:w="120" w:type="dxa"/>
+              <w:bottom w:w="80" w:type="dxa"/>
+              <w:end w:w="120" w:type="dxa"/>
+            </w:tcMar>
+          </w:tcPr>
+          <w:p>
+            <w:pPr>
+              <w:spacing w:after="0" w:line="240" w:lineRule="auto"/>
+              <w:ind w:firstLine="0"/>
+              <w:jc w:val="center"/>
+            </w:pPr>
+            <w:r>
+              <w:rPr>
+                <w:rFonts w:ascii="Times New Roman" w:hAnsi="Times New Roman" w:cs="Times New Roman"/>
+                <w:b w:val="0"/>
+                <w:sz w:val="18"/>
+              </w:rPr>
+              <w:t>Sürdürülebilirlik</w:t>
+            </w:r>
+          </w:p>
+        </w:tc>
+        <w:tc>
+          <w:tcPr>
+            <w:tcW w:type="dxa" w:w="3402"/>
+            <w:vAlign w:val="center"/>
+            <w:tcMar>
+              <w:top w:w="80" w:type="dxa"/>
+              <w:start w:w="120" w:type="dxa"/>
+              <w:bottom w:w="80" w:type="dxa"/>
+              <w:end w:w="120" w:type="dxa"/>
+            </w:tcMar>
+          </w:tcPr>
+          <w:p>
+            <w:pPr>
+              <w:spacing w:after="0" w:line="240" w:lineRule="auto"/>
+              <w:ind w:firstLine="0"/>
+              <w:jc w:val="left"/>
+            </w:pPr>
+            <w:r>
+              <w:rPr>
+                <w:rFonts w:ascii="Times New Roman" w:hAnsi="Times New Roman" w:cs="Times New Roman"/>
+                <w:b w:val="0"/>
+                <w:sz w:val="18"/>
+              </w:rPr>
+              <w:t>Modüler route yapısı ve ortam değişkenleri</w:t>
+            </w:r>
+          </w:p>
+        </w:tc>
+        <w:tc>
+          <w:tcPr>
+            <w:tcW w:type="dxa" w:w="3515"/>
+            <w:vAlign w:val="center"/>
+            <w:tcMar>
+              <w:top w:w="80" w:type="dxa"/>
+              <w:start w:w="120" w:type="dxa"/>
+              <w:bottom w:w="80" w:type="dxa"/>
+              <w:end w:w="120" w:type="dxa"/>
+            </w:tcMar>
+          </w:tcPr>
+          <w:p>
+            <w:pPr>
+              <w:spacing w:after="0" w:line="240" w:lineRule="auto"/>
+              <w:ind w:firstLine="0"/>
+              <w:jc w:val="left"/>
+            </w:pPr>
+            <w:r>
+              <w:rPr>
+                <w:rFonts w:ascii="Times New Roman" w:hAnsi="Times New Roman" w:cs="Times New Roman"/>
+                <w:b w:val="0"/>
+                <w:sz w:val="18"/>
+              </w:rPr>
+              <w:t>Servis katmanı ve otomatik test kapsamı</w:t>
+            </w:r>
+          </w:p>
+        </w:tc>
+      </w:tr>
+      <w:tr>
+        <w:tc>
+          <w:tcPr>
+            <w:tcW w:type="dxa" w:w="1984"/>
+            <w:vAlign w:val="center"/>
+            <w:tcMar>
+              <w:top w:w="80" w:type="dxa"/>
+              <w:start w:w="120" w:type="dxa"/>
+              <w:bottom w:w="80" w:type="dxa"/>
+              <w:end w:w="120" w:type="dxa"/>
+            </w:tcMar>
+          </w:tcPr>
+          <w:p>
+            <w:pPr>
+              <w:spacing w:after="0" w:line="240" w:lineRule="auto"/>
+              <w:ind w:firstLine="0"/>
+              <w:jc w:val="center"/>
+            </w:pPr>
+            <w:r>
+              <w:rPr>
+                <w:rFonts w:ascii="Times New Roman" w:hAnsi="Times New Roman" w:cs="Times New Roman"/>
+                <w:b w:val="0"/>
+                <w:sz w:val="18"/>
+              </w:rPr>
+              <w:t>Genişletilebilirlik</w:t>
+            </w:r>
+          </w:p>
+        </w:tc>
+        <w:tc>
+          <w:tcPr>
+            <w:tcW w:type="dxa" w:w="3402"/>
+            <w:vAlign w:val="center"/>
+            <w:tcMar>
+              <w:top w:w="80" w:type="dxa"/>
+              <w:start w:w="120" w:type="dxa"/>
+              <w:bottom w:w="80" w:type="dxa"/>
+              <w:end w:w="120" w:type="dxa"/>
+            </w:tcMar>
+          </w:tcPr>
+          <w:p>
+            <w:pPr>
+              <w:spacing w:after="0" w:line="240" w:lineRule="auto"/>
+              <w:ind w:firstLine="0"/>
+              <w:jc w:val="left"/>
+            </w:pPr>
+            <w:r>
+              <w:rPr>
+                <w:rFonts w:ascii="Times New Roman" w:hAnsi="Times New Roman" w:cs="Times New Roman"/>
+                <w:b w:val="0"/>
+                <w:sz w:val="18"/>
+              </w:rPr>
+              <w:t>Ortak Model varlığı, chat ve sipariş ilişkileri</w:t>
+            </w:r>
+          </w:p>
+        </w:tc>
+        <w:tc>
+          <w:tcPr>
+            <w:tcW w:type="dxa" w:w="3515"/>
+            <w:vAlign w:val="center"/>
+            <w:tcMar>
+              <w:top w:w="80" w:type="dxa"/>
+              <w:start w:w="120" w:type="dxa"/>
+              <w:bottom w:w="80" w:type="dxa"/>
+              <w:end w:w="120" w:type="dxa"/>
+            </w:tcMar>
+          </w:tcPr>
+          <w:p>
+            <w:pPr>
+              <w:spacing w:after="0" w:line="240" w:lineRule="auto"/>
+              <w:ind w:firstLine="0"/>
+              <w:jc w:val="left"/>
+            </w:pPr>
+            <w:r>
+              <w:rPr>
+                <w:rFonts w:ascii="Times New Roman" w:hAnsi="Times New Roman" w:cs="Times New Roman"/>
+                <w:b w:val="0"/>
+                <w:sz w:val="18"/>
+              </w:rPr>
+              <w:t>Maliyet tahmini, ödeme ve kargo entegrasyonu</w:t>
+            </w:r>
+          </w:p>
+        </w:tc>
+      </w:tr>
+    </w:tbl>
+    <w:p>
+      <w:pPr>
+        <w:pStyle w:val="TezSource"/>
+      </w:pPr>
+      <w:r>
+        <w:rPr>
+          <w:rFonts w:ascii="Times New Roman" w:hAnsi="Times New Roman" w:cs="Times New Roman"/>
+          <w:sz w:val="20"/>
+        </w:rPr>
+        <w:t>Kaynak: Kalite değerlendirmesi ve proje geliştirme önerileri esas alınarak hazırlanmıştır.</w:t>
+      </w:r>
+    </w:p>
+    <w:p>
       <w:r>
         <w:br w:type="page"/>
       </w:r>
@@ -11473,6 +14201,809 @@
           <w:rFonts w:ascii="Times New Roman" w:hAnsi="Times New Roman" w:cs="Times New Roman"/>
         </w:rPr>
         <w:t>Bu nedenle projenin katkısı, yeni bir 3D üretim algoritması önermekten çok, mevcut AI ve web teknolojilerini 3D baskı hizmet sürecine bütünleşik şekilde uygulamasıdır. Tez kapsamında sunulan ekran görüntüleri, sistemin gerçek arayüz akışlarını desteklediğini ve projenin savunmada gösterilebilir bir yazılım çıktısı niteliği taşıdığını ortaya koymaktadır.</w:t>
+      </w:r>
+    </w:p>
+    <w:p>
+      <w:pPr>
+        <w:pStyle w:val="TezHeading"/>
+      </w:pPr>
+      <w:r>
+        <w:rPr>
+          <w:rFonts w:ascii="Times New Roman" w:hAnsi="Times New Roman" w:cs="Times New Roman"/>
+          <w:b/>
+          <w:sz w:val="24"/>
+        </w:rPr>
+        <w:t>3.7. Demo ve Kabul Değerlendirmesi</w:t>
+      </w:r>
+    </w:p>
+    <w:p>
+      <w:pPr>
+        <w:pStyle w:val="TezBody"/>
+      </w:pPr>
+      <w:r>
+        <w:rPr>
+          <w:rFonts w:ascii="Times New Roman" w:hAnsi="Times New Roman" w:cs="Times New Roman"/>
+        </w:rPr>
+        <w:t>Bitirme projesinin kabul edilebilirliği açısından çalışan demo, tez metnindeki mimari açıklamaların gerçek sistem üzerinde karşılığının bulunduğunu göstermelidir. Bu nedenle PrintForge için önerilen demo akışı yalnızca ekranların sırasıyla açılmasından ibaret değildir; her ekranın hangi araştırma sorusuna, hangi modüle ve hangi kullanıcı ihtiyacına karşılık geldiği açıklanmalıdır.</w:t>
+      </w:r>
+    </w:p>
+    <w:p>
+      <w:pPr>
+        <w:pStyle w:val="TezBody"/>
+      </w:pPr>
+      <w:r>
+        <w:rPr>
+          <w:rFonts w:ascii="Times New Roman" w:hAnsi="Times New Roman" w:cs="Times New Roman"/>
+        </w:rPr>
+        <w:t>Savunmada ilk gösterilmesi gereken ekran ana sayfadır. Ana sayfa, platformun iki ana değer önerisini aynı anda sunmaktadır: kullanıcı hazır katalog ürünlerini inceleyebilir veya AI ile yeni model fikri oluşturabilir. Bu ekran, tezin problem tanımında belirtilen dağınık hizmet akışlarını tek platformda toplama hedefini görsel olarak kanıtlar.</w:t>
+      </w:r>
+    </w:p>
+    <w:p>
+      <w:pPr>
+        <w:pStyle w:val="TezBody"/>
+      </w:pPr>
+      <w:r>
+        <w:rPr>
+          <w:rFonts w:ascii="Times New Roman" w:hAnsi="Times New Roman" w:cs="Times New Roman"/>
+        </w:rPr>
+        <w:t>İkinci adımda örnekler ve görsel arama ekranı gösterilmelidir. Bu ekran, teknik modelleme bilgisi olmayan kullanıcının üretim fikri bulmasını kolaylaştırır. Kullanıcının 'vazo' gibi basit bir arama ile referans görsellere ulaşması ve bu görsellerin AI üretim sürecine bağlanabilmesi, çalışmanın kullanılabilirlik katkısını somutlaştırır.</w:t>
+      </w:r>
+    </w:p>
+    <w:p>
+      <w:pPr>
+        <w:pStyle w:val="TezBody"/>
+      </w:pPr>
+      <w:r>
+        <w:rPr>
+          <w:rFonts w:ascii="Times New Roman" w:hAnsi="Times New Roman" w:cs="Times New Roman"/>
+        </w:rPr>
+        <w:t>Üçüncü adım AI model üretim ekranıdır. Bu ekranda referans görsel, model açıklaması ve önceki üretimler birlikte görülür. Demo sırasında üretim servisinin anlık olarak sonuç vermesi zorunlu değildir; önemli olan görev tabanlı üretim mantığının, referans görsel kullanımının ve üretim geçmişi yaklaşımının açıklanmasıdır. Böylece dış servis gecikmesi projenin ana değerini gölgelememiş olur.</w:t>
+      </w:r>
+    </w:p>
+    <w:p>
+      <w:pPr>
+        <w:pStyle w:val="TezBody"/>
+      </w:pPr>
+      <w:r>
+        <w:rPr>
+          <w:rFonts w:ascii="Times New Roman" w:hAnsi="Times New Roman" w:cs="Times New Roman"/>
+        </w:rPr>
+        <w:t>Dördüncü adım katalog ve satıcı ürün ekleme ekranlarıdır. Katalog ekranı, ürünlerin arama, kategori ve fiyat bilgisiyle sunulduğunu gösterir. Satıcı ürün ekleme ekranı ise ürün adı, açıklama, kategori, fiyat ve görsellerin tek form üzerinden yönetilebildiğini kanıtlar. Bu iki ekran birlikte gösterildiğinde platformun yalnızca AI üretim aracı değil, aynı zamanda pazaryeri altyapısı olduğu anlaşılır.</w:t>
+      </w:r>
+    </w:p>
+    <w:p>
+      <w:pPr>
+        <w:pStyle w:val="TezBody"/>
+      </w:pPr>
+      <w:r>
+        <w:rPr>
+          <w:rFonts w:ascii="Times New Roman" w:hAnsi="Times New Roman" w:cs="Times New Roman"/>
+        </w:rPr>
+        <w:t>Beşinci adım mesajlaşma ve sipariş takibi ekranlarıdır. Bu ekranlar, kullanıcının bir ürün veya AI modeli hakkında satıcıyla iletişime geçebildiğini ve üretim sürecinin sipariş durumlarıyla takip edilebildiğini gösterir. Mesajlar ekranının sipariş ekranından ayrılması, bilgi alma konuşmaları ile aktif üretim takibinin birbirine karışmasını azaltan bilinçli bir tasarım kararıdır.</w:t>
+      </w:r>
+    </w:p>
+    <w:p>
+      <w:pPr>
+        <w:pStyle w:val="TezBody"/>
+      </w:pPr>
+      <w:r>
+        <w:rPr>
+          <w:rFonts w:ascii="Times New Roman" w:hAnsi="Times New Roman" w:cs="Times New Roman"/>
+        </w:rPr>
+        <w:t>Demo değerlendirmesinde güvenlik kararları da ayrıca açıklanmalıdır. API anahtarlarının frontend tarafına taşınmaması, JWT tabanlı oturum yönetimi, Zod doğrulama şemaları ve model dosyası erişim kontrolü projenin yalnızca görsel olarak çalışan bir arayüz değil, temel güvenlik ilkelerini dikkate alan bir yazılım çıktısı olduğunu gösterir.</w:t>
+      </w:r>
+    </w:p>
+    <w:p>
+      <w:pPr>
+        <w:pStyle w:val="TezBody"/>
+      </w:pPr>
+      <w:r>
+        <w:rPr>
+          <w:rFonts w:ascii="Times New Roman" w:hAnsi="Times New Roman" w:cs="Times New Roman"/>
+        </w:rPr>
+        <w:t>Kabul açısından bir diğer önemli nokta sınırlılıkların açıkça belirtilmesidir. PrintForge gerçek ödeme, kargo ve otomatik baskı uygunluk analizi entegrasyonlarını bu çalışma kapsamında tamamlamamıştır. Ancak bu sınırlılıklar saklanmamış; sonuç ve tartışma bölümlerinde gelecek çalışma önerileriyle birlikte açıklanmıştır. Akademik değerlendirmede bu açıklık, projenin kapsamının gerçekçi biçimde belirlendiğini gösterir.</w:t>
+      </w:r>
+    </w:p>
+    <w:p>
+      <w:pPr>
+        <w:pStyle w:val="TezBody"/>
+      </w:pPr>
+      <w:r>
+        <w:rPr>
+          <w:rFonts w:ascii="Times New Roman" w:hAnsi="Times New Roman" w:cs="Times New Roman"/>
+        </w:rPr>
+        <w:t>Son olarak demo sırasında kullanılan ekran görüntüleri ve tezdeki şekiller birbirini desteklemelidir. Tezde yer alan mimari şemalar sistemin arka planını, ekran görüntüleri ise kullanıcıya görünen yüzünü açıklar. Bu iki kanıt türünün birlikte verilmesi, çalışmanın hem teknik hem de kullanılabilirlik açısından savunulabilir olmasını sağlar.</w:t>
+      </w:r>
+    </w:p>
+    <w:p>
+      <w:pPr>
+        <w:pStyle w:val="TezTableCaption"/>
+      </w:pPr>
+      <w:r>
+        <w:rPr>
+          <w:rFonts w:ascii="Times New Roman" w:hAnsi="Times New Roman" w:cs="Times New Roman"/>
+          <w:sz w:val="24"/>
+        </w:rPr>
+        <w:t>Tablo 3.4. Savunma demosu ve kanıt matrisi</w:t>
+      </w:r>
+    </w:p>
+    <w:tbl>
+      <w:tblPr>
+        <w:tblStyle w:val="TableGrid"/>
+        <w:tblW w:type="dxa" w:w="8957"/>
+        <w:jc w:val="center"/>
+        <w:tblLayout w:type="fixed"/>
+        <w:tblLook w:firstColumn="1" w:firstRow="1" w:lastColumn="0" w:lastRow="0" w:noHBand="0" w:noVBand="1" w:val="04A0"/>
+      </w:tblPr>
+      <w:tblGrid>
+        <w:gridCol w:w="1247"/>
+        <w:gridCol w:w="2721"/>
+        <w:gridCol w:w="4989"/>
+      </w:tblGrid>
+      <w:tr>
+        <w:trPr>
+          <w:tblHeader w:val="true"/>
+        </w:trPr>
+        <w:tc>
+          <w:tcPr>
+            <w:tcW w:type="dxa" w:w="1247"/>
+            <w:vAlign w:val="center"/>
+            <w:tcMar>
+              <w:top w:w="80" w:type="dxa"/>
+              <w:start w:w="120" w:type="dxa"/>
+              <w:bottom w:w="80" w:type="dxa"/>
+              <w:end w:w="120" w:type="dxa"/>
+            </w:tcMar>
+            <w:shd w:fill="EDEDED"/>
+          </w:tcPr>
+          <w:p>
+            <w:pPr>
+              <w:spacing w:after="0" w:line="240" w:lineRule="auto"/>
+              <w:ind w:firstLine="0"/>
+              <w:jc w:val="center"/>
+            </w:pPr>
+            <w:r>
+              <w:rPr>
+                <w:rFonts w:ascii="Times New Roman" w:hAnsi="Times New Roman" w:cs="Times New Roman"/>
+                <w:b/>
+                <w:sz w:val="18"/>
+              </w:rPr>
+              <w:t>Demo adımı</w:t>
+            </w:r>
+          </w:p>
+        </w:tc>
+        <w:tc>
+          <w:tcPr>
+            <w:tcW w:type="dxa" w:w="2721"/>
+            <w:vAlign w:val="center"/>
+            <w:tcMar>
+              <w:top w:w="80" w:type="dxa"/>
+              <w:start w:w="120" w:type="dxa"/>
+              <w:bottom w:w="80" w:type="dxa"/>
+              <w:end w:w="120" w:type="dxa"/>
+            </w:tcMar>
+            <w:shd w:fill="EDEDED"/>
+          </w:tcPr>
+          <w:p>
+            <w:pPr>
+              <w:spacing w:after="0" w:line="240" w:lineRule="auto"/>
+              <w:ind w:firstLine="0"/>
+              <w:jc w:val="left"/>
+            </w:pPr>
+            <w:r>
+              <w:rPr>
+                <w:rFonts w:ascii="Times New Roman" w:hAnsi="Times New Roman" w:cs="Times New Roman"/>
+                <w:b/>
+                <w:sz w:val="18"/>
+              </w:rPr>
+              <w:t>Gösterilecek ekran</w:t>
+            </w:r>
+          </w:p>
+        </w:tc>
+        <w:tc>
+          <w:tcPr>
+            <w:tcW w:type="dxa" w:w="4989"/>
+            <w:vAlign w:val="center"/>
+            <w:tcMar>
+              <w:top w:w="80" w:type="dxa"/>
+              <w:start w:w="120" w:type="dxa"/>
+              <w:bottom w:w="80" w:type="dxa"/>
+              <w:end w:w="120" w:type="dxa"/>
+            </w:tcMar>
+            <w:shd w:fill="EDEDED"/>
+          </w:tcPr>
+          <w:p>
+            <w:pPr>
+              <w:spacing w:after="0" w:line="240" w:lineRule="auto"/>
+              <w:ind w:firstLine="0"/>
+              <w:jc w:val="left"/>
+            </w:pPr>
+            <w:r>
+              <w:rPr>
+                <w:rFonts w:ascii="Times New Roman" w:hAnsi="Times New Roman" w:cs="Times New Roman"/>
+                <w:b/>
+                <w:sz w:val="18"/>
+              </w:rPr>
+              <w:t>Kanıtladığı tez iddiası</w:t>
+            </w:r>
+          </w:p>
+        </w:tc>
+      </w:tr>
+      <w:tr>
+        <w:tc>
+          <w:tcPr>
+            <w:tcW w:type="dxa" w:w="1247"/>
+            <w:vAlign w:val="center"/>
+            <w:tcMar>
+              <w:top w:w="80" w:type="dxa"/>
+              <w:start w:w="120" w:type="dxa"/>
+              <w:bottom w:w="80" w:type="dxa"/>
+              <w:end w:w="120" w:type="dxa"/>
+            </w:tcMar>
+          </w:tcPr>
+          <w:p>
+            <w:pPr>
+              <w:spacing w:after="0" w:line="240" w:lineRule="auto"/>
+              <w:ind w:firstLine="0"/>
+              <w:jc w:val="center"/>
+            </w:pPr>
+            <w:r>
+              <w:rPr>
+                <w:rFonts w:ascii="Times New Roman" w:hAnsi="Times New Roman" w:cs="Times New Roman"/>
+                <w:b w:val="0"/>
+                <w:sz w:val="18"/>
+              </w:rPr>
+              <w:t>1</w:t>
+            </w:r>
+          </w:p>
+        </w:tc>
+        <w:tc>
+          <w:tcPr>
+            <w:tcW w:type="dxa" w:w="2721"/>
+            <w:vAlign w:val="center"/>
+            <w:tcMar>
+              <w:top w:w="80" w:type="dxa"/>
+              <w:start w:w="120" w:type="dxa"/>
+              <w:bottom w:w="80" w:type="dxa"/>
+              <w:end w:w="120" w:type="dxa"/>
+            </w:tcMar>
+          </w:tcPr>
+          <w:p>
+            <w:pPr>
+              <w:spacing w:after="0" w:line="240" w:lineRule="auto"/>
+              <w:ind w:firstLine="0"/>
+              <w:jc w:val="center"/>
+            </w:pPr>
+            <w:r>
+              <w:rPr>
+                <w:rFonts w:ascii="Times New Roman" w:hAnsi="Times New Roman" w:cs="Times New Roman"/>
+                <w:b w:val="0"/>
+                <w:sz w:val="18"/>
+              </w:rPr>
+              <w:t>Ana sayfa</w:t>
+            </w:r>
+          </w:p>
+        </w:tc>
+        <w:tc>
+          <w:tcPr>
+            <w:tcW w:type="dxa" w:w="4989"/>
+            <w:vAlign w:val="center"/>
+            <w:tcMar>
+              <w:top w:w="80" w:type="dxa"/>
+              <w:start w:w="120" w:type="dxa"/>
+              <w:bottom w:w="80" w:type="dxa"/>
+              <w:end w:w="120" w:type="dxa"/>
+            </w:tcMar>
+          </w:tcPr>
+          <w:p>
+            <w:pPr>
+              <w:spacing w:after="0" w:line="240" w:lineRule="auto"/>
+              <w:ind w:firstLine="0"/>
+              <w:jc w:val="left"/>
+            </w:pPr>
+            <w:r>
+              <w:rPr>
+                <w:rFonts w:ascii="Times New Roman" w:hAnsi="Times New Roman" w:cs="Times New Roman"/>
+                <w:b w:val="0"/>
+                <w:sz w:val="18"/>
+              </w:rPr>
+              <w:t>Platform katalog ve AI üretim akışlarını tek girişte birleştirir.</w:t>
+            </w:r>
+          </w:p>
+        </w:tc>
+      </w:tr>
+      <w:tr>
+        <w:tc>
+          <w:tcPr>
+            <w:tcW w:type="dxa" w:w="1247"/>
+            <w:vAlign w:val="center"/>
+            <w:tcMar>
+              <w:top w:w="80" w:type="dxa"/>
+              <w:start w:w="120" w:type="dxa"/>
+              <w:bottom w:w="80" w:type="dxa"/>
+              <w:end w:w="120" w:type="dxa"/>
+            </w:tcMar>
+          </w:tcPr>
+          <w:p>
+            <w:pPr>
+              <w:spacing w:after="0" w:line="240" w:lineRule="auto"/>
+              <w:ind w:firstLine="0"/>
+              <w:jc w:val="center"/>
+            </w:pPr>
+            <w:r>
+              <w:rPr>
+                <w:rFonts w:ascii="Times New Roman" w:hAnsi="Times New Roman" w:cs="Times New Roman"/>
+                <w:b w:val="0"/>
+                <w:sz w:val="18"/>
+              </w:rPr>
+              <w:t>2</w:t>
+            </w:r>
+          </w:p>
+        </w:tc>
+        <w:tc>
+          <w:tcPr>
+            <w:tcW w:type="dxa" w:w="2721"/>
+            <w:vAlign w:val="center"/>
+            <w:tcMar>
+              <w:top w:w="80" w:type="dxa"/>
+              <w:start w:w="120" w:type="dxa"/>
+              <w:bottom w:w="80" w:type="dxa"/>
+              <w:end w:w="120" w:type="dxa"/>
+            </w:tcMar>
+          </w:tcPr>
+          <w:p>
+            <w:pPr>
+              <w:spacing w:after="0" w:line="240" w:lineRule="auto"/>
+              <w:ind w:firstLine="0"/>
+              <w:jc w:val="left"/>
+            </w:pPr>
+            <w:r>
+              <w:rPr>
+                <w:rFonts w:ascii="Times New Roman" w:hAnsi="Times New Roman" w:cs="Times New Roman"/>
+                <w:b w:val="0"/>
+                <w:sz w:val="18"/>
+              </w:rPr>
+              <w:t>Örnekler ve görsel arama</w:t>
+            </w:r>
+          </w:p>
+        </w:tc>
+        <w:tc>
+          <w:tcPr>
+            <w:tcW w:type="dxa" w:w="4989"/>
+            <w:vAlign w:val="center"/>
+            <w:tcMar>
+              <w:top w:w="80" w:type="dxa"/>
+              <w:start w:w="120" w:type="dxa"/>
+              <w:bottom w:w="80" w:type="dxa"/>
+              <w:end w:w="120" w:type="dxa"/>
+            </w:tcMar>
+          </w:tcPr>
+          <w:p>
+            <w:pPr>
+              <w:spacing w:after="0" w:line="240" w:lineRule="auto"/>
+              <w:ind w:firstLine="0"/>
+              <w:jc w:val="left"/>
+            </w:pPr>
+            <w:r>
+              <w:rPr>
+                <w:rFonts w:ascii="Times New Roman" w:hAnsi="Times New Roman" w:cs="Times New Roman"/>
+                <w:b w:val="0"/>
+                <w:sz w:val="18"/>
+              </w:rPr>
+              <w:t>Kullanıcı modelleme bilgisi olmadan üretim fikri bulabilir.</w:t>
+            </w:r>
+          </w:p>
+        </w:tc>
+      </w:tr>
+      <w:tr>
+        <w:tc>
+          <w:tcPr>
+            <w:tcW w:type="dxa" w:w="1247"/>
+            <w:vAlign w:val="center"/>
+            <w:tcMar>
+              <w:top w:w="80" w:type="dxa"/>
+              <w:start w:w="120" w:type="dxa"/>
+              <w:bottom w:w="80" w:type="dxa"/>
+              <w:end w:w="120" w:type="dxa"/>
+            </w:tcMar>
+          </w:tcPr>
+          <w:p>
+            <w:pPr>
+              <w:spacing w:after="0" w:line="240" w:lineRule="auto"/>
+              <w:ind w:firstLine="0"/>
+              <w:jc w:val="center"/>
+            </w:pPr>
+            <w:r>
+              <w:rPr>
+                <w:rFonts w:ascii="Times New Roman" w:hAnsi="Times New Roman" w:cs="Times New Roman"/>
+                <w:b w:val="0"/>
+                <w:sz w:val="18"/>
+              </w:rPr>
+              <w:t>3</w:t>
+            </w:r>
+          </w:p>
+        </w:tc>
+        <w:tc>
+          <w:tcPr>
+            <w:tcW w:type="dxa" w:w="2721"/>
+            <w:vAlign w:val="center"/>
+            <w:tcMar>
+              <w:top w:w="80" w:type="dxa"/>
+              <w:start w:w="120" w:type="dxa"/>
+              <w:bottom w:w="80" w:type="dxa"/>
+              <w:end w:w="120" w:type="dxa"/>
+            </w:tcMar>
+          </w:tcPr>
+          <w:p>
+            <w:pPr>
+              <w:spacing w:after="0" w:line="240" w:lineRule="auto"/>
+              <w:ind w:firstLine="0"/>
+              <w:jc w:val="left"/>
+            </w:pPr>
+            <w:r>
+              <w:rPr>
+                <w:rFonts w:ascii="Times New Roman" w:hAnsi="Times New Roman" w:cs="Times New Roman"/>
+                <w:b w:val="0"/>
+                <w:sz w:val="18"/>
+              </w:rPr>
+              <w:t>AI model üretim ekranı</w:t>
+            </w:r>
+          </w:p>
+        </w:tc>
+        <w:tc>
+          <w:tcPr>
+            <w:tcW w:type="dxa" w:w="4989"/>
+            <w:vAlign w:val="center"/>
+            <w:tcMar>
+              <w:top w:w="80" w:type="dxa"/>
+              <w:start w:w="120" w:type="dxa"/>
+              <w:bottom w:w="80" w:type="dxa"/>
+              <w:end w:w="120" w:type="dxa"/>
+            </w:tcMar>
+          </w:tcPr>
+          <w:p>
+            <w:pPr>
+              <w:spacing w:after="0" w:line="240" w:lineRule="auto"/>
+              <w:ind w:firstLine="0"/>
+              <w:jc w:val="left"/>
+            </w:pPr>
+            <w:r>
+              <w:rPr>
+                <w:rFonts w:ascii="Times New Roman" w:hAnsi="Times New Roman" w:cs="Times New Roman"/>
+                <w:b w:val="0"/>
+                <w:sz w:val="18"/>
+              </w:rPr>
+              <w:t>Referans görsel ve açıklama üretim görevine dönüştürülebilir.</w:t>
+            </w:r>
+          </w:p>
+        </w:tc>
+      </w:tr>
+      <w:tr>
+        <w:tc>
+          <w:tcPr>
+            <w:tcW w:type="dxa" w:w="1247"/>
+            <w:vAlign w:val="center"/>
+            <w:tcMar>
+              <w:top w:w="80" w:type="dxa"/>
+              <w:start w:w="120" w:type="dxa"/>
+              <w:bottom w:w="80" w:type="dxa"/>
+              <w:end w:w="120" w:type="dxa"/>
+            </w:tcMar>
+          </w:tcPr>
+          <w:p>
+            <w:pPr>
+              <w:spacing w:after="0" w:line="240" w:lineRule="auto"/>
+              <w:ind w:firstLine="0"/>
+              <w:jc w:val="center"/>
+            </w:pPr>
+            <w:r>
+              <w:rPr>
+                <w:rFonts w:ascii="Times New Roman" w:hAnsi="Times New Roman" w:cs="Times New Roman"/>
+                <w:b w:val="0"/>
+                <w:sz w:val="18"/>
+              </w:rPr>
+              <w:t>4</w:t>
+            </w:r>
+          </w:p>
+        </w:tc>
+        <w:tc>
+          <w:tcPr>
+            <w:tcW w:type="dxa" w:w="2721"/>
+            <w:vAlign w:val="center"/>
+            <w:tcMar>
+              <w:top w:w="80" w:type="dxa"/>
+              <w:start w:w="120" w:type="dxa"/>
+              <w:bottom w:w="80" w:type="dxa"/>
+              <w:end w:w="120" w:type="dxa"/>
+            </w:tcMar>
+          </w:tcPr>
+          <w:p>
+            <w:pPr>
+              <w:spacing w:after="0" w:line="240" w:lineRule="auto"/>
+              <w:ind w:firstLine="0"/>
+              <w:jc w:val="left"/>
+            </w:pPr>
+            <w:r>
+              <w:rPr>
+                <w:rFonts w:ascii="Times New Roman" w:hAnsi="Times New Roman" w:cs="Times New Roman"/>
+                <w:b w:val="0"/>
+                <w:sz w:val="18"/>
+              </w:rPr>
+              <w:t>Katalog ve satıcı ürün ekleme</w:t>
+            </w:r>
+          </w:p>
+        </w:tc>
+        <w:tc>
+          <w:tcPr>
+            <w:tcW w:type="dxa" w:w="4989"/>
+            <w:vAlign w:val="center"/>
+            <w:tcMar>
+              <w:top w:w="80" w:type="dxa"/>
+              <w:start w:w="120" w:type="dxa"/>
+              <w:bottom w:w="80" w:type="dxa"/>
+              <w:end w:w="120" w:type="dxa"/>
+            </w:tcMar>
+          </w:tcPr>
+          <w:p>
+            <w:pPr>
+              <w:spacing w:after="0" w:line="240" w:lineRule="auto"/>
+              <w:ind w:firstLine="0"/>
+              <w:jc w:val="left"/>
+            </w:pPr>
+            <w:r>
+              <w:rPr>
+                <w:rFonts w:ascii="Times New Roman" w:hAnsi="Times New Roman" w:cs="Times New Roman"/>
+                <w:b w:val="0"/>
+                <w:sz w:val="18"/>
+              </w:rPr>
+              <w:t>Sistem pazaryeri işlevi ve satıcı operasyonu destekler.</w:t>
+            </w:r>
+          </w:p>
+        </w:tc>
+      </w:tr>
+      <w:tr>
+        <w:tc>
+          <w:tcPr>
+            <w:tcW w:type="dxa" w:w="1247"/>
+            <w:vAlign w:val="center"/>
+            <w:tcMar>
+              <w:top w:w="80" w:type="dxa"/>
+              <w:start w:w="120" w:type="dxa"/>
+              <w:bottom w:w="80" w:type="dxa"/>
+              <w:end w:w="120" w:type="dxa"/>
+            </w:tcMar>
+          </w:tcPr>
+          <w:p>
+            <w:pPr>
+              <w:spacing w:after="0" w:line="240" w:lineRule="auto"/>
+              <w:ind w:firstLine="0"/>
+              <w:jc w:val="center"/>
+            </w:pPr>
+            <w:r>
+              <w:rPr>
+                <w:rFonts w:ascii="Times New Roman" w:hAnsi="Times New Roman" w:cs="Times New Roman"/>
+                <w:b w:val="0"/>
+                <w:sz w:val="18"/>
+              </w:rPr>
+              <w:t>5</w:t>
+            </w:r>
+          </w:p>
+        </w:tc>
+        <w:tc>
+          <w:tcPr>
+            <w:tcW w:type="dxa" w:w="2721"/>
+            <w:vAlign w:val="center"/>
+            <w:tcMar>
+              <w:top w:w="80" w:type="dxa"/>
+              <w:start w:w="120" w:type="dxa"/>
+              <w:bottom w:w="80" w:type="dxa"/>
+              <w:end w:w="120" w:type="dxa"/>
+            </w:tcMar>
+          </w:tcPr>
+          <w:p>
+            <w:pPr>
+              <w:spacing w:after="0" w:line="240" w:lineRule="auto"/>
+              <w:ind w:firstLine="0"/>
+              <w:jc w:val="left"/>
+            </w:pPr>
+            <w:r>
+              <w:rPr>
+                <w:rFonts w:ascii="Times New Roman" w:hAnsi="Times New Roman" w:cs="Times New Roman"/>
+                <w:b w:val="0"/>
+                <w:sz w:val="18"/>
+              </w:rPr>
+              <w:t>Mesajlar ve siparişler</w:t>
+            </w:r>
+          </w:p>
+        </w:tc>
+        <w:tc>
+          <w:tcPr>
+            <w:tcW w:type="dxa" w:w="4989"/>
+            <w:vAlign w:val="center"/>
+            <w:tcMar>
+              <w:top w:w="80" w:type="dxa"/>
+              <w:start w:w="120" w:type="dxa"/>
+              <w:bottom w:w="80" w:type="dxa"/>
+              <w:end w:w="120" w:type="dxa"/>
+            </w:tcMar>
+          </w:tcPr>
+          <w:p>
+            <w:pPr>
+              <w:spacing w:after="0" w:line="240" w:lineRule="auto"/>
+              <w:ind w:firstLine="0"/>
+              <w:jc w:val="left"/>
+            </w:pPr>
+            <w:r>
+              <w:rPr>
+                <w:rFonts w:ascii="Times New Roman" w:hAnsi="Times New Roman" w:cs="Times New Roman"/>
+                <w:b w:val="0"/>
+                <w:sz w:val="18"/>
+              </w:rPr>
+              <w:t>Alıcı-satıcı iletişimi ve sipariş durumu izlenebilir.</w:t>
+            </w:r>
+          </w:p>
+        </w:tc>
+      </w:tr>
+      <w:tr>
+        <w:tc>
+          <w:tcPr>
+            <w:tcW w:type="dxa" w:w="1247"/>
+            <w:vAlign w:val="center"/>
+            <w:tcMar>
+              <w:top w:w="80" w:type="dxa"/>
+              <w:start w:w="120" w:type="dxa"/>
+              <w:bottom w:w="80" w:type="dxa"/>
+              <w:end w:w="120" w:type="dxa"/>
+            </w:tcMar>
+          </w:tcPr>
+          <w:p>
+            <w:pPr>
+              <w:spacing w:after="0" w:line="240" w:lineRule="auto"/>
+              <w:ind w:firstLine="0"/>
+              <w:jc w:val="center"/>
+            </w:pPr>
+            <w:r>
+              <w:rPr>
+                <w:rFonts w:ascii="Times New Roman" w:hAnsi="Times New Roman" w:cs="Times New Roman"/>
+                <w:b w:val="0"/>
+                <w:sz w:val="18"/>
+              </w:rPr>
+              <w:t>6</w:t>
+            </w:r>
+          </w:p>
+        </w:tc>
+        <w:tc>
+          <w:tcPr>
+            <w:tcW w:type="dxa" w:w="2721"/>
+            <w:vAlign w:val="center"/>
+            <w:tcMar>
+              <w:top w:w="80" w:type="dxa"/>
+              <w:start w:w="120" w:type="dxa"/>
+              <w:bottom w:w="80" w:type="dxa"/>
+              <w:end w:w="120" w:type="dxa"/>
+            </w:tcMar>
+          </w:tcPr>
+          <w:p>
+            <w:pPr>
+              <w:spacing w:after="0" w:line="240" w:lineRule="auto"/>
+              <w:ind w:firstLine="0"/>
+              <w:jc w:val="left"/>
+            </w:pPr>
+            <w:r>
+              <w:rPr>
+                <w:rFonts w:ascii="Times New Roman" w:hAnsi="Times New Roman" w:cs="Times New Roman"/>
+                <w:b w:val="0"/>
+                <w:sz w:val="18"/>
+              </w:rPr>
+              <w:t>Mimari ve veri modeli açıklaması</w:t>
+            </w:r>
+          </w:p>
+        </w:tc>
+        <w:tc>
+          <w:tcPr>
+            <w:tcW w:type="dxa" w:w="4989"/>
+            <w:vAlign w:val="center"/>
+            <w:tcMar>
+              <w:top w:w="80" w:type="dxa"/>
+              <w:start w:w="120" w:type="dxa"/>
+              <w:bottom w:w="80" w:type="dxa"/>
+              <w:end w:w="120" w:type="dxa"/>
+            </w:tcMar>
+          </w:tcPr>
+          <w:p>
+            <w:pPr>
+              <w:spacing w:after="0" w:line="240" w:lineRule="auto"/>
+              <w:ind w:firstLine="0"/>
+              <w:jc w:val="left"/>
+            </w:pPr>
+            <w:r>
+              <w:rPr>
+                <w:rFonts w:ascii="Times New Roman" w:hAnsi="Times New Roman" w:cs="Times New Roman"/>
+                <w:b w:val="0"/>
+                <w:sz w:val="18"/>
+              </w:rPr>
+              <w:t>Arayüzde görülen akışların backend ve veritabanı karşılığı vardır.</w:t>
+            </w:r>
+          </w:p>
+        </w:tc>
+      </w:tr>
+    </w:tbl>
+    <w:p>
+      <w:pPr>
+        <w:pStyle w:val="TezSource"/>
+      </w:pPr>
+      <w:r>
+        <w:rPr>
+          <w:rFonts w:ascii="Times New Roman" w:hAnsi="Times New Roman" w:cs="Times New Roman"/>
+          <w:sz w:val="20"/>
+        </w:rPr>
+        <w:t>Kaynak: Tez bulguları, ekran görüntüleri ve önerilen savunma akışı esas alınarak hazırlanmıştır.</w:t>
+      </w:r>
+    </w:p>
+    <w:p>
+      <w:pPr>
+        <w:pStyle w:val="TezBody"/>
+      </w:pPr>
+      <w:r>
+        <w:rPr>
+          <w:rFonts w:ascii="Times New Roman" w:hAnsi="Times New Roman" w:cs="Times New Roman"/>
+        </w:rPr>
+        <w:t>Bu demo matrisi, savunma sırasında anlatımın dağılmasını önlemek için hazırlanmıştır. Bitirme projelerinde en sık görülen sorunlardan biri, çalışan ekranların gösterilmesine rağmen bu ekranların tezdeki problem tanımıyla ilişkilendirilememesidir. PrintForge için önerilen sıra, önce problemin kullanıcıya görünen yüzünü, sonra üretim ve pazaryeri akışını, en sonunda da teknik mimariyi açıklayacak biçimde düzenlenmiştir.</w:t>
+      </w:r>
+    </w:p>
+    <w:p>
+      <w:pPr>
+        <w:pStyle w:val="TezBody"/>
+      </w:pPr>
+      <w:r>
+        <w:rPr>
+          <w:rFonts w:ascii="Times New Roman" w:hAnsi="Times New Roman" w:cs="Times New Roman"/>
+        </w:rPr>
+        <w:t>Jüri değerlendirmesinde ana sayfa ve katalog ekranı, projenin kullanıcı deneyimi yönünü kanıtlar. Örnekler ve AI üretim ekranları, çalışmanın yapay zeka destekli 3D model üretimi boyutunu gösterir. Satıcı paneli, ürün ekleme, mesajlar ve siparişler ekranları ise projenin yalnızca tek kullanıcılı bir prototip olmadığını, satıcı-alıcı etkileşimini destekleyen iki taraflı bir platform olarak tasarlandığını ortaya koyar.</w:t>
+      </w:r>
+    </w:p>
+    <w:p>
+      <w:pPr>
+        <w:pStyle w:val="TezBody"/>
+      </w:pPr>
+      <w:r>
+        <w:rPr>
+          <w:rFonts w:ascii="Times New Roman" w:hAnsi="Times New Roman" w:cs="Times New Roman"/>
+        </w:rPr>
+        <w:t>Teknik mimari açıklanırken frontend ve backend ayrımının neden yapıldığı özellikle vurgulanmalıdır. Frontend kullanıcı etkileşimini, yönlendirmeyi, 3D önizlemeyi ve durum gösterimini üstlenirken; backend kimlik doğrulama, veri doğrulama, servis anahtarlarını koruma, harici servis çağrıları ve dosya erişim kontrolü gibi güvenlik açısından kritik işleri yürütür. Bu ayrım, projenin yalnızca görsel bir arayüz değil, katmanlı bir yazılım sistemi olduğunu gösterir.</w:t>
+      </w:r>
+    </w:p>
+    <w:p>
+      <w:pPr>
+        <w:pStyle w:val="TezBody"/>
+      </w:pPr>
+      <w:r>
+        <w:rPr>
+          <w:rFonts w:ascii="Times New Roman" w:hAnsi="Times New Roman" w:cs="Times New Roman"/>
+        </w:rPr>
+        <w:t>Kabul olgunluğu açısından projenin güçlü tarafı, her modülün başka bir modülle ilişkili olmasıdır. Örnek görsel araması AI üretim ekranına, AI çıktısı satıcıyla mesajlaşmaya, katalog ürünü sepet ve favorilere, mesajlaşma ise sipariş durumuna bağlanmaktadır. Bu bağlantılar sayesinde sistemde izole ekranlar yerine uçtan uca bir hizmet akışı oluşmuştur.</w:t>
+      </w:r>
+    </w:p>
+    <w:p>
+      <w:pPr>
+        <w:pStyle w:val="TezBody"/>
+      </w:pPr>
+      <w:r>
+        <w:rPr>
+          <w:rFonts w:ascii="Times New Roman" w:hAnsi="Times New Roman" w:cs="Times New Roman"/>
+        </w:rPr>
+        <w:t>Projenin sınırlılıklarının açıkça yazılması kabul açısından olumsuz değil, aksine olgun bir mühendislik yaklaşımıdır. Otomatik baskı uygunluk analizi, ödeme, kargo ve gelişmiş maliyet tahmini gibi alanların gelecekte yapılacak çalışmalar olarak belirtilmesi, çalışmanın kapsamının gerçekçi çizildiğini gösterir. Böylece jüri, eksik bırakılan alanların fark edilmediği için değil, bitirme projesi kapsamı dışında tutulduğu için tamamlanmadığını anlayabilir.</w:t>
+      </w:r>
+    </w:p>
+    <w:p>
+      <w:pPr>
+        <w:pStyle w:val="TezBody"/>
+      </w:pPr>
+      <w:r>
+        <w:rPr>
+          <w:rFonts w:ascii="Times New Roman" w:hAnsi="Times New Roman" w:cs="Times New Roman"/>
+        </w:rPr>
+        <w:t>Sonuç olarak demo ve tez metni birlikte değerlendirildiğinde PrintForge, problem tanımı, yöntem, uygulama, bulgular ve sonuç bölümleri arasında tutarlı bir çizgi kurmaktadır. Kullanıcı ihtiyacı giriş bölümünde açıklanmış, literatürle desteklenmiş, materyal ve metot bölümünde yazılım mimarisiyle karşılanmış, bulgular bölümünde gerçek ekran görüntüleriyle gösterilmiş ve sonuç bölümünde geliştirilebilir yönleriyle birlikte değerlendirilmiştir.</w:t>
       </w:r>
     </w:p>
     <w:p>

</xml_diff>

<commit_message>
Enable model file downloads for AI outputs
</commit_message>
<xml_diff>
--- a/PrintForge_Bitirme_Tezi.docx
+++ b/PrintForge_Bitirme_Tezi.docx
@@ -904,7 +904,7 @@
         <w:rPr>
           <w:rFonts w:ascii="Times New Roman" w:hAnsi="Times New Roman" w:cs="Times New Roman"/>
         </w:rPr>
-        <w:t>Bu tez çalışmasında, 3D baskı hizmetlerinden yararlanmak isteyen kullanıcıların fikir geliştirme, referans görsel seçme, AI destekli 3D model üretme ve satıcıyla iletişime geçme süreçlerini tek bir web platformunda birleştiren PrintForge sistemi geliştirilmiştir. Çalışmanın temel problemi, teknik modelleme bilgisi olmayan kullanıcıların üretime uygun 3D model dosyasına erişmekte ve güvenilir satıcılarla düzenli bir süreç üzerinden iletişim kurmakta yaşadığı zorluktur. Bu problemi çözmek amacıyla kullanıcı, satıcı ve admin rollerini destekleyen; satıcı katalogu, admin örnek yönetimi, internet görsel araması, referans görsele dayalı AI model üretimi, 3D model önizleme, mesajlaşma ve sipariş takibi modüllerinden oluşan bütünleşik bir yazılım mimarisi tasarlanmıştır.</w:t>
+        <w:t>Bu tez çalışmasında, 3D baskı hizmetlerinden yararlanmak isteyen kullanıcıların fikir geliştirme, referans görsel seçme, AI destekli 3D model üretme, baskı kalitesini fotoğraf üzerinden ön değerlendirme ve satıcıyla iletişime geçme süreçlerini tek bir web platformunda birleştiren PrintForge sistemi geliştirilmiştir. Çalışmanın temel problemi, teknik modelleme bilgisi olmayan kullanıcıların üretime uygun 3D model dosyasına erişmekte, baskı sonrası kaliteyi yorumlamakta ve güvenilir satıcılarla düzenli bir süreç üzerinden iletişim kurmakta yaşadığı zorluktur. Bu problemi çözmek amacıyla kullanıcı, satıcı ve admin rollerini destekleyen; satıcı katalogu, admin örnek yönetimi, internet görsel araması, referans görsele dayalı AI model üretimi, baskı kalite kontrolü, 3D model önizleme, mesajlaşma ve sipariş takibi modüllerinden oluşan bütünleşik bir yazılım mimarisi tasarlanmıştır.</w:t>
       </w:r>
     </w:p>
     <w:p>
@@ -926,7 +926,7 @@
         <w:rPr>
           <w:rFonts w:ascii="Times New Roman" w:hAnsi="Times New Roman" w:cs="Times New Roman"/>
         </w:rPr>
-        <w:t>Gerçekleştirilen doğrulamada backend TypeScript derlemesi başarıyla tamamlanmış, frontend üretim derlemesi Next.js tarafından 21 sayfa oluşturularak tamamlanmıştır. Bulgular, PrintForge'un 3D baskı fikrinden satıcıyla iletişime kadar uzanan süreci tek sistem altında toplayabildiğini, admin tarafından yönetilen örnek içeriklerle dış servis risklerine karşı yedekli bir başlangıç akışı sunduğunu ve satıcı-kullanıcı etkileşimini katalog, mesajlaşma, yorum, soru-cevap ve sipariş durumu bileşenleriyle desteklediğini göstermiştir.</w:t>
+        <w:t>Gerçekleştirilen doğrulamada backend TypeScript derlemesi başarıyla tamamlanmış, frontend üretim derlemesi Next.js tarafından 21 sayfa oluşturularak tamamlanmıştır. Bulgular, PrintForge'un 3D baskı fikrinden satıcıyla iletişime ve baskı sonrası kalite gözlemine kadar uzanan süreci tek sistem altında toplayabildiğini, admin tarafından yönetilen örnek içeriklerle dış servis risklerine karşı yedekli bir başlangıç akışı sunduğunu ve satıcı-kullanıcı etkileşimini katalog, mesajlaşma, kalite kontrol, yorum, soru-cevap ve sipariş durumu bileşenleriyle desteklediğini göstermiştir.</w:t>
       </w:r>
     </w:p>
     <w:p>
@@ -946,7 +946,7 @@
           <w:rFonts w:ascii="Times New Roman" w:hAnsi="Times New Roman" w:cs="Times New Roman"/>
           <w:sz w:val="24"/>
         </w:rPr>
-        <w:t>3D baskı, eklemeli imalat, yapay zeka, web pazaryeri, 3D model üretimi.</w:t>
+        <w:t>3D baskı, eklemeli imalat, yapay zeka, web pazaryeri, 3D model üretimi, kalite kontrol.</w:t>
       </w:r>
     </w:p>
     <w:p>
@@ -1046,7 +1046,7 @@
         <w:rPr>
           <w:rFonts w:ascii="Times New Roman" w:hAnsi="Times New Roman" w:cs="Times New Roman"/>
         </w:rPr>
-        <w:t>In this thesis, PrintForge, an integrated web platform that combines idea discovery, reference image selection, AI-assisted 3D model generation, seller communication, and order tracking for 3D printing services, has been developed. The main problem addressed in the study is that users without technical modeling knowledge often have difficulty obtaining production-ready 3D model files and communicating with suitable sellers through an organized workflow. To address this problem, a role-based software architecture supporting users, sellers, and administrators has been designed and implemented with seller catalog management, curated example administration, internet image search, reference-image-based AI generation, 3D model preview, messaging, and order tracking modules.</w:t>
+        <w:t>In this thesis, PrintForge, an integrated web platform that combines idea discovery, reference image selection, AI-assisted 3D model generation, photo-based print quality pre-evaluation, seller communication, and order tracking for 3D printing services, has been developed. The main problem addressed in the study is that users without technical modeling knowledge often have difficulty obtaining production-ready 3D model files, interpreting post-print quality, and communicating with suitable sellers through an organized workflow. To address this problem, a role-based software architecture supporting users, sellers, and administrators has been designed and implemented with seller catalog management, curated example administration, internet image search, reference-image-based AI generation, print quality control, 3D model preview, messaging, and order tracking modules.</w:t>
       </w:r>
     </w:p>
     <w:p>
@@ -1068,7 +1068,7 @@
         <w:rPr>
           <w:rFonts w:ascii="Times New Roman" w:hAnsi="Times New Roman" w:cs="Times New Roman"/>
         </w:rPr>
-        <w:t>The verification results show that the backend TypeScript build was completed successfully and the frontend production build generated 21 pages with Next.js. The findings indicate that PrintForge can connect the process from a 3D printing idea to seller communication within a single system, provide a resilient starting flow through administrator-managed example content, and support buyer-seller interaction with catalog, messaging, review, question-answer, and order status features.</w:t>
+        <w:t>The verification results show that the backend TypeScript build was completed successfully and the frontend production build generated 21 pages with Next.js. The findings indicate that PrintForge can connect the process from a 3D printing idea to seller communication and post-print quality observation within a single system, provide a resilient starting flow through administrator-managed example content, and support buyer-seller interaction with catalog, messaging, quality control, review, question-answer, and order status features.</w:t>
       </w:r>
     </w:p>
     <w:p>
@@ -1088,7 +1088,7 @@
           <w:rFonts w:ascii="Times New Roman" w:hAnsi="Times New Roman" w:cs="Times New Roman"/>
           <w:sz w:val="24"/>
         </w:rPr>
-        <w:t>3D printing, additive manufacturing, artificial intelligence, web marketplace, 3D model generation.</w:t>
+        <w:t>3D printing, additive manufacturing, artificial intelligence, web marketplace, 3D model generation, quality control.</w:t>
       </w:r>
     </w:p>
     <w:p>
@@ -1988,6 +1988,26 @@
           <w:b/>
           <w:sz w:val="24"/>
         </w:rPr>
+        <w:t xml:space="preserve">FDM: </w:t>
+      </w:r>
+      <w:r>
+        <w:rPr>
+          <w:rFonts w:ascii="Times New Roman" w:hAnsi="Times New Roman" w:cs="Times New Roman"/>
+          <w:sz w:val="24"/>
+        </w:rPr>
+        <w:t>Fused Deposition Modeling / Eriyik yığma modelleme</w:t>
+      </w:r>
+    </w:p>
+    <w:p>
+      <w:pPr>
+        <w:pStyle w:val="TezNoIndent"/>
+      </w:pPr>
+      <w:r>
+        <w:rPr>
+          <w:rFonts w:ascii="Times New Roman" w:hAnsi="Times New Roman" w:cs="Times New Roman"/>
+          <w:b/>
+          <w:sz w:val="24"/>
+        </w:rPr>
         <w:t xml:space="preserve">GLB: </w:t>
       </w:r>
       <w:r>
@@ -2678,7 +2698,7 @@
           <w:rFonts w:ascii="Times New Roman" w:hAnsi="Times New Roman" w:cs="Times New Roman"/>
           <w:sz w:val="22"/>
         </w:rPr>
-        <w:t>Şekil 3.9. Favoriler ekranı</w:t>
+        <w:t>Şekil 3.9. Kalite kontrol ekranı</w:t>
         <w:tab/>
         <w:t>44</w:t>
       </w:r>
@@ -9918,6 +9938,63 @@
     </w:p>
     <w:p>
       <w:pPr>
+        <w:pStyle w:val="TezHeading"/>
+      </w:pPr>
+      <w:r>
+        <w:rPr>
+          <w:rFonts w:ascii="Times New Roman" w:hAnsi="Times New Roman" w:cs="Times New Roman"/>
+          <w:b/>
+          <w:sz w:val="24"/>
+        </w:rPr>
+        <w:t>2.9.19. Baskı Kalite Kontrol Senaryosu</w:t>
+      </w:r>
+    </w:p>
+    <w:p>
+      <w:pPr>
+        <w:pStyle w:val="TezBody"/>
+      </w:pPr>
+      <w:r>
+        <w:rPr>
+          <w:rFonts w:ascii="Times New Roman" w:hAnsi="Times New Roman" w:cs="Times New Roman"/>
+        </w:rPr>
+        <w:t>Bu senaryo, üretilen fiziksel parçaya ait fotoğrafın baskı hatası açısından ön değerlendirmeye alınması amacıyla değerlendirilmiştir. PrintForge'un hedef kitlesi teknik modelleme bilgisi sınırlı kullanıcılar ve ürün yayınlamak isteyen satıcılar olduğu için her akışın açık, izlenebilir ve hata durumunda anlaşılır olması gerekir. Senaryonun tasarım değeri, kullanıcının tek bir ekranda ne yapacağını anlaması ve işlemin sonucunu sistem içinde takip edebilmesidir.</w:t>
+      </w:r>
+    </w:p>
+    <w:p>
+      <w:pPr>
+        <w:pStyle w:val="TezBody"/>
+      </w:pPr>
+      <w:r>
+        <w:rPr>
+          <w:rFonts w:ascii="Times New Roman" w:hAnsi="Times New Roman" w:cs="Times New Roman"/>
+        </w:rPr>
+        <w:t>Uygulama tarafında bu akış kalite kontrol ekranında yüklenen baskı fotoğrafı analiz edilir; sistem hata sınıfı, güven skoru, önem düzeyi ve çözüm önerilerini kullanıcıya sunar. Bu karar, frontend ekranı ile backend iş kuralı arasında doğrudan bağ kurar. Böylece arayüzde görülen eylem yalnızca görsel bir düğme olmaktan çıkar; veritabanı kaydı, doğrulama, yetki kontrolü ve kullanıcıya dönen sonuçla birlikte tamamlanan bir işlem haline gelir.</w:t>
+      </w:r>
+    </w:p>
+    <w:p>
+      <w:pPr>
+        <w:pStyle w:val="TezBody"/>
+      </w:pPr>
+      <w:r>
+        <w:rPr>
+          <w:rFonts w:ascii="Times New Roman" w:hAnsi="Times New Roman" w:cs="Times New Roman"/>
+        </w:rPr>
+        <w:t>Senaryonun kullanıcıya katkısı satıcının veya kullanıcının baskı sonrası kalite değerlendirmesini sistem içinde belgeleyebilmesi ve aynı parçayı farklı açıdan tekrar kontrol edebilmesi olarak özetlenebilir. Kabul ölçütü ise geçerli görsel yüklendiğinde sonuç kartı ve öneriler üretilir; eksik veya uygun olmayan görselde analiz başlatılmadan kullanıcı bilgilendirilir. Bu ölçüt sağlanmadığında senaryo tamamlanmış kabul edilmez; çünkü bitirme projesinde yalnızca mutlu yolun çalışması değil, hatalı veya eksik girişlerin de kontrollü yönetilmesi beklenir.</w:t>
+      </w:r>
+    </w:p>
+    <w:p>
+      <w:pPr>
+        <w:pStyle w:val="TezBody"/>
+      </w:pPr>
+      <w:r>
+        <w:rPr>
+          <w:rFonts w:ascii="Times New Roman" w:hAnsi="Times New Roman" w:cs="Times New Roman"/>
+        </w:rPr>
+        <w:t>Bu değerlendirme, proje kapsamının yalnızca ekran tasarımından ibaret olmadığını göstermektedir. Her senaryo, kullanıcı arayüzü, API katmanı, veri modeli ve hata yönetimi arasında tutarlı bir ilişki kurulup kurulmadığını sınar. Bu nedenle senaryo tabanlı yaklaşım, hem geliştirme sürecinde kontrol listesi hem de tez kapsamında yöntemsel açıklama aracı olarak kullanılmıştır.</w:t>
+      </w:r>
+    </w:p>
+    <w:p>
+      <w:pPr>
         <w:pStyle w:val="TezTableCaption"/>
       </w:pPr>
       <w:r>
@@ -10386,6 +10463,89 @@
                 <w:b w:val="0"/>
                 <w:sz w:val="18"/>
               </w:rPr>
+              <w:t>Kalite kontrol</w:t>
+            </w:r>
+          </w:p>
+        </w:tc>
+        <w:tc>
+          <w:tcPr>
+            <w:tcW w:type="dxa" w:w="3288"/>
+            <w:vAlign w:val="center"/>
+            <w:tcMar>
+              <w:top w:w="80" w:type="dxa"/>
+              <w:start w:w="120" w:type="dxa"/>
+              <w:bottom w:w="80" w:type="dxa"/>
+              <w:end w:w="120" w:type="dxa"/>
+            </w:tcMar>
+          </w:tcPr>
+          <w:p>
+            <w:pPr>
+              <w:spacing w:after="0" w:line="240" w:lineRule="auto"/>
+              <w:ind w:firstLine="0"/>
+              <w:jc w:val="left"/>
+            </w:pPr>
+            <w:r>
+              <w:rPr>
+                <w:rFonts w:ascii="Times New Roman" w:hAnsi="Times New Roman" w:cs="Times New Roman"/>
+                <w:b w:val="0"/>
+                <w:sz w:val="18"/>
+              </w:rPr>
+              <w:t>Quality control, image analysis, defect classes</w:t>
+            </w:r>
+          </w:p>
+        </w:tc>
+        <w:tc>
+          <w:tcPr>
+            <w:tcW w:type="dxa" w:w="3798"/>
+            <w:vAlign w:val="center"/>
+            <w:tcMar>
+              <w:top w:w="80" w:type="dxa"/>
+              <w:start w:w="120" w:type="dxa"/>
+              <w:bottom w:w="80" w:type="dxa"/>
+              <w:end w:w="120" w:type="dxa"/>
+            </w:tcMar>
+          </w:tcPr>
+          <w:p>
+            <w:pPr>
+              <w:spacing w:after="0" w:line="240" w:lineRule="auto"/>
+              <w:ind w:firstLine="0"/>
+              <w:jc w:val="left"/>
+            </w:pPr>
+            <w:r>
+              <w:rPr>
+                <w:rFonts w:ascii="Times New Roman" w:hAnsi="Times New Roman" w:cs="Times New Roman"/>
+                <w:b w:val="0"/>
+                <w:sz w:val="18"/>
+              </w:rPr>
+              <w:t>Baskı fotoğrafı üzerinden hata sınıfı ve çözüm önerisi üretilebilir.</w:t>
+            </w:r>
+          </w:p>
+        </w:tc>
+      </w:tr>
+      <w:tr>
+        <w:tc>
+          <w:tcPr>
+            <w:tcW w:type="dxa" w:w="2268"/>
+            <w:vAlign w:val="center"/>
+            <w:tcMar>
+              <w:top w:w="80" w:type="dxa"/>
+              <w:start w:w="120" w:type="dxa"/>
+              <w:bottom w:w="80" w:type="dxa"/>
+              <w:end w:w="120" w:type="dxa"/>
+            </w:tcMar>
+          </w:tcPr>
+          <w:p>
+            <w:pPr>
+              <w:spacing w:after="0" w:line="240" w:lineRule="auto"/>
+              <w:ind w:firstLine="0"/>
+              <w:jc w:val="center"/>
+            </w:pPr>
+            <w:r>
+              <w:rPr>
+                <w:rFonts w:ascii="Times New Roman" w:hAnsi="Times New Roman" w:cs="Times New Roman"/>
+                <w:b w:val="0"/>
+                <w:sz w:val="18"/>
+              </w:rPr>
               <w:t>İletişim ve sipariş</w:t>
             </w:r>
           </w:p>
@@ -10931,6 +11091,52 @@
           <w:rFonts w:ascii="Times New Roman" w:hAnsi="Times New Roman" w:cs="Times New Roman"/>
         </w:rPr>
         <w:t>Kabul riskini azaltmak için savunmada özellikle ana sayfa, örnek görsel arama, AI üretim ekranı, satıcı ürün ekleme, katalog ve mesaj/sipariş akışları sırayla gösterilmelidir. Böyle bir demo akışı, tezde anlatılan mimarinin gerçek uygulama üzerinde karşılığı olduğunu açık biçimde kanıtlar.</w:t>
+      </w:r>
+    </w:p>
+    <w:p>
+      <w:pPr>
+        <w:pStyle w:val="TezHeading"/>
+      </w:pPr>
+      <w:r>
+        <w:rPr>
+          <w:rFonts w:ascii="Times New Roman" w:hAnsi="Times New Roman" w:cs="Times New Roman"/>
+          <w:b/>
+          <w:sz w:val="24"/>
+        </w:rPr>
+        <w:t>2.10.9. Baskı Kalite Kontrol Modülünün Genişletilebilirliği</w:t>
+      </w:r>
+    </w:p>
+    <w:p>
+      <w:pPr>
+        <w:pStyle w:val="TezBody"/>
+      </w:pPr>
+      <w:r>
+        <w:rPr>
+          <w:rFonts w:ascii="Times New Roman" w:hAnsi="Times New Roman" w:cs="Times New Roman"/>
+        </w:rPr>
+        <w:t>Yeni eklenen kalite kontrol yaklaşımı, platformun yalnızca ürün yayımlama ve model üretme tarafında kalmadığını, fiziksel baskı sonrasındaki kalite gözlemini de kapsayabilecek biçimde genişletildiğini göstermektedir. Ekranda kullanılan demo tahmin yapısı, ileride eğitilmiş Python model servisine bağlanacak biçimde tasarlanmıştır.</w:t>
+      </w:r>
+    </w:p>
+    <w:p>
+      <w:pPr>
+        <w:pStyle w:val="TezBody"/>
+      </w:pPr>
+      <w:r>
+        <w:rPr>
+          <w:rFonts w:ascii="Times New Roman" w:hAnsi="Times New Roman" w:cs="Times New Roman"/>
+        </w:rPr>
+        <w:t>Kalite kontrol akışında warping, stringing, layer shifting, cracking ve off-platform gibi FDM baskıda sık karşılaşılan hata sınıflarının ayrı ayrı gösterilmesi, sistemin üretim sonrası geri bildirim için uygun bir temel sunduğunu kanıtlar. Güven skoru ve önem düzeyi, kullanıcının sonucu tek bir etiket olarak değil, karar destek bilgisi olarak değerlendirmesine yardımcı olur.</w:t>
+      </w:r>
+    </w:p>
+    <w:p>
+      <w:pPr>
+        <w:pStyle w:val="TezBody"/>
+      </w:pPr>
+      <w:r>
+        <w:rPr>
+          <w:rFonts w:ascii="Times New Roman" w:hAnsi="Times New Roman" w:cs="Times New Roman"/>
+        </w:rPr>
+        <w:t>Bu modülün geliştirilmesiyle satıcılar baskı fotoğraflarını sipariş kaydıyla ilişkilendirebilir, kullanıcıya teslim öncesi kalite kanıtı sunabilir ve tekrarlayan hatalar üzerinden üretim parametrelerini iyileştirebilir. Bu nedenle kalite kontrol modülü, projenin gelecek çalışmalar bölümünde önerilen sürdürülebilir üretim yaklaşımıyla doğrudan ilişkilidir.</w:t>
       </w:r>
     </w:p>
     <w:p>
@@ -11529,7 +11735,7 @@
         <w:rPr>
           <w:rFonts w:ascii="Times New Roman" w:hAnsi="Times New Roman" w:cs="Times New Roman"/>
         </w:rPr>
-        <w:t>PrintForge projesi kapsamında kullanıcı, satıcı ve admin rollerini destekleyen bütünleşik bir web uygulaması geliştirilmiştir. Sistem; ürün katalogu, örnek görsel arama, AI destekli model üretimi, satıcı ürün yönetimi, favoriler, sepet, mesajlaşma ve sipariş takibi modüllerinden oluşmaktadır. Bulgular, uygulamanın yalnızca tek bir ekran prototipi olmadığını, farklı kullanıcı rollerinin gerçek iş akışlarını destekleyen uçtan uca bir sistem yapısına ulaştığını göstermektedir.</w:t>
+        <w:t>PrintForge projesi kapsamında kullanıcı, satıcı ve admin rollerini destekleyen bütünleşik bir web uygulaması geliştirilmiştir. Sistem; ürün katalogu, örnek görsel arama, AI destekli model üretimi, baskı kalite kontrolü, satıcı ürün yönetimi, favoriler, sepet, mesajlaşma ve sipariş takibi modüllerinden oluşmaktadır. Bulgular, uygulamanın yalnızca tek bir ekran prototipi olmadığını, farklı kullanıcı rollerinin gerçek iş akışlarını destekleyen uçtan uca bir sistem yapısına ulaştığını göstermektedir.</w:t>
       </w:r>
     </w:p>
     <w:p>
@@ -11540,7 +11746,7 @@
         <w:rPr>
           <w:rFonts w:ascii="Times New Roman" w:hAnsi="Times New Roman" w:cs="Times New Roman"/>
         </w:rPr>
-        <w:t>Geliştirilen modüller kullanıcı tarafında fikir seçme, model oluşturma ve satıcıyla iletişime geçme ihtiyacını; satıcı tarafında ise ürün ekleme, katalogda yayınlama ve gelen talepleri takip etme ihtiyacını karşılamaktadır. Admin örnekleri ve internet görsel araması, AI üretim akışının başlangıç noktasını güçlendirmiştir. Bu yapı, 3D baskı hizmetini yalnızca teknik dosya üretimi olarak değil, pazaryeri ve iletişim akışıyla birlikte ele alan bir uygulama yaklaşımı sunmaktadır.</w:t>
+        <w:t>Geliştirilen modüller kullanıcı tarafında fikir seçme, model oluşturma, baskı fotoğrafını kontrol etme ve satıcıyla iletişime geçme ihtiyacını; satıcı tarafında ise ürün ekleme, katalogda yayınlama ve gelen talepleri takip etme ihtiyacını karşılamaktadır. Admin örnekleri ve internet görsel araması, AI üretim akışının başlangıç noktasını güçlendirmiştir. Kalite kontrol ekranı ise fiziksel baskı sonrasında görülebilecek hataların belgeye ve öneriye dönüştürülebileceğini göstermektedir. Bu yapı, 3D baskı hizmetini yalnızca teknik dosya üretimi olarak değil, pazaryeri, kalite gözlemi ve iletişim akışıyla birlikte ele alan bir uygulama yaklaşımı sunmaktadır.</w:t>
       </w:r>
     </w:p>
     <w:p>
@@ -11953,7 +12159,7 @@
                 <w:b w:val="0"/>
                 <w:sz w:val="18"/>
               </w:rPr>
-              <w:t>Ana akış ekranları başarıyla görüntülendi.</w:t>
+              <w:t>Ana akış ve kalite kontrol ekranları başarıyla görüntülendi.</w:t>
             </w:r>
           </w:p>
         </w:tc>
@@ -12102,7 +12308,7 @@
       <w:r>
         <w:drawing>
           <wp:inline xmlns:a="http://schemas.openxmlformats.org/drawingml/2006/main" xmlns:pic="http://schemas.openxmlformats.org/drawingml/2006/picture">
-            <wp:extent cx="4608000" cy="2185138"/>
+            <wp:extent cx="4608000" cy="2032234"/>
             <wp:docPr id="7" name="Picture 7" descr="Image: image7.png"/>
             <wp:cNvGraphicFramePr>
               <a:graphicFrameLocks noChangeAspect="1"/>
@@ -12123,7 +12329,7 @@
                   <pic:spPr>
                     <a:xfrm>
                       <a:off x="0" y="0"/>
-                      <a:ext cx="4608000" cy="2185138"/>
+                      <a:ext cx="4608000" cy="2032234"/>
                     </a:xfrm>
                     <a:prstGeom prst="rect"/>
                   </pic:spPr>
@@ -12516,7 +12722,7 @@
         <w:rPr>
           <w:rFonts w:ascii="Times New Roman" w:hAnsi="Times New Roman" w:cs="Times New Roman"/>
         </w:rPr>
-        <w:t>Satıcı ürün yönetimi ekranı, satıcının katalogda yayınladığı ürünleri tek noktadan görmesini ve yeni ürün ekleme akışına geçmesini sağlar. Bu ekran, platformun yalnızca alıcı tarafı için değil, satıcı operasyonları için de tasarlandığını göstermektedir.</w:t>
+        <w:t>Satıcı ürün yönetimi ekranı, satıcının katalogda yayınladığı ürünleri gerçek ürün görselleriyle birlikte tek noktadan görmesini ve düzenlemesini sağlar. Örnekte Ejderha Anahtarlık ürünü, fiyat, kategori, açıklama ve çoklu görsel küçük resimleriyle yönetilmektedir.</w:t>
       </w:r>
     </w:p>
     <w:p>
@@ -12527,7 +12733,7 @@
       <w:r>
         <w:drawing>
           <wp:inline xmlns:a="http://schemas.openxmlformats.org/drawingml/2006/main" xmlns:pic="http://schemas.openxmlformats.org/drawingml/2006/picture">
-            <wp:extent cx="4608000" cy="2186277"/>
+            <wp:extent cx="4608000" cy="2158724"/>
             <wp:docPr id="12" name="Picture 12" descr="Image: image12.png"/>
             <wp:cNvGraphicFramePr>
               <a:graphicFrameLocks noChangeAspect="1"/>
@@ -12548,7 +12754,7 @@
                   <pic:spPr>
                     <a:xfrm>
                       <a:off x="0" y="0"/>
-                      <a:ext cx="4608000" cy="2186277"/>
+                      <a:ext cx="4608000" cy="2158724"/>
                     </a:xfrm>
                     <a:prstGeom prst="rect"/>
                   </pic:spPr>
@@ -12590,7 +12796,7 @@
         <w:rPr>
           <w:rFonts w:ascii="Times New Roman" w:hAnsi="Times New Roman" w:cs="Times New Roman"/>
         </w:rPr>
-        <w:t>Satıcı panelinin bulunması, projenin pazaryeri boyutunu güçlendirmektedir. Ürün yönetimi alıcı arayüzünden ayrıldığı için satıcı, katalog içeriğini daha düzenli biçimde kontrol edebilmektedir.</w:t>
+        <w:t>Bu ekranın dolu veriyle gösterilmesi, projenin pazaryeri boyutunu daha güçlü biçimde kanıtlamaktadır. Satıcı yalnızca ürün ekleme formuna sahip değildir; mevcut ürününü güncelleyebilir, fiyatını düzenleyebilir, kapak görselini değiştirebilir ve katalog içeriğini alıcı arayüzünden ayrı bir yönetim panelinde kontrol edebilir.</w:t>
       </w:r>
     </w:p>
     <w:p>
@@ -12686,7 +12892,7 @@
         <w:rPr>
           <w:rFonts w:ascii="Times New Roman" w:hAnsi="Times New Roman" w:cs="Times New Roman"/>
         </w:rPr>
-        <w:t>Favoriler ekranı, kullanıcının ilgilendiği ürünleri daha sonra incelemek üzere saklamasına olanak tanımaktadır. Bu özellik, katalog inceleme davranışını tek oturumluk bir işlem olmaktan çıkarıp kullanıcı hesabına bağlı kalıcı bir deneyime dönüştürmektedir.</w:t>
+        <w:t>Kalite kontrol ekranı, fiziksel baskıdan alınan fotoğrafın sistem içinde analiz edilmesine olanak tanımaktadır. Ekranda yüklenen baskı fotoğrafı, güven skoru, önem düzeyi, model kaynağı, hata sınıfları ve çözüm önerileriyle birlikte sunulmaktadır.</w:t>
       </w:r>
     </w:p>
     <w:p>
@@ -12697,7 +12903,7 @@
       <w:r>
         <w:drawing>
           <wp:inline xmlns:a="http://schemas.openxmlformats.org/drawingml/2006/main" xmlns:pic="http://schemas.openxmlformats.org/drawingml/2006/picture">
-            <wp:extent cx="4608000" cy="2180336"/>
+            <wp:extent cx="4608000" cy="2173132"/>
             <wp:docPr id="14" name="Picture 14" descr="Image: image14.png"/>
             <wp:cNvGraphicFramePr>
               <a:graphicFrameLocks noChangeAspect="1"/>
@@ -12706,7 +12912,7 @@
               <a:graphicData uri="http://schemas.openxmlformats.org/drawingml/2006/picture">
                 <pic:pic>
                   <pic:nvPicPr>
-                    <pic:cNvPr id="0" name="favorites.png"/>
+                    <pic:cNvPr id="0" name="quality_control.png"/>
                     <pic:cNvPicPr/>
                   </pic:nvPicPr>
                   <pic:blipFill>
@@ -12718,7 +12924,7 @@
                   <pic:spPr>
                     <a:xfrm>
                       <a:off x="0" y="0"/>
-                      <a:ext cx="4608000" cy="2180336"/>
+                      <a:ext cx="4608000" cy="2173132"/>
                     </a:xfrm>
                     <a:prstGeom prst="rect"/>
                   </pic:spPr>
@@ -12738,7 +12944,7 @@
           <w:rFonts w:ascii="Times New Roman" w:hAnsi="Times New Roman" w:cs="Times New Roman"/>
           <w:sz w:val="24"/>
         </w:rPr>
-        <w:t>Şekil 3.9. Favoriler ekranı</w:t>
+        <w:t>Şekil 3.9. Kalite kontrol ekranı</w:t>
       </w:r>
     </w:p>
     <w:p>
@@ -12760,7 +12966,7 @@
         <w:rPr>
           <w:rFonts w:ascii="Times New Roman" w:hAnsi="Times New Roman" w:cs="Times New Roman"/>
         </w:rPr>
-        <w:t>Favoriler modülü, kullanıcı karar verme sürecini destekleyen yardımcı bir bileşendir. Özellikle çok sayıda katalog ürünü olduğunda kullanıcı, satın alma veya mesajlaşma kararını erteleyebilmekte ve ilgilendiği ürünleri kaybetmemektedir.</w:t>
+        <w:t>Bu modül, PrintForge'un yalnızca fikir ve katalog aşamasında kalmadığını, baskı sonrası kalite değerlendirmesine de genişleyebileceğini göstermektedir. Demo tahmin yapısı ileride eğitilmiş Python model servisine bağlandığında, satıcı ve kullanıcı baskı kusurlarını daha sistematik biçimde takip edebilecektir.</w:t>
       </w:r>
     </w:p>
     <w:p>
@@ -13035,7 +13241,7 @@
         <w:rPr>
           <w:rFonts w:ascii="Times New Roman" w:hAnsi="Times New Roman" w:cs="Times New Roman"/>
         </w:rPr>
-        <w:t>Kullanıcı akışları incelendiğinde PrintForge'un fikir aşamasından satıcıyla iletişim aşamasına kadar kesintisiz bir deneyim sunduğu görülmektedir. Kullanıcı örnekler sayfasında bir görsel arayabilir, seçilen görselden AI üretim ekranına geçebilir, katalog ürünlerini inceleyebilir, favori veya sepet listesi oluşturabilir ve satıcıya mesaj gönderebilir. Satıcı ise ürünlerini yayınlayabilir ve sipariş takibini ayrı bir ekranda gerçekleştirebilir.</w:t>
+        <w:t>Kullanıcı akışları incelendiğinde PrintForge'un fikir aşamasından satıcıyla iletişim ve kalite kontrol aşamasına kadar kesintisiz bir deneyim sunduğu görülmektedir. Kullanıcı örnekler sayfasında bir görsel arayabilir, seçilen görselden AI üretim ekranına geçebilir, katalog ürünlerini inceleyebilir, favori veya sepet listesi oluşturabilir, baskı fotoğrafını kalite kontrol ekranında değerlendirebilir ve satıcıya mesaj gönderebilir. Satıcı ise ürünlerini yayınlayabilir ve sipariş takibini ayrı bir ekranda gerçekleştirebilir.</w:t>
       </w:r>
     </w:p>
     <w:p>
@@ -13425,6 +13631,89 @@
                 <w:b w:val="0"/>
                 <w:sz w:val="18"/>
               </w:rPr>
+              <w:t>Kalite kontrol</w:t>
+            </w:r>
+          </w:p>
+        </w:tc>
+        <w:tc>
+          <w:tcPr>
+            <w:tcW w:type="dxa" w:w="3005"/>
+            <w:vAlign w:val="center"/>
+            <w:tcMar>
+              <w:top w:w="80" w:type="dxa"/>
+              <w:start w:w="120" w:type="dxa"/>
+              <w:bottom w:w="80" w:type="dxa"/>
+              <w:end w:w="120" w:type="dxa"/>
+            </w:tcMar>
+          </w:tcPr>
+          <w:p>
+            <w:pPr>
+              <w:spacing w:after="0" w:line="240" w:lineRule="auto"/>
+              <w:ind w:firstLine="0"/>
+              <w:jc w:val="left"/>
+            </w:pPr>
+            <w:r>
+              <w:rPr>
+                <w:rFonts w:ascii="Times New Roman" w:hAnsi="Times New Roman" w:cs="Times New Roman"/>
+                <w:b w:val="0"/>
+                <w:sz w:val="18"/>
+              </w:rPr>
+              <w:t>Baskı fotoğrafı hata sınıfı ve öneriyle analiz edilir.</w:t>
+            </w:r>
+          </w:p>
+        </w:tc>
+        <w:tc>
+          <w:tcPr>
+            <w:tcW w:type="dxa" w:w="3969"/>
+            <w:vAlign w:val="center"/>
+            <w:tcMar>
+              <w:top w:w="80" w:type="dxa"/>
+              <w:start w:w="120" w:type="dxa"/>
+              <w:bottom w:w="80" w:type="dxa"/>
+              <w:end w:w="120" w:type="dxa"/>
+            </w:tcMar>
+          </w:tcPr>
+          <w:p>
+            <w:pPr>
+              <w:spacing w:after="0" w:line="240" w:lineRule="auto"/>
+              <w:ind w:firstLine="0"/>
+              <w:jc w:val="left"/>
+            </w:pPr>
+            <w:r>
+              <w:rPr>
+                <w:rFonts w:ascii="Times New Roman" w:hAnsi="Times New Roman" w:cs="Times New Roman"/>
+                <w:b w:val="0"/>
+                <w:sz w:val="18"/>
+              </w:rPr>
+              <w:t>Fiziksel üretim sonrası karar desteği sağlanır.</w:t>
+            </w:r>
+          </w:p>
+        </w:tc>
+      </w:tr>
+      <w:tr>
+        <w:tc>
+          <w:tcPr>
+            <w:tcW w:type="dxa" w:w="1814"/>
+            <w:vAlign w:val="center"/>
+            <w:tcMar>
+              <w:top w:w="80" w:type="dxa"/>
+              <w:start w:w="120" w:type="dxa"/>
+              <w:bottom w:w="80" w:type="dxa"/>
+              <w:end w:w="120" w:type="dxa"/>
+            </w:tcMar>
+          </w:tcPr>
+          <w:p>
+            <w:pPr>
+              <w:spacing w:after="0" w:line="240" w:lineRule="auto"/>
+              <w:ind w:firstLine="0"/>
+              <w:jc w:val="center"/>
+            </w:pPr>
+            <w:r>
+              <w:rPr>
+                <w:rFonts w:ascii="Times New Roman" w:hAnsi="Times New Roman" w:cs="Times New Roman"/>
+                <w:b w:val="0"/>
+                <w:sz w:val="18"/>
+              </w:rPr>
               <w:t>Mesajlaşma</w:t>
             </w:r>
           </w:p>
@@ -13919,6 +14208,89 @@
                 <w:b w:val="0"/>
                 <w:sz w:val="18"/>
               </w:rPr>
+              <w:t>Kalite kontrol demo tahmini</w:t>
+            </w:r>
+          </w:p>
+        </w:tc>
+        <w:tc>
+          <w:tcPr>
+            <w:tcW w:type="dxa" w:w="2835"/>
+            <w:vAlign w:val="center"/>
+            <w:tcMar>
+              <w:top w:w="80" w:type="dxa"/>
+              <w:start w:w="120" w:type="dxa"/>
+              <w:bottom w:w="80" w:type="dxa"/>
+              <w:end w:w="120" w:type="dxa"/>
+            </w:tcMar>
+          </w:tcPr>
+          <w:p>
+            <w:pPr>
+              <w:spacing w:after="0" w:line="240" w:lineRule="auto"/>
+              <w:ind w:firstLine="0"/>
+              <w:jc w:val="left"/>
+            </w:pPr>
+            <w:r>
+              <w:rPr>
+                <w:rFonts w:ascii="Times New Roman" w:hAnsi="Times New Roman" w:cs="Times New Roman"/>
+                <w:b w:val="0"/>
+                <w:sz w:val="18"/>
+              </w:rPr>
+              <w:t>Mevcut ekran, eğitilmiş servis bağlanana kadar örnek tahmin mantığıyla çalışır.</w:t>
+            </w:r>
+          </w:p>
+        </w:tc>
+        <w:tc>
+          <w:tcPr>
+            <w:tcW w:type="dxa" w:w="4139"/>
+            <w:vAlign w:val="center"/>
+            <w:tcMar>
+              <w:top w:w="80" w:type="dxa"/>
+              <w:start w:w="120" w:type="dxa"/>
+              <w:bottom w:w="80" w:type="dxa"/>
+              <w:end w:w="120" w:type="dxa"/>
+            </w:tcMar>
+          </w:tcPr>
+          <w:p>
+            <w:pPr>
+              <w:spacing w:after="0" w:line="240" w:lineRule="auto"/>
+              <w:ind w:firstLine="0"/>
+              <w:jc w:val="left"/>
+            </w:pPr>
+            <w:r>
+              <w:rPr>
+                <w:rFonts w:ascii="Times New Roman" w:hAnsi="Times New Roman" w:cs="Times New Roman"/>
+                <w:b w:val="0"/>
+                <w:sz w:val="18"/>
+              </w:rPr>
+              <w:t>FDM hata fotoğraflarıyla eğitilen Python model servisi eklenebilir.</w:t>
+            </w:r>
+          </w:p>
+        </w:tc>
+      </w:tr>
+      <w:tr>
+        <w:tc>
+          <w:tcPr>
+            <w:tcW w:type="dxa" w:w="1814"/>
+            <w:vAlign w:val="center"/>
+            <w:tcMar>
+              <w:top w:w="80" w:type="dxa"/>
+              <w:start w:w="120" w:type="dxa"/>
+              <w:bottom w:w="80" w:type="dxa"/>
+              <w:end w:w="120" w:type="dxa"/>
+            </w:tcMar>
+          </w:tcPr>
+          <w:p>
+            <w:pPr>
+              <w:spacing w:after="0" w:line="240" w:lineRule="auto"/>
+              <w:ind w:firstLine="0"/>
+              <w:jc w:val="center"/>
+            </w:pPr>
+            <w:r>
+              <w:rPr>
+                <w:rFonts w:ascii="Times New Roman" w:hAnsi="Times New Roman" w:cs="Times New Roman"/>
+                <w:b w:val="0"/>
+                <w:sz w:val="18"/>
+              </w:rPr>
               <w:t>Telif/lisans kontrolü sınırlı</w:t>
             </w:r>
           </w:p>
@@ -14279,7 +14651,18 @@
         <w:rPr>
           <w:rFonts w:ascii="Times New Roman" w:hAnsi="Times New Roman" w:cs="Times New Roman"/>
         </w:rPr>
-        <w:t>Beşinci adım mesajlaşma ve sipariş takibi ekranlarıdır. Bu ekranlar, kullanıcının bir ürün veya AI modeli hakkında satıcıyla iletişime geçebildiğini ve üretim sürecinin sipariş durumlarıyla takip edilebildiğini gösterir. Mesajlar ekranının sipariş ekranından ayrılması, bilgi alma konuşmaları ile aktif üretim takibinin birbirine karışmasını azaltan bilinçli bir tasarım kararıdır.</w:t>
+        <w:t>Beşinci adım kalite kontrol ekranıdır. Bu ekranda fiziksel baskı fotoğrafı üzerinden hata sınıfı, güven skoru, önem düzeyi ve çözüm önerileri gösterilir. Demo tahmin modunun açıkça belirtilmesi, akademik dürüstlük açısından önemlidir; buna rağmen ekranın eğitilebilir bir model servisine bağlanabilecek biçimde tasarlanması, projenin gelecekte üretim sonrası kalite değerlendirmesine genişleyebileceğini kanıtlar.</w:t>
+      </w:r>
+    </w:p>
+    <w:p>
+      <w:pPr>
+        <w:pStyle w:val="TezBody"/>
+      </w:pPr>
+      <w:r>
+        <w:rPr>
+          <w:rFonts w:ascii="Times New Roman" w:hAnsi="Times New Roman" w:cs="Times New Roman"/>
+        </w:rPr>
+        <w:t>Altıncı adım mesajlaşma ve sipariş takibi ekranlarıdır. Bu ekranlar, kullanıcının bir ürün veya AI modeli hakkında satıcıyla iletişime geçebildiğini ve üretim sürecinin sipariş durumlarıyla takip edilebildiğini gösterir. Mesajlar ekranının sipariş ekranından ayrılması, bilgi alma konuşmaları ile aktif üretim takibinin birbirine karışmasını azaltan bilinçli bir tasarım kararıdır.</w:t>
       </w:r>
     </w:p>
     <w:p>
@@ -14804,6 +15187,89 @@
             <w:pPr>
               <w:spacing w:after="0" w:line="240" w:lineRule="auto"/>
               <w:ind w:firstLine="0"/>
+              <w:jc w:val="center"/>
+            </w:pPr>
+            <w:r>
+              <w:rPr>
+                <w:rFonts w:ascii="Times New Roman" w:hAnsi="Times New Roman" w:cs="Times New Roman"/>
+                <w:b w:val="0"/>
+                <w:sz w:val="18"/>
+              </w:rPr>
+              <w:t>Kalite kontrol</w:t>
+            </w:r>
+          </w:p>
+        </w:tc>
+        <w:tc>
+          <w:tcPr>
+            <w:tcW w:type="dxa" w:w="4989"/>
+            <w:vAlign w:val="center"/>
+            <w:tcMar>
+              <w:top w:w="80" w:type="dxa"/>
+              <w:start w:w="120" w:type="dxa"/>
+              <w:bottom w:w="80" w:type="dxa"/>
+              <w:end w:w="120" w:type="dxa"/>
+            </w:tcMar>
+          </w:tcPr>
+          <w:p>
+            <w:pPr>
+              <w:spacing w:after="0" w:line="240" w:lineRule="auto"/>
+              <w:ind w:firstLine="0"/>
+              <w:jc w:val="left"/>
+            </w:pPr>
+            <w:r>
+              <w:rPr>
+                <w:rFonts w:ascii="Times New Roman" w:hAnsi="Times New Roman" w:cs="Times New Roman"/>
+                <w:b w:val="0"/>
+                <w:sz w:val="18"/>
+              </w:rPr>
+              <w:t>Baskı fotoğrafı üzerinden hata sınıfı ve çözüm önerisi üretilebilir.</w:t>
+            </w:r>
+          </w:p>
+        </w:tc>
+      </w:tr>
+      <w:tr>
+        <w:tc>
+          <w:tcPr>
+            <w:tcW w:type="dxa" w:w="1247"/>
+            <w:vAlign w:val="center"/>
+            <w:tcMar>
+              <w:top w:w="80" w:type="dxa"/>
+              <w:start w:w="120" w:type="dxa"/>
+              <w:bottom w:w="80" w:type="dxa"/>
+              <w:end w:w="120" w:type="dxa"/>
+            </w:tcMar>
+          </w:tcPr>
+          <w:p>
+            <w:pPr>
+              <w:spacing w:after="0" w:line="240" w:lineRule="auto"/>
+              <w:ind w:firstLine="0"/>
+              <w:jc w:val="center"/>
+            </w:pPr>
+            <w:r>
+              <w:rPr>
+                <w:rFonts w:ascii="Times New Roman" w:hAnsi="Times New Roman" w:cs="Times New Roman"/>
+                <w:b w:val="0"/>
+                <w:sz w:val="18"/>
+              </w:rPr>
+              <w:t>6</w:t>
+            </w:r>
+          </w:p>
+        </w:tc>
+        <w:tc>
+          <w:tcPr>
+            <w:tcW w:type="dxa" w:w="2721"/>
+            <w:vAlign w:val="center"/>
+            <w:tcMar>
+              <w:top w:w="80" w:type="dxa"/>
+              <w:start w:w="120" w:type="dxa"/>
+              <w:bottom w:w="80" w:type="dxa"/>
+              <w:end w:w="120" w:type="dxa"/>
+            </w:tcMar>
+          </w:tcPr>
+          <w:p>
+            <w:pPr>
+              <w:spacing w:after="0" w:line="240" w:lineRule="auto"/>
+              <w:ind w:firstLine="0"/>
               <w:jc w:val="left"/>
             </w:pPr>
             <w:r>
@@ -14868,7 +15334,7 @@
                 <w:b w:val="0"/>
                 <w:sz w:val="18"/>
               </w:rPr>
-              <w:t>6</w:t>
+              <w:t>7</w:t>
             </w:r>
           </w:p>
         </w:tc>

</xml_diff>